<commit_message>
Work 12 may v3
</commit_message>
<xml_diff>
--- a/Atchison55ACTIVE/temp/Atchison Active 55 SMA-Monthly-2025-4-30-Body.docx
+++ b/Atchison55ACTIVE/temp/Atchison Active 55 SMA-Monthly-2025-4-30-Body.docx
@@ -7,7 +7,7 @@
       <w:pPr>
         <w:pStyle w:val="Heading10"/>
         <w:tabs>
-          <w:tab w:val="right" w:pos="10772"/>
+          <w:tab w:pos="10772" w:val="right"/>
         </w:tabs>
       </w:pPr>
       <w:r>
@@ -15,42 +15,37 @@
       </w:r>
       <w:r>
         <w:tab/>
+      </w:r>
+      <w:r>
         <w:t>30 April 2025</w:t>
       </w:r>
     </w:p>
     <w:tbl>
       <w:tblPr>
         <w:tblStyle w:val="AtchisonTable1"/>
-        <w:tblW w:w="0" w:type="auto"/>
-        <w:tblLook w:val="04A0" w:firstRow="1" w:lastRow="0" w:firstColumn="1" w:lastColumn="0" w:noHBand="0" w:noVBand="1"/>
+        <w:tblW w:type="auto" w:w="0"/>
+        <w:tblLook w:firstColumn="1" w:firstRow="1" w:lastColumn="0" w:lastRow="0" w:noHBand="0" w:noVBand="1" w:val="04A0"/>
       </w:tblPr>
       <w:tblGrid>
-        <w:gridCol w:w="2551"/>
-        <w:gridCol w:w="1644"/>
-        <w:gridCol w:w="1644"/>
-        <w:gridCol w:w="1644"/>
-        <w:gridCol w:w="1644"/>
-        <w:gridCol w:w="1644"/>
+        <w:gridCol w:w="1842"/>
+        <w:gridCol w:w="1842"/>
+        <w:gridCol w:w="1842"/>
+        <w:gridCol w:w="1842"/>
+        <w:gridCol w:w="1842"/>
+        <w:gridCol w:w="1842"/>
       </w:tblGrid>
       <w:tr>
-        <w:trPr>
-          <w:cnfStyle w:val="100000000000" w:firstRow="1" w:lastRow="0" w:firstColumn="0" w:lastColumn="0" w:oddVBand="0" w:evenVBand="0" w:oddHBand="0" w:evenHBand="0" w:firstRowFirstColumn="0" w:firstRowLastColumn="0" w:lastRowFirstColumn="0" w:lastRowLastColumn="0"/>
-        </w:trPr>
-        <w:tc>
-          <w:tcPr>
-            <w:cnfStyle w:val="001000000000" w:firstRow="0" w:lastRow="0" w:firstColumn="1" w:lastColumn="0" w:oddVBand="0" w:evenVBand="0" w:oddHBand="0" w:evenHBand="0" w:firstRowFirstColumn="0" w:firstRowLastColumn="0" w:lastRowFirstColumn="0" w:lastRowLastColumn="0"/>
-            <w:tcW w:w="2551" w:type="dxa"/>
+        <w:tc>
+          <w:tcPr>
+            <w:tcW w:type="dxa" w:w="2551"/>
           </w:tcPr>
           <w:p/>
         </w:tc>
         <w:tc>
           <w:tcPr>
-            <w:tcW w:w="1644" w:type="dxa"/>
-          </w:tcPr>
-          <w:p>
-            <w:pPr>
-              <w:cnfStyle w:val="100000000000" w:firstRow="1" w:lastRow="0" w:firstColumn="0" w:lastColumn="0" w:oddVBand="0" w:evenVBand="0" w:oddHBand="0" w:evenHBand="0" w:firstRowFirstColumn="0" w:firstRowLastColumn="0" w:lastRowFirstColumn="0" w:lastRowLastColumn="0"/>
-            </w:pPr>
+            <w:tcW w:type="dxa" w:w="1644"/>
+          </w:tcPr>
+          <w:p>
             <w:r>
               <w:t>3 Months</w:t>
             </w:r>
@@ -58,12 +53,9 @@
         </w:tc>
         <w:tc>
           <w:tcPr>
-            <w:tcW w:w="1644" w:type="dxa"/>
-          </w:tcPr>
-          <w:p>
-            <w:pPr>
-              <w:cnfStyle w:val="100000000000" w:firstRow="1" w:lastRow="0" w:firstColumn="0" w:lastColumn="0" w:oddVBand="0" w:evenVBand="0" w:oddHBand="0" w:evenHBand="0" w:firstRowFirstColumn="0" w:firstRowLastColumn="0" w:lastRowFirstColumn="0" w:lastRowLastColumn="0"/>
-            </w:pPr>
+            <w:tcW w:type="dxa" w:w="1644"/>
+          </w:tcPr>
+          <w:p>
             <w:r>
               <w:t>6 Months</w:t>
             </w:r>
@@ -71,12 +63,9 @@
         </w:tc>
         <w:tc>
           <w:tcPr>
-            <w:tcW w:w="1644" w:type="dxa"/>
-          </w:tcPr>
-          <w:p>
-            <w:pPr>
-              <w:cnfStyle w:val="100000000000" w:firstRow="1" w:lastRow="0" w:firstColumn="0" w:lastColumn="0" w:oddVBand="0" w:evenVBand="0" w:oddHBand="0" w:evenHBand="0" w:firstRowFirstColumn="0" w:firstRowLastColumn="0" w:lastRowFirstColumn="0" w:lastRowLastColumn="0"/>
-            </w:pPr>
+            <w:tcW w:type="dxa" w:w="1644"/>
+          </w:tcPr>
+          <w:p>
             <w:r>
               <w:t>1 Year</w:t>
             </w:r>
@@ -84,12 +73,9 @@
         </w:tc>
         <w:tc>
           <w:tcPr>
-            <w:tcW w:w="1644" w:type="dxa"/>
-          </w:tcPr>
-          <w:p>
-            <w:pPr>
-              <w:cnfStyle w:val="100000000000" w:firstRow="1" w:lastRow="0" w:firstColumn="0" w:lastColumn="0" w:oddVBand="0" w:evenVBand="0" w:oddHBand="0" w:evenHBand="0" w:firstRowFirstColumn="0" w:firstRowLastColumn="0" w:lastRowFirstColumn="0" w:lastRowLastColumn="0"/>
-            </w:pPr>
+            <w:tcW w:type="dxa" w:w="1644"/>
+          </w:tcPr>
+          <w:p>
             <w:r>
               <w:t>2 Years (p.a.)</w:t>
             </w:r>
@@ -97,12 +83,9 @@
         </w:tc>
         <w:tc>
           <w:tcPr>
-            <w:tcW w:w="1644" w:type="dxa"/>
-          </w:tcPr>
-          <w:p>
-            <w:pPr>
-              <w:cnfStyle w:val="100000000000" w:firstRow="1" w:lastRow="0" w:firstColumn="0" w:lastColumn="0" w:oddVBand="0" w:evenVBand="0" w:oddHBand="0" w:evenHBand="0" w:firstRowFirstColumn="0" w:firstRowLastColumn="0" w:lastRowFirstColumn="0" w:lastRowLastColumn="0"/>
-            </w:pPr>
+            <w:tcW w:type="dxa" w:w="1644"/>
+          </w:tcPr>
+          <w:p>
             <w:r>
               <w:t>Since Inception (p.a.)</w:t>
             </w:r>
@@ -112,8 +95,7 @@
       <w:tr>
         <w:tc>
           <w:tcPr>
-            <w:cnfStyle w:val="001000000000" w:firstRow="0" w:lastRow="0" w:firstColumn="1" w:lastColumn="0" w:oddVBand="0" w:evenVBand="0" w:oddHBand="0" w:evenHBand="0" w:firstRowFirstColumn="0" w:firstRowLastColumn="0" w:lastRowFirstColumn="0" w:lastRowLastColumn="0"/>
-            <w:tcW w:w="2551" w:type="dxa"/>
+            <w:tcW w:type="dxa" w:w="2551"/>
           </w:tcPr>
           <w:p>
             <w:r>
@@ -123,12 +105,9 @@
         </w:tc>
         <w:tc>
           <w:tcPr>
-            <w:tcW w:w="1644" w:type="dxa"/>
-          </w:tcPr>
-          <w:p>
-            <w:pPr>
-              <w:cnfStyle w:val="000000000000" w:firstRow="0" w:lastRow="0" w:firstColumn="0" w:lastColumn="0" w:oddVBand="0" w:evenVBand="0" w:oddHBand="0" w:evenHBand="0" w:firstRowFirstColumn="0" w:firstRowLastColumn="0" w:lastRowFirstColumn="0" w:lastRowLastColumn="0"/>
-            </w:pPr>
+            <w:tcW w:type="dxa" w:w="1644"/>
+          </w:tcPr>
+          <w:p>
             <w:r>
               <w:rPr>
                 <w:b/>
@@ -139,12 +118,9 @@
         </w:tc>
         <w:tc>
           <w:tcPr>
-            <w:tcW w:w="1644" w:type="dxa"/>
-          </w:tcPr>
-          <w:p>
-            <w:pPr>
-              <w:cnfStyle w:val="000000000000" w:firstRow="0" w:lastRow="0" w:firstColumn="0" w:lastColumn="0" w:oddVBand="0" w:evenVBand="0" w:oddHBand="0" w:evenHBand="0" w:firstRowFirstColumn="0" w:firstRowLastColumn="0" w:lastRowFirstColumn="0" w:lastRowLastColumn="0"/>
-            </w:pPr>
+            <w:tcW w:type="dxa" w:w="1644"/>
+          </w:tcPr>
+          <w:p>
             <w:r>
               <w:rPr>
                 <w:b/>
@@ -155,12 +131,9 @@
         </w:tc>
         <w:tc>
           <w:tcPr>
-            <w:tcW w:w="1644" w:type="dxa"/>
-          </w:tcPr>
-          <w:p>
-            <w:pPr>
-              <w:cnfStyle w:val="000000000000" w:firstRow="0" w:lastRow="0" w:firstColumn="0" w:lastColumn="0" w:oddVBand="0" w:evenVBand="0" w:oddHBand="0" w:evenHBand="0" w:firstRowFirstColumn="0" w:firstRowLastColumn="0" w:lastRowFirstColumn="0" w:lastRowLastColumn="0"/>
-            </w:pPr>
+            <w:tcW w:type="dxa" w:w="1644"/>
+          </w:tcPr>
+          <w:p>
             <w:r>
               <w:rPr>
                 <w:b/>
@@ -171,12 +144,9 @@
         </w:tc>
         <w:tc>
           <w:tcPr>
-            <w:tcW w:w="1644" w:type="dxa"/>
-          </w:tcPr>
-          <w:p>
-            <w:pPr>
-              <w:cnfStyle w:val="000000000000" w:firstRow="0" w:lastRow="0" w:firstColumn="0" w:lastColumn="0" w:oddVBand="0" w:evenVBand="0" w:oddHBand="0" w:evenHBand="0" w:firstRowFirstColumn="0" w:firstRowLastColumn="0" w:lastRowFirstColumn="0" w:lastRowLastColumn="0"/>
-            </w:pPr>
+            <w:tcW w:type="dxa" w:w="1644"/>
+          </w:tcPr>
+          <w:p>
             <w:r>
               <w:rPr>
                 <w:b/>
@@ -187,12 +157,9 @@
         </w:tc>
         <w:tc>
           <w:tcPr>
-            <w:tcW w:w="1644" w:type="dxa"/>
-          </w:tcPr>
-          <w:p>
-            <w:pPr>
-              <w:cnfStyle w:val="000000000000" w:firstRow="0" w:lastRow="0" w:firstColumn="0" w:lastColumn="0" w:oddVBand="0" w:evenVBand="0" w:oddHBand="0" w:evenHBand="0" w:firstRowFirstColumn="0" w:firstRowLastColumn="0" w:lastRowFirstColumn="0" w:lastRowLastColumn="0"/>
-            </w:pPr>
+            <w:tcW w:type="dxa" w:w="1644"/>
+          </w:tcPr>
+          <w:p>
             <w:r>
               <w:rPr>
                 <w:b/>
@@ -205,8 +172,7 @@
       <w:tr>
         <w:tc>
           <w:tcPr>
-            <w:cnfStyle w:val="001000000000" w:firstRow="0" w:lastRow="0" w:firstColumn="1" w:lastColumn="0" w:oddVBand="0" w:evenVBand="0" w:oddHBand="0" w:evenHBand="0" w:firstRowFirstColumn="0" w:firstRowLastColumn="0" w:lastRowFirstColumn="0" w:lastRowLastColumn="0"/>
-            <w:tcW w:w="2551" w:type="dxa"/>
+            <w:tcW w:type="dxa" w:w="2551"/>
           </w:tcPr>
           <w:p>
             <w:r>
@@ -216,12 +182,9 @@
         </w:tc>
         <w:tc>
           <w:tcPr>
-            <w:tcW w:w="1644" w:type="dxa"/>
-          </w:tcPr>
-          <w:p>
-            <w:pPr>
-              <w:cnfStyle w:val="000000000000" w:firstRow="0" w:lastRow="0" w:firstColumn="0" w:lastColumn="0" w:oddVBand="0" w:evenVBand="0" w:oddHBand="0" w:evenHBand="0" w:firstRowFirstColumn="0" w:firstRowLastColumn="0" w:lastRowFirstColumn="0" w:lastRowLastColumn="0"/>
-            </w:pPr>
+            <w:tcW w:type="dxa" w:w="1644"/>
+          </w:tcPr>
+          <w:p>
             <w:r>
               <w:t>-1.48</w:t>
             </w:r>
@@ -229,12 +192,9 @@
         </w:tc>
         <w:tc>
           <w:tcPr>
-            <w:tcW w:w="1644" w:type="dxa"/>
-          </w:tcPr>
-          <w:p>
-            <w:pPr>
-              <w:cnfStyle w:val="000000000000" w:firstRow="0" w:lastRow="0" w:firstColumn="0" w:lastColumn="0" w:oddVBand="0" w:evenVBand="0" w:oddHBand="0" w:evenHBand="0" w:firstRowFirstColumn="0" w:firstRowLastColumn="0" w:lastRowFirstColumn="0" w:lastRowLastColumn="0"/>
-            </w:pPr>
+            <w:tcW w:type="dxa" w:w="1644"/>
+          </w:tcPr>
+          <w:p>
             <w:r>
               <w:t>1.73</w:t>
             </w:r>
@@ -242,12 +202,9 @@
         </w:tc>
         <w:tc>
           <w:tcPr>
-            <w:tcW w:w="1644" w:type="dxa"/>
-          </w:tcPr>
-          <w:p>
-            <w:pPr>
-              <w:cnfStyle w:val="000000000000" w:firstRow="0" w:lastRow="0" w:firstColumn="0" w:lastColumn="0" w:oddVBand="0" w:evenVBand="0" w:oddHBand="0" w:evenHBand="0" w:firstRowFirstColumn="0" w:firstRowLastColumn="0" w:lastRowFirstColumn="0" w:lastRowLastColumn="0"/>
-            </w:pPr>
+            <w:tcW w:type="dxa" w:w="1644"/>
+          </w:tcPr>
+          <w:p>
             <w:r>
               <w:t>7.16</w:t>
             </w:r>
@@ -255,12 +212,9 @@
         </w:tc>
         <w:tc>
           <w:tcPr>
-            <w:tcW w:w="1644" w:type="dxa"/>
-          </w:tcPr>
-          <w:p>
-            <w:pPr>
-              <w:cnfStyle w:val="000000000000" w:firstRow="0" w:lastRow="0" w:firstColumn="0" w:lastColumn="0" w:oddVBand="0" w:evenVBand="0" w:oddHBand="0" w:evenHBand="0" w:firstRowFirstColumn="0" w:firstRowLastColumn="0" w:lastRowFirstColumn="0" w:lastRowLastColumn="0"/>
-            </w:pPr>
+            <w:tcW w:type="dxa" w:w="1644"/>
+          </w:tcPr>
+          <w:p>
             <w:r>
               <w:t>6.73</w:t>
             </w:r>
@@ -268,12 +222,9 @@
         </w:tc>
         <w:tc>
           <w:tcPr>
-            <w:tcW w:w="1644" w:type="dxa"/>
-          </w:tcPr>
-          <w:p>
-            <w:pPr>
-              <w:cnfStyle w:val="000000000000" w:firstRow="0" w:lastRow="0" w:firstColumn="0" w:lastColumn="0" w:oddVBand="0" w:evenVBand="0" w:oddHBand="0" w:evenHBand="0" w:firstRowFirstColumn="0" w:firstRowLastColumn="0" w:lastRowFirstColumn="0" w:lastRowLastColumn="0"/>
-            </w:pPr>
+            <w:tcW w:type="dxa" w:w="1644"/>
+          </w:tcPr>
+          <w:p>
             <w:r>
               <w:t>7.82</w:t>
             </w:r>
@@ -283,8 +234,7 @@
       <w:tr>
         <w:tc>
           <w:tcPr>
-            <w:cnfStyle w:val="001000000000" w:firstRow="0" w:lastRow="0" w:firstColumn="1" w:lastColumn="0" w:oddVBand="0" w:evenVBand="0" w:oddHBand="0" w:evenHBand="0" w:firstRowFirstColumn="0" w:firstRowLastColumn="0" w:lastRowFirstColumn="0" w:lastRowLastColumn="0"/>
-            <w:tcW w:w="2551" w:type="dxa"/>
+            <w:tcW w:type="dxa" w:w="2551"/>
           </w:tcPr>
           <w:p>
             <w:r>
@@ -294,66 +244,51 @@
         </w:tc>
         <w:tc>
           <w:tcPr>
-            <w:tcW w:w="1644" w:type="dxa"/>
-          </w:tcPr>
-          <w:p>
-            <w:pPr>
-              <w:cnfStyle w:val="000000000000" w:firstRow="0" w:lastRow="0" w:firstColumn="0" w:lastColumn="0" w:oddVBand="0" w:evenVBand="0" w:oddHBand="0" w:evenHBand="0" w:firstRowFirstColumn="0" w:firstRowLastColumn="0" w:lastRowFirstColumn="0" w:lastRowLastColumn="0"/>
-            </w:pPr>
-            <w:r>
-              <w:t>0.0</w:t>
-            </w:r>
-          </w:p>
-        </w:tc>
-        <w:tc>
-          <w:tcPr>
-            <w:tcW w:w="1644" w:type="dxa"/>
-          </w:tcPr>
-          <w:p>
-            <w:pPr>
-              <w:cnfStyle w:val="000000000000" w:firstRow="0" w:lastRow="0" w:firstColumn="0" w:lastColumn="0" w:oddVBand="0" w:evenVBand="0" w:oddHBand="0" w:evenHBand="0" w:firstRowFirstColumn="0" w:firstRowLastColumn="0" w:lastRowFirstColumn="0" w:lastRowLastColumn="0"/>
-            </w:pPr>
-            <w:r>
-              <w:t>0.0</w:t>
-            </w:r>
-          </w:p>
-        </w:tc>
-        <w:tc>
-          <w:tcPr>
-            <w:tcW w:w="1644" w:type="dxa"/>
-          </w:tcPr>
-          <w:p>
-            <w:pPr>
-              <w:cnfStyle w:val="000000000000" w:firstRow="0" w:lastRow="0" w:firstColumn="0" w:lastColumn="0" w:oddVBand="0" w:evenVBand="0" w:oddHBand="0" w:evenHBand="0" w:firstRowFirstColumn="0" w:firstRowLastColumn="0" w:lastRowFirstColumn="0" w:lastRowLastColumn="0"/>
-            </w:pPr>
-            <w:r>
-              <w:t>1.82</w:t>
-            </w:r>
-          </w:p>
-        </w:tc>
-        <w:tc>
-          <w:tcPr>
-            <w:tcW w:w="1644" w:type="dxa"/>
-          </w:tcPr>
-          <w:p>
-            <w:pPr>
-              <w:cnfStyle w:val="000000000000" w:firstRow="0" w:lastRow="0" w:firstColumn="0" w:lastColumn="0" w:oddVBand="0" w:evenVBand="0" w:oddHBand="0" w:evenHBand="0" w:firstRowFirstColumn="0" w:firstRowLastColumn="0" w:lastRowFirstColumn="0" w:lastRowLastColumn="0"/>
-            </w:pPr>
-            <w:r>
-              <w:t>2.79</w:t>
-            </w:r>
-          </w:p>
-        </w:tc>
-        <w:tc>
-          <w:tcPr>
-            <w:tcW w:w="1644" w:type="dxa"/>
-          </w:tcPr>
-          <w:p>
-            <w:pPr>
-              <w:cnfStyle w:val="000000000000" w:firstRow="0" w:lastRow="0" w:firstColumn="0" w:lastColumn="0" w:oddVBand="0" w:evenVBand="0" w:oddHBand="0" w:evenHBand="0" w:firstRowFirstColumn="0" w:firstRowLastColumn="0" w:lastRowFirstColumn="0" w:lastRowLastColumn="0"/>
-            </w:pPr>
-            <w:r>
-              <w:t>3.02</w:t>
+            <w:tcW w:type="dxa" w:w="1644"/>
+          </w:tcPr>
+          <w:p>
+            <w:r>
+              <w:t>0.6</w:t>
+            </w:r>
+          </w:p>
+        </w:tc>
+        <w:tc>
+          <w:tcPr>
+            <w:tcW w:type="dxa" w:w="1644"/>
+          </w:tcPr>
+          <w:p>
+            <w:r>
+              <w:t>1.21</w:t>
+            </w:r>
+          </w:p>
+        </w:tc>
+        <w:tc>
+          <w:tcPr>
+            <w:tcW w:type="dxa" w:w="1644"/>
+          </w:tcPr>
+          <w:p>
+            <w:r>
+              <w:t>3.24</w:t>
+            </w:r>
+          </w:p>
+        </w:tc>
+        <w:tc>
+          <w:tcPr>
+            <w:tcW w:type="dxa" w:w="1644"/>
+          </w:tcPr>
+          <w:p>
+            <w:r>
+              <w:t>3.5</w:t>
+            </w:r>
+          </w:p>
+        </w:tc>
+        <w:tc>
+          <w:tcPr>
+            <w:tcW w:type="dxa" w:w="1644"/>
+          </w:tcPr>
+          <w:p>
+            <w:r>
+              <w:t>3.63</w:t>
             </w:r>
           </w:p>
         </w:tc>
@@ -361,8 +296,7 @@
       <w:tr>
         <w:tc>
           <w:tcPr>
-            <w:cnfStyle w:val="001000000000" w:firstRow="0" w:lastRow="0" w:firstColumn="1" w:lastColumn="0" w:oddVBand="0" w:evenVBand="0" w:oddHBand="0" w:evenHBand="0" w:firstRowFirstColumn="0" w:firstRowLastColumn="0" w:lastRowFirstColumn="0" w:lastRowLastColumn="0"/>
-            <w:tcW w:w="2551" w:type="dxa"/>
+            <w:tcW w:type="dxa" w:w="2551"/>
           </w:tcPr>
           <w:p>
             <w:r>
@@ -372,12 +306,9 @@
         </w:tc>
         <w:tc>
           <w:tcPr>
-            <w:tcW w:w="1644" w:type="dxa"/>
-          </w:tcPr>
-          <w:p>
-            <w:pPr>
-              <w:cnfStyle w:val="000000000000" w:firstRow="0" w:lastRow="0" w:firstColumn="0" w:lastColumn="0" w:oddVBand="0" w:evenVBand="0" w:oddHBand="0" w:evenHBand="0" w:firstRowFirstColumn="0" w:firstRowLastColumn="0" w:lastRowFirstColumn="0" w:lastRowLastColumn="0"/>
-            </w:pPr>
+            <w:tcW w:type="dxa" w:w="1644"/>
+          </w:tcPr>
+          <w:p>
             <w:r>
               <w:t>0.41</w:t>
             </w:r>
@@ -385,12 +316,9 @@
         </w:tc>
         <w:tc>
           <w:tcPr>
-            <w:tcW w:w="1644" w:type="dxa"/>
-          </w:tcPr>
-          <w:p>
-            <w:pPr>
-              <w:cnfStyle w:val="000000000000" w:firstRow="0" w:lastRow="0" w:firstColumn="0" w:lastColumn="0" w:oddVBand="0" w:evenVBand="0" w:oddHBand="0" w:evenHBand="0" w:firstRowFirstColumn="0" w:firstRowLastColumn="0" w:lastRowFirstColumn="0" w:lastRowLastColumn="0"/>
-            </w:pPr>
+            <w:tcW w:type="dxa" w:w="1644"/>
+          </w:tcPr>
+          <w:p>
             <w:r>
               <w:t>0.71</w:t>
             </w:r>
@@ -398,12 +326,9 @@
         </w:tc>
         <w:tc>
           <w:tcPr>
-            <w:tcW w:w="1644" w:type="dxa"/>
-          </w:tcPr>
-          <w:p>
-            <w:pPr>
-              <w:cnfStyle w:val="000000000000" w:firstRow="0" w:lastRow="0" w:firstColumn="0" w:lastColumn="0" w:oddVBand="0" w:evenVBand="0" w:oddHBand="0" w:evenHBand="0" w:firstRowFirstColumn="0" w:firstRowLastColumn="0" w:lastRowFirstColumn="0" w:lastRowLastColumn="0"/>
-            </w:pPr>
+            <w:tcW w:type="dxa" w:w="1644"/>
+          </w:tcPr>
+          <w:p>
             <w:r>
               <w:t>1.37</w:t>
             </w:r>
@@ -411,12 +336,9 @@
         </w:tc>
         <w:tc>
           <w:tcPr>
-            <w:tcW w:w="1644" w:type="dxa"/>
-          </w:tcPr>
-          <w:p>
-            <w:pPr>
-              <w:cnfStyle w:val="000000000000" w:firstRow="0" w:lastRow="0" w:firstColumn="0" w:lastColumn="0" w:oddVBand="0" w:evenVBand="0" w:oddHBand="0" w:evenHBand="0" w:firstRowFirstColumn="0" w:firstRowLastColumn="0" w:lastRowFirstColumn="0" w:lastRowLastColumn="0"/>
-            </w:pPr>
+            <w:tcW w:type="dxa" w:w="1644"/>
+          </w:tcPr>
+          <w:p>
             <w:r>
               <w:t>2.15</w:t>
             </w:r>
@@ -424,12 +346,9 @@
         </w:tc>
         <w:tc>
           <w:tcPr>
-            <w:tcW w:w="1644" w:type="dxa"/>
-          </w:tcPr>
-          <w:p>
-            <w:pPr>
-              <w:cnfStyle w:val="000000000000" w:firstRow="0" w:lastRow="0" w:firstColumn="0" w:lastColumn="0" w:oddVBand="0" w:evenVBand="0" w:oddHBand="0" w:evenHBand="0" w:firstRowFirstColumn="0" w:firstRowLastColumn="0" w:lastRowFirstColumn="0" w:lastRowLastColumn="0"/>
-            </w:pPr>
+            <w:tcW w:type="dxa" w:w="1644"/>
+          </w:tcPr>
+          <w:p>
             <w:r>
               <w:t>2.15</w:t>
             </w:r>
@@ -439,8 +358,7 @@
       <w:tr>
         <w:tc>
           <w:tcPr>
-            <w:cnfStyle w:val="001000000000" w:firstRow="0" w:lastRow="0" w:firstColumn="1" w:lastColumn="0" w:oddVBand="0" w:evenVBand="0" w:oddHBand="0" w:evenHBand="0" w:firstRowFirstColumn="0" w:firstRowLastColumn="0" w:lastRowFirstColumn="0" w:lastRowLastColumn="0"/>
-            <w:tcW w:w="2551" w:type="dxa"/>
+            <w:tcW w:type="dxa" w:w="2551"/>
           </w:tcPr>
           <w:p>
             <w:r>
@@ -450,66 +368,51 @@
         </w:tc>
         <w:tc>
           <w:tcPr>
-            <w:tcW w:w="1644" w:type="dxa"/>
-          </w:tcPr>
-          <w:p>
-            <w:pPr>
-              <w:cnfStyle w:val="000000000000" w:firstRow="0" w:lastRow="0" w:firstColumn="0" w:lastColumn="0" w:oddVBand="0" w:evenVBand="0" w:oddHBand="0" w:evenHBand="0" w:firstRowFirstColumn="0" w:firstRowLastColumn="0" w:lastRowFirstColumn="0" w:lastRowLastColumn="0"/>
-            </w:pPr>
-            <w:r>
-              <w:t>-1.07</w:t>
-            </w:r>
-          </w:p>
-        </w:tc>
-        <w:tc>
-          <w:tcPr>
-            <w:tcW w:w="1644" w:type="dxa"/>
-          </w:tcPr>
-          <w:p>
-            <w:pPr>
-              <w:cnfStyle w:val="000000000000" w:firstRow="0" w:lastRow="0" w:firstColumn="0" w:lastColumn="0" w:oddVBand="0" w:evenVBand="0" w:oddHBand="0" w:evenHBand="0" w:firstRowFirstColumn="0" w:firstRowLastColumn="0" w:lastRowFirstColumn="0" w:lastRowLastColumn="0"/>
-            </w:pPr>
-            <w:r>
-              <w:t>2.44</w:t>
-            </w:r>
-          </w:p>
-        </w:tc>
-        <w:tc>
-          <w:tcPr>
-            <w:tcW w:w="1644" w:type="dxa"/>
-          </w:tcPr>
-          <w:p>
-            <w:pPr>
-              <w:cnfStyle w:val="000000000000" w:firstRow="0" w:lastRow="0" w:firstColumn="0" w:lastColumn="0" w:oddVBand="0" w:evenVBand="0" w:oddHBand="0" w:evenHBand="0" w:firstRowFirstColumn="0" w:firstRowLastColumn="0" w:lastRowFirstColumn="0" w:lastRowLastColumn="0"/>
-            </w:pPr>
-            <w:r>
-              <w:t>6.7</w:t>
-            </w:r>
-          </w:p>
-        </w:tc>
-        <w:tc>
-          <w:tcPr>
-            <w:tcW w:w="1644" w:type="dxa"/>
-          </w:tcPr>
-          <w:p>
-            <w:pPr>
-              <w:cnfStyle w:val="000000000000" w:firstRow="0" w:lastRow="0" w:firstColumn="0" w:lastColumn="0" w:oddVBand="0" w:evenVBand="0" w:oddHBand="0" w:evenHBand="0" w:firstRowFirstColumn="0" w:firstRowLastColumn="0" w:lastRowFirstColumn="0" w:lastRowLastColumn="0"/>
-            </w:pPr>
-            <w:r>
-              <w:t>6.09</w:t>
-            </w:r>
-          </w:p>
-        </w:tc>
-        <w:tc>
-          <w:tcPr>
-            <w:tcW w:w="1644" w:type="dxa"/>
-          </w:tcPr>
-          <w:p>
-            <w:pPr>
-              <w:cnfStyle w:val="000000000000" w:firstRow="0" w:lastRow="0" w:firstColumn="0" w:lastColumn="0" w:oddVBand="0" w:evenVBand="0" w:oddHBand="0" w:evenHBand="0" w:firstRowFirstColumn="0" w:firstRowLastColumn="0" w:lastRowFirstColumn="0" w:lastRowLastColumn="0"/>
-            </w:pPr>
-            <w:r>
-              <w:t>6.95</w:t>
+            <w:tcW w:type="dxa" w:w="1644"/>
+          </w:tcPr>
+          <w:p>
+            <w:r>
+              <w:t>-1.67</w:t>
+            </w:r>
+          </w:p>
+        </w:tc>
+        <w:tc>
+          <w:tcPr>
+            <w:tcW w:type="dxa" w:w="1644"/>
+          </w:tcPr>
+          <w:p>
+            <w:r>
+              <w:t>1.23</w:t>
+            </w:r>
+          </w:p>
+        </w:tc>
+        <w:tc>
+          <w:tcPr>
+            <w:tcW w:type="dxa" w:w="1644"/>
+          </w:tcPr>
+          <w:p>
+            <w:r>
+              <w:t>5.28</w:t>
+            </w:r>
+          </w:p>
+        </w:tc>
+        <w:tc>
+          <w:tcPr>
+            <w:tcW w:type="dxa" w:w="1644"/>
+          </w:tcPr>
+          <w:p>
+            <w:r>
+              <w:t>5.38</w:t>
+            </w:r>
+          </w:p>
+        </w:tc>
+        <w:tc>
+          <w:tcPr>
+            <w:tcW w:type="dxa" w:w="1644"/>
+          </w:tcPr>
+          <w:p>
+            <w:r>
+              <w:t>6.34</w:t>
             </w:r>
           </w:p>
         </w:tc>
@@ -575,21 +478,17 @@
     <w:tbl>
       <w:tblPr>
         <w:tblStyle w:val="AtchisonTable1"/>
-        <w:tblW w:w="0" w:type="auto"/>
-        <w:tblLook w:val="04A0" w:firstRow="1" w:lastRow="0" w:firstColumn="1" w:lastColumn="0" w:noHBand="0" w:noVBand="1"/>
+        <w:tblW w:type="auto" w:w="0"/>
+        <w:tblLook w:firstColumn="1" w:firstRow="1" w:lastColumn="0" w:lastRow="0" w:noHBand="0" w:noVBand="1" w:val="04A0"/>
       </w:tblPr>
       <w:tblGrid>
-        <w:gridCol w:w="2190"/>
-        <w:gridCol w:w="2977"/>
+        <w:gridCol w:w="5527"/>
+        <w:gridCol w:w="5527"/>
       </w:tblGrid>
       <w:tr>
-        <w:trPr>
-          <w:cnfStyle w:val="100000000000" w:firstRow="1" w:lastRow="0" w:firstColumn="0" w:lastColumn="0" w:oddVBand="0" w:evenVBand="0" w:oddHBand="0" w:evenHBand="0" w:firstRowFirstColumn="0" w:firstRowLastColumn="0" w:lastRowFirstColumn="0" w:lastRowLastColumn="0"/>
-        </w:trPr>
-        <w:tc>
-          <w:tcPr>
-            <w:cnfStyle w:val="001000000000" w:firstRow="0" w:lastRow="0" w:firstColumn="1" w:lastColumn="0" w:oddVBand="0" w:evenVBand="0" w:oddHBand="0" w:evenHBand="0" w:firstRowFirstColumn="0" w:firstRowLastColumn="0" w:lastRowFirstColumn="0" w:lastRowLastColumn="0"/>
-            <w:tcW w:w="2268" w:type="dxa"/>
+        <w:tc>
+          <w:tcPr>
+            <w:tcW w:type="dxa" w:w="2268"/>
           </w:tcPr>
           <w:p>
             <w:r>
@@ -599,20 +498,17 @@
         </w:tc>
         <w:tc>
           <w:tcPr>
-            <w:tcW w:w="3118" w:type="dxa"/>
-          </w:tcPr>
-          <w:p>
-            <w:pPr>
-              <w:cnfStyle w:val="100000000000" w:firstRow="1" w:lastRow="0" w:firstColumn="0" w:lastColumn="0" w:oddVBand="0" w:evenVBand="0" w:oddHBand="0" w:evenHBand="0" w:firstRowFirstColumn="0" w:firstRowLastColumn="0" w:lastRowFirstColumn="0" w:lastRowLastColumn="0"/>
-            </w:pPr>
+            <w:tcW w:type="dxa" w:w="3118"/>
+          </w:tcPr>
+          <w:p>
+            <w:r/>
           </w:p>
         </w:tc>
       </w:tr>
       <w:tr>
         <w:tc>
           <w:tcPr>
-            <w:cnfStyle w:val="001000000000" w:firstRow="0" w:lastRow="0" w:firstColumn="1" w:lastColumn="0" w:oddVBand="0" w:evenVBand="0" w:oddHBand="0" w:evenHBand="0" w:firstRowFirstColumn="0" w:firstRowLastColumn="0" w:lastRowFirstColumn="0" w:lastRowLastColumn="0"/>
-            <w:tcW w:w="2268" w:type="dxa"/>
+            <w:tcW w:type="dxa" w:w="2268"/>
           </w:tcPr>
           <w:p>
             <w:r>
@@ -622,12 +518,9 @@
         </w:tc>
         <w:tc>
           <w:tcPr>
-            <w:tcW w:w="3118" w:type="dxa"/>
-          </w:tcPr>
-          <w:p>
-            <w:pPr>
-              <w:cnfStyle w:val="000000000000" w:firstRow="0" w:lastRow="0" w:firstColumn="0" w:lastColumn="0" w:oddVBand="0" w:evenVBand="0" w:oddHBand="0" w:evenHBand="0" w:firstRowFirstColumn="0" w:firstRowLastColumn="0" w:lastRowFirstColumn="0" w:lastRowLastColumn="0"/>
-            </w:pPr>
+            <w:tcW w:type="dxa" w:w="3118"/>
+          </w:tcPr>
+          <w:p>
             <w:r>
               <w:t>Multi Asset</w:t>
             </w:r>
@@ -637,8 +530,7 @@
       <w:tr>
         <w:tc>
           <w:tcPr>
-            <w:cnfStyle w:val="001000000000" w:firstRow="0" w:lastRow="0" w:firstColumn="1" w:lastColumn="0" w:oddVBand="0" w:evenVBand="0" w:oddHBand="0" w:evenHBand="0" w:firstRowFirstColumn="0" w:firstRowLastColumn="0" w:lastRowFirstColumn="0" w:lastRowLastColumn="0"/>
-            <w:tcW w:w="2268" w:type="dxa"/>
+            <w:tcW w:type="dxa" w:w="2268"/>
           </w:tcPr>
           <w:p>
             <w:r>
@@ -648,12 +540,9 @@
         </w:tc>
         <w:tc>
           <w:tcPr>
-            <w:tcW w:w="3118" w:type="dxa"/>
-          </w:tcPr>
-          <w:p>
-            <w:pPr>
-              <w:cnfStyle w:val="000000000000" w:firstRow="0" w:lastRow="0" w:firstColumn="0" w:lastColumn="0" w:oddVBand="0" w:evenVBand="0" w:oddHBand="0" w:evenHBand="0" w:firstRowFirstColumn="0" w:firstRowLastColumn="0" w:lastRowFirstColumn="0" w:lastRowLastColumn="0"/>
-            </w:pPr>
+            <w:tcW w:type="dxa" w:w="3118"/>
+          </w:tcPr>
+          <w:p>
             <w:r>
               <w:t>Atchison</w:t>
             </w:r>
@@ -663,8 +552,7 @@
       <w:tr>
         <w:tc>
           <w:tcPr>
-            <w:cnfStyle w:val="001000000000" w:firstRow="0" w:lastRow="0" w:firstColumn="1" w:lastColumn="0" w:oddVBand="0" w:evenVBand="0" w:oddHBand="0" w:evenHBand="0" w:firstRowFirstColumn="0" w:firstRowLastColumn="0" w:lastRowFirstColumn="0" w:lastRowLastColumn="0"/>
-            <w:tcW w:w="2268" w:type="dxa"/>
+            <w:tcW w:type="dxa" w:w="2268"/>
           </w:tcPr>
           <w:p>
             <w:r>
@@ -674,12 +562,9 @@
         </w:tc>
         <w:tc>
           <w:tcPr>
-            <w:tcW w:w="3118" w:type="dxa"/>
-          </w:tcPr>
-          <w:p>
-            <w:pPr>
-              <w:cnfStyle w:val="000000000000" w:firstRow="0" w:lastRow="0" w:firstColumn="0" w:lastColumn="0" w:oddVBand="0" w:evenVBand="0" w:oddHBand="0" w:evenHBand="0" w:firstRowFirstColumn="0" w:firstRowLastColumn="0" w:lastRowFirstColumn="0" w:lastRowLastColumn="0"/>
-            </w:pPr>
+            <w:tcW w:type="dxa" w:w="3118"/>
+          </w:tcPr>
+          <w:p>
             <w:r>
               <w:t>FE AMI Mixed Asset – Balanced Peer Index</w:t>
             </w:r>
@@ -689,8 +574,7 @@
       <w:tr>
         <w:tc>
           <w:tcPr>
-            <w:cnfStyle w:val="001000000000" w:firstRow="0" w:lastRow="0" w:firstColumn="1" w:lastColumn="0" w:oddVBand="0" w:evenVBand="0" w:oddHBand="0" w:evenHBand="0" w:firstRowFirstColumn="0" w:firstRowLastColumn="0" w:lastRowFirstColumn="0" w:lastRowLastColumn="0"/>
-            <w:tcW w:w="2268" w:type="dxa"/>
+            <w:tcW w:type="dxa" w:w="2268"/>
           </w:tcPr>
           <w:p>
             <w:r>
@@ -700,12 +584,9 @@
         </w:tc>
         <w:tc>
           <w:tcPr>
-            <w:tcW w:w="3118" w:type="dxa"/>
-          </w:tcPr>
-          <w:p>
-            <w:pPr>
-              <w:cnfStyle w:val="000000000000" w:firstRow="0" w:lastRow="0" w:firstColumn="0" w:lastColumn="0" w:oddVBand="0" w:evenVBand="0" w:oddHBand="0" w:evenHBand="0" w:firstRowFirstColumn="0" w:firstRowLastColumn="0" w:lastRowFirstColumn="0" w:lastRowLastColumn="0"/>
-            </w:pPr>
+            <w:tcW w:type="dxa" w:w="3118"/>
+          </w:tcPr>
+          <w:p>
             <w:r>
               <w:t>31 December 2022</w:t>
             </w:r>
@@ -715,8 +596,7 @@
       <w:tr>
         <w:tc>
           <w:tcPr>
-            <w:cnfStyle w:val="001000000000" w:firstRow="0" w:lastRow="0" w:firstColumn="1" w:lastColumn="0" w:oddVBand="0" w:evenVBand="0" w:oddHBand="0" w:evenHBand="0" w:firstRowFirstColumn="0" w:firstRowLastColumn="0" w:lastRowFirstColumn="0" w:lastRowLastColumn="0"/>
-            <w:tcW w:w="2268" w:type="dxa"/>
+            <w:tcW w:type="dxa" w:w="2268"/>
           </w:tcPr>
           <w:p>
             <w:r>
@@ -726,12 +606,9 @@
         </w:tc>
         <w:tc>
           <w:tcPr>
-            <w:tcW w:w="3118" w:type="dxa"/>
-          </w:tcPr>
-          <w:p>
-            <w:pPr>
-              <w:cnfStyle w:val="000000000000" w:firstRow="0" w:lastRow="0" w:firstColumn="0" w:lastColumn="0" w:oddVBand="0" w:evenVBand="0" w:oddHBand="0" w:evenHBand="0" w:firstRowFirstColumn="0" w:firstRowLastColumn="0" w:lastRowFirstColumn="0" w:lastRowLastColumn="0"/>
-            </w:pPr>
+            <w:tcW w:type="dxa" w:w="3118"/>
+          </w:tcPr>
+          <w:p>
             <w:r>
               <w:t>7 Years</w:t>
             </w:r>
@@ -741,8 +618,7 @@
       <w:tr>
         <w:tc>
           <w:tcPr>
-            <w:cnfStyle w:val="001000000000" w:firstRow="0" w:lastRow="0" w:firstColumn="1" w:lastColumn="0" w:oddVBand="0" w:evenVBand="0" w:oddHBand="0" w:evenHBand="0" w:firstRowFirstColumn="0" w:firstRowLastColumn="0" w:lastRowFirstColumn="0" w:lastRowLastColumn="0"/>
-            <w:tcW w:w="2268" w:type="dxa"/>
+            <w:tcW w:type="dxa" w:w="2268"/>
           </w:tcPr>
           <w:p>
             <w:r>
@@ -752,12 +628,9 @@
         </w:tc>
         <w:tc>
           <w:tcPr>
-            <w:tcW w:w="3118" w:type="dxa"/>
-          </w:tcPr>
-          <w:p>
-            <w:pPr>
-              <w:cnfStyle w:val="000000000000" w:firstRow="0" w:lastRow="0" w:firstColumn="0" w:lastColumn="0" w:oddVBand="0" w:evenVBand="0" w:oddHBand="0" w:evenHBand="0" w:firstRowFirstColumn="0" w:firstRowLastColumn="0" w:lastRowFirstColumn="0" w:lastRowLastColumn="0"/>
-            </w:pPr>
+            <w:tcW w:type="dxa" w:w="3118"/>
+          </w:tcPr>
+          <w:p>
             <w:r>
               <w:t>Medium</w:t>
             </w:r>
@@ -767,8 +640,7 @@
       <w:tr>
         <w:tc>
           <w:tcPr>
-            <w:cnfStyle w:val="001000000000" w:firstRow="0" w:lastRow="0" w:firstColumn="1" w:lastColumn="0" w:oddVBand="0" w:evenVBand="0" w:oddHBand="0" w:evenHBand="0" w:firstRowFirstColumn="0" w:firstRowLastColumn="0" w:lastRowFirstColumn="0" w:lastRowLastColumn="0"/>
-            <w:tcW w:w="2268" w:type="dxa"/>
+            <w:tcW w:type="dxa" w:w="2268"/>
           </w:tcPr>
           <w:p>
             <w:r>
@@ -778,12 +650,9 @@
         </w:tc>
         <w:tc>
           <w:tcPr>
-            <w:tcW w:w="3118" w:type="dxa"/>
-          </w:tcPr>
-          <w:p>
-            <w:pPr>
-              <w:cnfStyle w:val="000000000000" w:firstRow="0" w:lastRow="0" w:firstColumn="0" w:lastColumn="0" w:oddVBand="0" w:evenVBand="0" w:oddHBand="0" w:evenHBand="0" w:firstRowFirstColumn="0" w:firstRowLastColumn="0" w:lastRowFirstColumn="0" w:lastRowLastColumn="0"/>
-            </w:pPr>
+            <w:tcW w:type="dxa" w:w="3118"/>
+          </w:tcPr>
+          <w:p>
             <w:r>
               <w:t>25k</w:t>
             </w:r>
@@ -793,8 +662,7 @@
       <w:tr>
         <w:tc>
           <w:tcPr>
-            <w:cnfStyle w:val="001000000000" w:firstRow="0" w:lastRow="0" w:firstColumn="1" w:lastColumn="0" w:oddVBand="0" w:evenVBand="0" w:oddHBand="0" w:evenHBand="0" w:firstRowFirstColumn="0" w:firstRowLastColumn="0" w:lastRowFirstColumn="0" w:lastRowLastColumn="0"/>
-            <w:tcW w:w="2268" w:type="dxa"/>
+            <w:tcW w:type="dxa" w:w="2268"/>
           </w:tcPr>
           <w:p>
             <w:r>
@@ -804,12 +672,9 @@
         </w:tc>
         <w:tc>
           <w:tcPr>
-            <w:tcW w:w="3118" w:type="dxa"/>
-          </w:tcPr>
-          <w:p>
-            <w:pPr>
-              <w:cnfStyle w:val="000000000000" w:firstRow="0" w:lastRow="0" w:firstColumn="0" w:lastColumn="0" w:oddVBand="0" w:evenVBand="0" w:oddHBand="0" w:evenHBand="0" w:firstRowFirstColumn="0" w:firstRowLastColumn="0" w:lastRowFirstColumn="0" w:lastRowLastColumn="0"/>
-            </w:pPr>
+            <w:tcW w:type="dxa" w:w="3118"/>
+          </w:tcPr>
+          <w:p>
             <w:r>
               <w:t>Platform Specific - Refer to PDS</w:t>
             </w:r>
@@ -819,8 +684,7 @@
       <w:tr>
         <w:tc>
           <w:tcPr>
-            <w:cnfStyle w:val="001000000000" w:firstRow="0" w:lastRow="0" w:firstColumn="1" w:lastColumn="0" w:oddVBand="0" w:evenVBand="0" w:oddHBand="0" w:evenHBand="0" w:firstRowFirstColumn="0" w:firstRowLastColumn="0" w:lastRowFirstColumn="0" w:lastRowLastColumn="0"/>
-            <w:tcW w:w="2268" w:type="dxa"/>
+            <w:tcW w:type="dxa" w:w="2268"/>
           </w:tcPr>
           <w:p>
             <w:r>
@@ -830,12 +694,9 @@
         </w:tc>
         <w:tc>
           <w:tcPr>
-            <w:tcW w:w="3118" w:type="dxa"/>
-          </w:tcPr>
-          <w:p>
-            <w:pPr>
-              <w:cnfStyle w:val="000000000000" w:firstRow="0" w:lastRow="0" w:firstColumn="0" w:lastColumn="0" w:oddVBand="0" w:evenVBand="0" w:oddHBand="0" w:evenHBand="0" w:firstRowFirstColumn="0" w:firstRowLastColumn="0" w:lastRowFirstColumn="0" w:lastRowLastColumn="0"/>
-            </w:pPr>
+            <w:tcW w:type="dxa" w:w="3118"/>
+          </w:tcPr>
+          <w:p>
             <w:r>
               <w:t>0.42%</w:t>
             </w:r>
@@ -845,8 +706,7 @@
       <w:tr>
         <w:tc>
           <w:tcPr>
-            <w:cnfStyle w:val="001000000000" w:firstRow="0" w:lastRow="0" w:firstColumn="1" w:lastColumn="0" w:oddVBand="0" w:evenVBand="0" w:oddHBand="0" w:evenHBand="0" w:firstRowFirstColumn="0" w:firstRowLastColumn="0" w:lastRowFirstColumn="0" w:lastRowLastColumn="0"/>
-            <w:tcW w:w="2268" w:type="dxa"/>
+            <w:tcW w:type="dxa" w:w="2268"/>
           </w:tcPr>
           <w:p>
             <w:r>
@@ -856,12 +716,9 @@
         </w:tc>
         <w:tc>
           <w:tcPr>
-            <w:tcW w:w="3118" w:type="dxa"/>
-          </w:tcPr>
-          <w:p>
-            <w:pPr>
-              <w:cnfStyle w:val="000000000000" w:firstRow="0" w:lastRow="0" w:firstColumn="0" w:lastColumn="0" w:oddVBand="0" w:evenVBand="0" w:oddHBand="0" w:evenHBand="0" w:firstRowFirstColumn="0" w:firstRowLastColumn="0" w:lastRowFirstColumn="0" w:lastRowLastColumn="0"/>
-            </w:pPr>
+            <w:tcW w:type="dxa" w:w="3118"/>
+          </w:tcPr>
+          <w:p>
             <w:r>
               <w:t>0.07%</w:t>
             </w:r>
@@ -880,37 +737,36 @@
     <w:tbl>
       <w:tblPr>
         <w:tblStyle w:val="AtchisonTable1"/>
-        <w:tblW w:w="0" w:type="auto"/>
-        <w:tblLook w:val="04A0" w:firstRow="1" w:lastRow="0" w:firstColumn="1" w:lastColumn="0" w:noHBand="0" w:noVBand="1"/>
+        <w:tblW w:type="auto" w:w="0"/>
+        <w:tblLook w:firstColumn="1" w:firstRow="1" w:lastColumn="0" w:lastRow="0" w:noHBand="0" w:noVBand="1" w:val="04A0"/>
       </w:tblPr>
       <w:tblGrid>
-        <w:gridCol w:w="1417"/>
-        <w:gridCol w:w="3685"/>
+        <w:gridCol w:w="5527"/>
+        <w:gridCol w:w="5527"/>
       </w:tblGrid>
       <w:tr>
-        <w:trPr>
-          <w:cnfStyle w:val="100000000000" w:firstRow="1" w:lastRow="0" w:firstColumn="0" w:lastColumn="0" w:oddVBand="0" w:evenVBand="0" w:oddHBand="0" w:evenHBand="0" w:firstRowFirstColumn="0" w:firstRowLastColumn="0" w:lastRowFirstColumn="0" w:lastRowLastColumn="0"/>
-        </w:trPr>
-        <w:tc>
-          <w:tcPr>
-            <w:cnfStyle w:val="001000000000" w:firstRow="0" w:lastRow="0" w:firstColumn="1" w:lastColumn="0" w:oddVBand="0" w:evenVBand="0" w:oddHBand="0" w:evenHBand="0" w:firstRowFirstColumn="0" w:firstRowLastColumn="0" w:lastRowFirstColumn="0" w:lastRowLastColumn="0"/>
-            <w:tcW w:w="1417" w:type="dxa"/>
-          </w:tcPr>
-          <w:p>
-            <w:r>
+        <w:tc>
+          <w:tcPr>
+            <w:tcW w:type="dxa" w:w="1417"/>
+          </w:tcPr>
+          <w:p>
+            <w:r>
+              <w:rPr>
+                <w:b/>
+              </w:rPr>
               <w:t>Code</w:t>
             </w:r>
           </w:p>
         </w:tc>
         <w:tc>
           <w:tcPr>
-            <w:tcW w:w="3685" w:type="dxa"/>
-          </w:tcPr>
-          <w:p>
-            <w:pPr>
-              <w:cnfStyle w:val="100000000000" w:firstRow="1" w:lastRow="0" w:firstColumn="0" w:lastColumn="0" w:oddVBand="0" w:evenVBand="0" w:oddHBand="0" w:evenHBand="0" w:firstRowFirstColumn="0" w:firstRowLastColumn="0" w:lastRowFirstColumn="0" w:lastRowLastColumn="0"/>
-            </w:pPr>
-            <w:r>
+            <w:tcW w:type="dxa" w:w="3685"/>
+          </w:tcPr>
+          <w:p>
+            <w:r>
+              <w:rPr>
+                <w:b/>
+              </w:rPr>
               <w:t>Name</w:t>
             </w:r>
           </w:p>
@@ -919,25 +775,21 @@
       <w:tr>
         <w:tc>
           <w:tcPr>
-            <w:cnfStyle w:val="001000000000" w:firstRow="0" w:lastRow="0" w:firstColumn="1" w:lastColumn="0" w:oddVBand="0" w:evenVBand="0" w:oddHBand="0" w:evenHBand="0" w:firstRowFirstColumn="0" w:firstRowLastColumn="0" w:lastRowFirstColumn="0" w:lastRowLastColumn="0"/>
-            <w:tcW w:w="1417" w:type="dxa"/>
-          </w:tcPr>
-          <w:p>
-            <w:r>
-              <w:t>BHP-AU</w:t>
-            </w:r>
-          </w:p>
-        </w:tc>
-        <w:tc>
-          <w:tcPr>
-            <w:tcW w:w="3685" w:type="dxa"/>
-          </w:tcPr>
-          <w:p>
-            <w:pPr>
-              <w:cnfStyle w:val="000000000000" w:firstRow="0" w:lastRow="0" w:firstColumn="0" w:lastColumn="0" w:oddVBand="0" w:evenVBand="0" w:oddHBand="0" w:evenHBand="0" w:firstRowFirstColumn="0" w:firstRowLastColumn="0" w:lastRowFirstColumn="0" w:lastRowLastColumn="0"/>
-            </w:pPr>
-            <w:r>
-              <w:t>BHP Group Limited</w:t>
+            <w:tcW w:type="dxa" w:w="1417"/>
+          </w:tcPr>
+          <w:p>
+            <w:r>
+              <w:t>MSFT.NAS</w:t>
+            </w:r>
+          </w:p>
+        </w:tc>
+        <w:tc>
+          <w:tcPr>
+            <w:tcW w:type="dxa" w:w="3685"/>
+          </w:tcPr>
+          <w:p>
+            <w:r>
+              <w:t>MICROSOFT CORP</w:t>
             </w:r>
           </w:p>
         </w:tc>
@@ -945,25 +797,21 @@
       <w:tr>
         <w:tc>
           <w:tcPr>
-            <w:cnfStyle w:val="001000000000" w:firstRow="0" w:lastRow="0" w:firstColumn="1" w:lastColumn="0" w:oddVBand="0" w:evenVBand="0" w:oddHBand="0" w:evenHBand="0" w:firstRowFirstColumn="0" w:firstRowLastColumn="0" w:lastRowFirstColumn="0" w:lastRowLastColumn="0"/>
-            <w:tcW w:w="1417" w:type="dxa"/>
-          </w:tcPr>
-          <w:p>
-            <w:r>
-              <w:t>CBA-AU</w:t>
-            </w:r>
-          </w:p>
-        </w:tc>
-        <w:tc>
-          <w:tcPr>
-            <w:tcW w:w="3685" w:type="dxa"/>
-          </w:tcPr>
-          <w:p>
-            <w:pPr>
-              <w:cnfStyle w:val="000000000000" w:firstRow="0" w:lastRow="0" w:firstColumn="0" w:lastColumn="0" w:oddVBand="0" w:evenVBand="0" w:oddHBand="0" w:evenHBand="0" w:firstRowFirstColumn="0" w:firstRowLastColumn="0" w:lastRowFirstColumn="0" w:lastRowLastColumn="0"/>
-            </w:pPr>
-            <w:r>
-              <w:t>Commonwealth Bank of Australia</w:t>
+            <w:tcW w:type="dxa" w:w="1417"/>
+          </w:tcPr>
+          <w:p>
+            <w:r>
+              <w:t>BHP-AU</w:t>
+            </w:r>
+          </w:p>
+        </w:tc>
+        <w:tc>
+          <w:tcPr>
+            <w:tcW w:type="dxa" w:w="3685"/>
+          </w:tcPr>
+          <w:p>
+            <w:r>
+              <w:t>BHP Group Limited</w:t>
             </w:r>
           </w:p>
         </w:tc>
@@ -971,25 +819,21 @@
       <w:tr>
         <w:tc>
           <w:tcPr>
-            <w:cnfStyle w:val="001000000000" w:firstRow="0" w:lastRow="0" w:firstColumn="1" w:lastColumn="0" w:oddVBand="0" w:evenVBand="0" w:oddHBand="0" w:evenHBand="0" w:firstRowFirstColumn="0" w:firstRowLastColumn="0" w:lastRowFirstColumn="0" w:lastRowLastColumn="0"/>
-            <w:tcW w:w="1417" w:type="dxa"/>
-          </w:tcPr>
-          <w:p>
-            <w:r>
-              <w:t>CSL-AU</w:t>
-            </w:r>
-          </w:p>
-        </w:tc>
-        <w:tc>
-          <w:tcPr>
-            <w:tcW w:w="3685" w:type="dxa"/>
-          </w:tcPr>
-          <w:p>
-            <w:pPr>
-              <w:cnfStyle w:val="000000000000" w:firstRow="0" w:lastRow="0" w:firstColumn="0" w:lastColumn="0" w:oddVBand="0" w:evenVBand="0" w:oddHBand="0" w:evenHBand="0" w:firstRowFirstColumn="0" w:firstRowLastColumn="0" w:lastRowFirstColumn="0" w:lastRowLastColumn="0"/>
-            </w:pPr>
-            <w:r>
-              <w:t>CSL Limited</w:t>
+            <w:tcW w:type="dxa" w:w="1417"/>
+          </w:tcPr>
+          <w:p>
+            <w:r>
+              <w:t>LLY.NYS</w:t>
+            </w:r>
+          </w:p>
+        </w:tc>
+        <w:tc>
+          <w:tcPr>
+            <w:tcW w:type="dxa" w:w="3685"/>
+          </w:tcPr>
+          <w:p>
+            <w:r>
+              <w:t>ELI LILLY</w:t>
             </w:r>
           </w:p>
         </w:tc>
@@ -997,25 +841,21 @@
       <w:tr>
         <w:tc>
           <w:tcPr>
-            <w:cnfStyle w:val="001000000000" w:firstRow="0" w:lastRow="0" w:firstColumn="1" w:lastColumn="0" w:oddVBand="0" w:evenVBand="0" w:oddHBand="0" w:evenHBand="0" w:firstRowFirstColumn="0" w:firstRowLastColumn="0" w:lastRowFirstColumn="0" w:lastRowLastColumn="0"/>
-            <w:tcW w:w="1417" w:type="dxa"/>
-          </w:tcPr>
-          <w:p>
-            <w:r>
-              <w:t>NAB-AU</w:t>
-            </w:r>
-          </w:p>
-        </w:tc>
-        <w:tc>
-          <w:tcPr>
-            <w:tcW w:w="3685" w:type="dxa"/>
-          </w:tcPr>
-          <w:p>
-            <w:pPr>
-              <w:cnfStyle w:val="000000000000" w:firstRow="0" w:lastRow="0" w:firstColumn="0" w:lastColumn="0" w:oddVBand="0" w:evenVBand="0" w:oddHBand="0" w:evenHBand="0" w:firstRowFirstColumn="0" w:firstRowLastColumn="0" w:lastRowFirstColumn="0" w:lastRowLastColumn="0"/>
-            </w:pPr>
-            <w:r>
-              <w:t>National Australia Bank Limited</w:t>
+            <w:tcW w:type="dxa" w:w="1417"/>
+          </w:tcPr>
+          <w:p>
+            <w:r>
+              <w:t>META.NAS</w:t>
+            </w:r>
+          </w:p>
+        </w:tc>
+        <w:tc>
+          <w:tcPr>
+            <w:tcW w:type="dxa" w:w="3685"/>
+          </w:tcPr>
+          <w:p>
+            <w:r>
+              <w:t>META PLATFORMS INC CLASS A</w:t>
             </w:r>
           </w:p>
         </w:tc>
@@ -1023,25 +863,21 @@
       <w:tr>
         <w:tc>
           <w:tcPr>
-            <w:cnfStyle w:val="001000000000" w:firstRow="0" w:lastRow="0" w:firstColumn="1" w:lastColumn="0" w:oddVBand="0" w:evenVBand="0" w:oddHBand="0" w:evenHBand="0" w:firstRowFirstColumn="0" w:firstRowLastColumn="0" w:lastRowFirstColumn="0" w:lastRowLastColumn="0"/>
-            <w:tcW w:w="1417" w:type="dxa"/>
-          </w:tcPr>
-          <w:p>
-            <w:r>
-              <w:t>ANZ-AU</w:t>
-            </w:r>
-          </w:p>
-        </w:tc>
-        <w:tc>
-          <w:tcPr>
-            <w:tcW w:w="3685" w:type="dxa"/>
-          </w:tcPr>
-          <w:p>
-            <w:pPr>
-              <w:cnfStyle w:val="000000000000" w:firstRow="0" w:lastRow="0" w:firstColumn="0" w:lastColumn="0" w:oddVBand="0" w:evenVBand="0" w:oddHBand="0" w:evenHBand="0" w:firstRowFirstColumn="0" w:firstRowLastColumn="0" w:lastRowFirstColumn="0" w:lastRowLastColumn="0"/>
-            </w:pPr>
-            <w:r>
-              <w:t>ANZ Group Holdings Limited</w:t>
+            <w:tcW w:type="dxa" w:w="1417"/>
+          </w:tcPr>
+          <w:p>
+            <w:r>
+              <w:t>AAPL.NAS</w:t>
+            </w:r>
+          </w:p>
+        </w:tc>
+        <w:tc>
+          <w:tcPr>
+            <w:tcW w:type="dxa" w:w="3685"/>
+          </w:tcPr>
+          <w:p>
+            <w:r>
+              <w:t>APPLE INC</w:t>
             </w:r>
           </w:p>
         </w:tc>
@@ -1049,25 +885,21 @@
       <w:tr>
         <w:tc>
           <w:tcPr>
-            <w:cnfStyle w:val="001000000000" w:firstRow="0" w:lastRow="0" w:firstColumn="1" w:lastColumn="0" w:oddVBand="0" w:evenVBand="0" w:oddHBand="0" w:evenHBand="0" w:firstRowFirstColumn="0" w:firstRowLastColumn="0" w:lastRowFirstColumn="0" w:lastRowLastColumn="0"/>
-            <w:tcW w:w="1417" w:type="dxa"/>
-          </w:tcPr>
-          <w:p>
-            <w:r>
-              <w:t>WBC-AU</w:t>
-            </w:r>
-          </w:p>
-        </w:tc>
-        <w:tc>
-          <w:tcPr>
-            <w:tcW w:w="3685" w:type="dxa"/>
-          </w:tcPr>
-          <w:p>
-            <w:pPr>
-              <w:cnfStyle w:val="000000000000" w:firstRow="0" w:lastRow="0" w:firstColumn="0" w:lastColumn="0" w:oddVBand="0" w:evenVBand="0" w:oddHBand="0" w:evenHBand="0" w:firstRowFirstColumn="0" w:firstRowLastColumn="0" w:lastRowFirstColumn="0" w:lastRowLastColumn="0"/>
-            </w:pPr>
-            <w:r>
-              <w:t>Westpac Banking Corporation</w:t>
+            <w:tcW w:type="dxa" w:w="1417"/>
+          </w:tcPr>
+          <w:p>
+            <w:r>
+              <w:t>CBA-AU</w:t>
+            </w:r>
+          </w:p>
+        </w:tc>
+        <w:tc>
+          <w:tcPr>
+            <w:tcW w:type="dxa" w:w="3685"/>
+          </w:tcPr>
+          <w:p>
+            <w:r>
+              <w:t>Commonwealth Bank of Australia</w:t>
             </w:r>
           </w:p>
         </w:tc>
@@ -1075,25 +907,21 @@
       <w:tr>
         <w:tc>
           <w:tcPr>
-            <w:cnfStyle w:val="001000000000" w:firstRow="0" w:lastRow="0" w:firstColumn="1" w:lastColumn="0" w:oddVBand="0" w:evenVBand="0" w:oddHBand="0" w:evenHBand="0" w:firstRowFirstColumn="0" w:firstRowLastColumn="0" w:lastRowFirstColumn="0" w:lastRowLastColumn="0"/>
-            <w:tcW w:w="1417" w:type="dxa"/>
-          </w:tcPr>
-          <w:p>
-            <w:r>
-              <w:t>WDS-AU</w:t>
-            </w:r>
-          </w:p>
-        </w:tc>
-        <w:tc>
-          <w:tcPr>
-            <w:tcW w:w="3685" w:type="dxa"/>
-          </w:tcPr>
-          <w:p>
-            <w:pPr>
-              <w:cnfStyle w:val="000000000000" w:firstRow="0" w:lastRow="0" w:firstColumn="0" w:lastColumn="0" w:oddVBand="0" w:evenVBand="0" w:oddHBand="0" w:evenHBand="0" w:firstRowFirstColumn="0" w:firstRowLastColumn="0" w:lastRowFirstColumn="0" w:lastRowLastColumn="0"/>
-            </w:pPr>
-            <w:r>
-              <w:t>Woodside Energy Group Ltd</w:t>
+            <w:tcW w:type="dxa" w:w="1417"/>
+          </w:tcPr>
+          <w:p>
+            <w:r>
+              <w:t>AMZN.NAS</w:t>
+            </w:r>
+          </w:p>
+        </w:tc>
+        <w:tc>
+          <w:tcPr>
+            <w:tcW w:type="dxa" w:w="3685"/>
+          </w:tcPr>
+          <w:p>
+            <w:r>
+              <w:t>AMAZON COM INC</w:t>
             </w:r>
           </w:p>
         </w:tc>
@@ -1101,25 +929,21 @@
       <w:tr>
         <w:tc>
           <w:tcPr>
-            <w:cnfStyle w:val="001000000000" w:firstRow="0" w:lastRow="0" w:firstColumn="1" w:lastColumn="0" w:oddVBand="0" w:evenVBand="0" w:oddHBand="0" w:evenHBand="0" w:firstRowFirstColumn="0" w:firstRowLastColumn="0" w:lastRowFirstColumn="0" w:lastRowLastColumn="0"/>
-            <w:tcW w:w="1417" w:type="dxa"/>
-          </w:tcPr>
-          <w:p>
-            <w:r>
-              <w:t>WES-AU</w:t>
-            </w:r>
-          </w:p>
-        </w:tc>
-        <w:tc>
-          <w:tcPr>
-            <w:tcW w:w="3685" w:type="dxa"/>
-          </w:tcPr>
-          <w:p>
-            <w:pPr>
-              <w:cnfStyle w:val="000000000000" w:firstRow="0" w:lastRow="0" w:firstColumn="0" w:lastColumn="0" w:oddVBand="0" w:evenVBand="0" w:oddHBand="0" w:evenHBand="0" w:firstRowFirstColumn="0" w:firstRowLastColumn="0" w:lastRowFirstColumn="0" w:lastRowLastColumn="0"/>
-            </w:pPr>
-            <w:r>
-              <w:t>Wesfarmers Limited</w:t>
+            <w:tcW w:type="dxa" w:w="1417"/>
+          </w:tcPr>
+          <w:p>
+            <w:r>
+              <w:t>NVDA.NAS</w:t>
+            </w:r>
+          </w:p>
+        </w:tc>
+        <w:tc>
+          <w:tcPr>
+            <w:tcW w:type="dxa" w:w="3685"/>
+          </w:tcPr>
+          <w:p>
+            <w:r>
+              <w:t>NVIDIA CORP</w:t>
             </w:r>
           </w:p>
         </w:tc>
@@ -1127,25 +951,21 @@
       <w:tr>
         <w:tc>
           <w:tcPr>
-            <w:cnfStyle w:val="001000000000" w:firstRow="0" w:lastRow="0" w:firstColumn="1" w:lastColumn="0" w:oddVBand="0" w:evenVBand="0" w:oddHBand="0" w:evenHBand="0" w:firstRowFirstColumn="0" w:firstRowLastColumn="0" w:lastRowFirstColumn="0" w:lastRowLastColumn="0"/>
-            <w:tcW w:w="1417" w:type="dxa"/>
-          </w:tcPr>
-          <w:p>
-            <w:r>
-              <w:t>MQG-AU</w:t>
-            </w:r>
-          </w:p>
-        </w:tc>
-        <w:tc>
-          <w:tcPr>
-            <w:tcW w:w="3685" w:type="dxa"/>
-          </w:tcPr>
-          <w:p>
-            <w:pPr>
-              <w:cnfStyle w:val="000000000000" w:firstRow="0" w:lastRow="0" w:firstColumn="0" w:lastColumn="0" w:oddVBand="0" w:evenVBand="0" w:oddHBand="0" w:evenHBand="0" w:firstRowFirstColumn="0" w:firstRowLastColumn="0" w:lastRowFirstColumn="0" w:lastRowLastColumn="0"/>
-            </w:pPr>
-            <w:r>
-              <w:t>Macquarie Group Limited</w:t>
+            <w:tcW w:type="dxa" w:w="1417"/>
+          </w:tcPr>
+          <w:p>
+            <w:r>
+              <w:t>NOVO-B.CSE</w:t>
+            </w:r>
+          </w:p>
+        </w:tc>
+        <w:tc>
+          <w:tcPr>
+            <w:tcW w:type="dxa" w:w="3685"/>
+          </w:tcPr>
+          <w:p>
+            <w:r>
+              <w:t>NOVO NORDISK CLASS B</w:t>
             </w:r>
           </w:p>
         </w:tc>
@@ -1153,159 +973,49 @@
       <w:tr>
         <w:tc>
           <w:tcPr>
-            <w:cnfStyle w:val="001000000000" w:firstRow="0" w:lastRow="0" w:firstColumn="1" w:lastColumn="0" w:oddVBand="0" w:evenVBand="0" w:oddHBand="0" w:evenHBand="0" w:firstRowFirstColumn="0" w:firstRowLastColumn="0" w:lastRowFirstColumn="0" w:lastRowLastColumn="0"/>
-            <w:tcW w:w="1417" w:type="dxa"/>
-          </w:tcPr>
-          <w:p>
-            <w:r>
-              <w:t>TLS-AU</w:t>
-            </w:r>
-          </w:p>
-        </w:tc>
-        <w:tc>
-          <w:tcPr>
-            <w:tcW w:w="3685" w:type="dxa"/>
-          </w:tcPr>
-          <w:p>
-            <w:pPr>
-              <w:cnfStyle w:val="000000000000" w:firstRow="0" w:lastRow="0" w:firstColumn="0" w:lastColumn="0" w:oddVBand="0" w:evenVBand="0" w:oddHBand="0" w:evenHBand="0" w:firstRowFirstColumn="0" w:firstRowLastColumn="0" w:lastRowFirstColumn="0" w:lastRowLastColumn="0"/>
-            </w:pPr>
-            <w:r>
-              <w:t>Telstra Group Limited</w:t>
+            <w:tcW w:type="dxa" w:w="1417"/>
+          </w:tcPr>
+          <w:p>
+            <w:r>
+              <w:t>CSL-AU</w:t>
+            </w:r>
+          </w:p>
+        </w:tc>
+        <w:tc>
+          <w:tcPr>
+            <w:tcW w:type="dxa" w:w="3685"/>
+          </w:tcPr>
+          <w:p>
+            <w:r>
+              <w:t>CSL Limited</w:t>
             </w:r>
           </w:p>
         </w:tc>
       </w:tr>
     </w:tbl>
+    <w:br w:type="column"/>
     <w:p>
       <w:pPr>
         <w:pStyle w:val="Heading30"/>
       </w:pPr>
-      <w:r>
-        <w:br w:type="column"/>
-      </w:r>
       <w:r>
         <w:t>Strategy Performance</w:t>
       </w:r>
     </w:p>
     <w:p>
       <w:r>
-        <w:rPr>
-          <w:noProof/>
-        </w:rPr>
         <w:drawing>
-          <wp:inline distT="0" distB="0" distL="0" distR="0" wp14:anchorId="2A929E1C" wp14:editId="55C85E74">
+          <wp:inline xmlns:a="http://schemas.openxmlformats.org/drawingml/2006/main" xmlns:pic="http://schemas.openxmlformats.org/drawingml/2006/picture">
             <wp:extent cx="3240000" cy="1800000"/>
-            <wp:effectExtent l="0" t="0" r="0" b="0"/>
             <wp:docPr id="1" name="Picture 1"/>
             <wp:cNvGraphicFramePr>
-              <a:graphicFrameLocks xmlns:a="http://schemas.openxmlformats.org/drawingml/2006/main" noChangeAspect="1"/>
+              <a:graphicFrameLocks noChangeAspect="1"/>
             </wp:cNvGraphicFramePr>
-            <a:graphic xmlns:a="http://schemas.openxmlformats.org/drawingml/2006/main">
+            <a:graphic>
               <a:graphicData uri="http://schemas.openxmlformats.org/drawingml/2006/picture">
-                <pic:pic xmlns:pic="http://schemas.openxmlformats.org/drawingml/2006/picture">
+                <pic:pic>
                   <pic:nvPicPr>
                     <pic:cNvPr id="0" name="1_Performance-Main_v2.png"/>
-                    <pic:cNvPicPr/>
-                  </pic:nvPicPr>
-                  <pic:blipFill>
-                    <a:blip r:embed="rId17"/>
-                    <a:stretch>
-                      <a:fillRect/>
-                    </a:stretch>
-                  </pic:blipFill>
-                  <pic:spPr>
-                    <a:xfrm>
-                      <a:off x="0" y="0"/>
-                      <a:ext cx="3240000" cy="1800000"/>
-                    </a:xfrm>
-                    <a:prstGeom prst="rect">
-                      <a:avLst/>
-                    </a:prstGeom>
-                  </pic:spPr>
-                </pic:pic>
-              </a:graphicData>
-            </a:graphic>
-          </wp:inline>
-        </w:drawing>
-      </w:r>
-    </w:p>
-    <w:p>
-      <w:pPr>
-        <w:pStyle w:val="Heading30"/>
-      </w:pPr>
-      <w:r>
-        <w:t>Cumulative Performance Since Inception</w:t>
-      </w:r>
-    </w:p>
-    <w:p>
-      <w:r>
-        <w:rPr>
-          <w:noProof/>
-        </w:rPr>
-        <w:drawing>
-          <wp:inline distT="0" distB="0" distL="0" distR="0" wp14:anchorId="02DC7085" wp14:editId="1CCEC3F1">
-            <wp:extent cx="3239770" cy="2160395"/>
-            <wp:effectExtent l="0" t="0" r="0" b="0"/>
-            <wp:docPr id="2" name="Picture 2"/>
-            <wp:cNvGraphicFramePr>
-              <a:graphicFrameLocks xmlns:a="http://schemas.openxmlformats.org/drawingml/2006/main" noChangeAspect="1"/>
-            </wp:cNvGraphicFramePr>
-            <a:graphic xmlns:a="http://schemas.openxmlformats.org/drawingml/2006/main">
-              <a:graphicData uri="http://schemas.openxmlformats.org/drawingml/2006/picture">
-                <pic:pic xmlns:pic="http://schemas.openxmlformats.org/drawingml/2006/picture">
-                  <pic:nvPicPr>
-                    <pic:cNvPr id="0" name="1_Performance-Cum_v2.png"/>
-                    <pic:cNvPicPr/>
-                  </pic:nvPicPr>
-                  <pic:blipFill>
-                    <a:blip r:embed="rId18"/>
-                    <a:stretch>
-                      <a:fillRect/>
-                    </a:stretch>
-                  </pic:blipFill>
-                  <pic:spPr>
-                    <a:xfrm>
-                      <a:off x="0" y="0"/>
-                      <a:ext cx="3243516" cy="2162893"/>
-                    </a:xfrm>
-                    <a:prstGeom prst="rect">
-                      <a:avLst/>
-                    </a:prstGeom>
-                  </pic:spPr>
-                </pic:pic>
-              </a:graphicData>
-            </a:graphic>
-          </wp:inline>
-        </w:drawing>
-      </w:r>
-    </w:p>
-    <w:p>
-      <w:pPr>
-        <w:pStyle w:val="Heading30"/>
-      </w:pPr>
-      <w:r>
-        <w:t>Portfolio Allocations</w:t>
-      </w:r>
-    </w:p>
-    <w:p>
-      <w:r>
-        <w:rPr>
-          <w:noProof/>
-        </w:rPr>
-        <w:drawing>
-          <wp:inline distT="0" distB="0" distL="0" distR="0" wp14:anchorId="5DD552C4" wp14:editId="5BD508BD">
-            <wp:extent cx="3240000" cy="1800000"/>
-            <wp:effectExtent l="0" t="0" r="0" b="0"/>
-            <wp:docPr id="3" name="Picture 3"/>
-            <wp:cNvGraphicFramePr>
-              <a:graphicFrameLocks xmlns:a="http://schemas.openxmlformats.org/drawingml/2006/main" noChangeAspect="1"/>
-            </wp:cNvGraphicFramePr>
-            <a:graphic xmlns:a="http://schemas.openxmlformats.org/drawingml/2006/main">
-              <a:graphicData uri="http://schemas.openxmlformats.org/drawingml/2006/picture">
-                <pic:pic xmlns:pic="http://schemas.openxmlformats.org/drawingml/2006/picture">
-                  <pic:nvPicPr>
-                    <pic:cNvPr id="0" name="3_Alloc_Ranges.png"/>
                     <pic:cNvPicPr/>
                   </pic:nvPicPr>
                   <pic:blipFill>
@@ -1319,9 +1029,7 @@
                       <a:off x="0" y="0"/>
                       <a:ext cx="3240000" cy="1800000"/>
                     </a:xfrm>
-                    <a:prstGeom prst="rect">
-                      <a:avLst/>
-                    </a:prstGeom>
+                    <a:prstGeom prst="rect"/>
                   </pic:spPr>
                 </pic:pic>
               </a:graphicData>
@@ -1335,374 +1043,23 @@
         <w:pStyle w:val="Heading30"/>
       </w:pPr>
       <w:r>
-        <w:br w:type="column"/>
-      </w:r>
-      <w:r>
-        <w:lastRenderedPageBreak/>
-        <w:t>Asset Class Performance</w:t>
-      </w:r>
-    </w:p>
-    <w:tbl>
-      <w:tblPr>
-        <w:tblStyle w:val="AtchisonTable1"/>
-        <w:tblW w:w="0" w:type="auto"/>
-        <w:tblLook w:val="04A0" w:firstRow="1" w:lastRow="0" w:firstColumn="1" w:lastColumn="0" w:noHBand="0" w:noVBand="1"/>
-      </w:tblPr>
-      <w:tblGrid>
-        <w:gridCol w:w="1984"/>
-        <w:gridCol w:w="1559"/>
-        <w:gridCol w:w="1559"/>
-      </w:tblGrid>
-      <w:tr>
-        <w:trPr>
-          <w:cnfStyle w:val="100000000000" w:firstRow="1" w:lastRow="0" w:firstColumn="0" w:lastColumn="0" w:oddVBand="0" w:evenVBand="0" w:oddHBand="0" w:evenHBand="0" w:firstRowFirstColumn="0" w:firstRowLastColumn="0" w:lastRowFirstColumn="0" w:lastRowLastColumn="0"/>
-        </w:trPr>
-        <w:tc>
-          <w:tcPr>
-            <w:cnfStyle w:val="001000000000" w:firstRow="0" w:lastRow="0" w:firstColumn="1" w:lastColumn="0" w:oddVBand="0" w:evenVBand="0" w:oddHBand="0" w:evenHBand="0" w:firstRowFirstColumn="0" w:firstRowLastColumn="0" w:lastRowFirstColumn="0" w:lastRowLastColumn="0"/>
-            <w:tcW w:w="1984" w:type="dxa"/>
-          </w:tcPr>
-          <w:p>
-            <w:r>
-              <w:t>Period</w:t>
-            </w:r>
-          </w:p>
-        </w:tc>
-        <w:tc>
-          <w:tcPr>
-            <w:tcW w:w="1559" w:type="dxa"/>
-          </w:tcPr>
-          <w:p>
-            <w:pPr>
-              <w:cnfStyle w:val="100000000000" w:firstRow="1" w:lastRow="0" w:firstColumn="0" w:lastColumn="0" w:oddVBand="0" w:evenVBand="0" w:oddHBand="0" w:evenHBand="0" w:firstRowFirstColumn="0" w:firstRowLastColumn="0" w:lastRowFirstColumn="0" w:lastRowLastColumn="0"/>
-            </w:pPr>
-            <w:r>
-              <w:t>1 Year</w:t>
-            </w:r>
-          </w:p>
-        </w:tc>
-        <w:tc>
-          <w:tcPr>
-            <w:tcW w:w="1559" w:type="dxa"/>
-          </w:tcPr>
-          <w:p>
-            <w:pPr>
-              <w:cnfStyle w:val="100000000000" w:firstRow="1" w:lastRow="0" w:firstColumn="0" w:lastColumn="0" w:oddVBand="0" w:evenVBand="0" w:oddHBand="0" w:evenHBand="0" w:firstRowFirstColumn="0" w:firstRowLastColumn="0" w:lastRowFirstColumn="0" w:lastRowLastColumn="0"/>
-            </w:pPr>
-            <w:r>
-              <w:t>2 Years (p.a.)</w:t>
-            </w:r>
-          </w:p>
-        </w:tc>
-      </w:tr>
-      <w:tr>
-        <w:tc>
-          <w:tcPr>
-            <w:cnfStyle w:val="001000000000" w:firstRow="0" w:lastRow="0" w:firstColumn="1" w:lastColumn="0" w:oddVBand="0" w:evenVBand="0" w:oddHBand="0" w:evenHBand="0" w:firstRowFirstColumn="0" w:firstRowLastColumn="0" w:lastRowFirstColumn="0" w:lastRowLastColumn="0"/>
-            <w:tcW w:w="1984" w:type="dxa"/>
-          </w:tcPr>
-          <w:p>
-            <w:r>
-              <w:t>Australian Shares</w:t>
-            </w:r>
-          </w:p>
-        </w:tc>
-        <w:tc>
-          <w:tcPr>
-            <w:tcW w:w="1559" w:type="dxa"/>
-          </w:tcPr>
-          <w:p>
-            <w:pPr>
-              <w:cnfStyle w:val="000000000000" w:firstRow="0" w:lastRow="0" w:firstColumn="0" w:lastColumn="0" w:oddVBand="0" w:evenVBand="0" w:oddHBand="0" w:evenHBand="0" w:firstRowFirstColumn="0" w:firstRowLastColumn="0" w:lastRowFirstColumn="0" w:lastRowLastColumn="0"/>
-            </w:pPr>
-            <w:r>
-              <w:t>6.5</w:t>
-            </w:r>
-          </w:p>
-        </w:tc>
-        <w:tc>
-          <w:tcPr>
-            <w:tcW w:w="1559" w:type="dxa"/>
-          </w:tcPr>
-          <w:p>
-            <w:pPr>
-              <w:cnfStyle w:val="000000000000" w:firstRow="0" w:lastRow="0" w:firstColumn="0" w:lastColumn="0" w:oddVBand="0" w:evenVBand="0" w:oddHBand="0" w:evenHBand="0" w:firstRowFirstColumn="0" w:firstRowLastColumn="0" w:lastRowFirstColumn="0" w:lastRowLastColumn="0"/>
-            </w:pPr>
-            <w:r>
-              <w:t>7.53</w:t>
-            </w:r>
-          </w:p>
-        </w:tc>
-      </w:tr>
-      <w:tr>
-        <w:tc>
-          <w:tcPr>
-            <w:cnfStyle w:val="001000000000" w:firstRow="0" w:lastRow="0" w:firstColumn="1" w:lastColumn="0" w:oddVBand="0" w:evenVBand="0" w:oddHBand="0" w:evenHBand="0" w:firstRowFirstColumn="0" w:firstRowLastColumn="0" w:lastRowFirstColumn="0" w:lastRowLastColumn="0"/>
-            <w:tcW w:w="1984" w:type="dxa"/>
-          </w:tcPr>
-          <w:p>
-            <w:r>
-              <w:t>International Shares</w:t>
-            </w:r>
-          </w:p>
-        </w:tc>
-        <w:tc>
-          <w:tcPr>
-            <w:tcW w:w="1559" w:type="dxa"/>
-          </w:tcPr>
-          <w:p>
-            <w:pPr>
-              <w:cnfStyle w:val="000000000000" w:firstRow="0" w:lastRow="0" w:firstColumn="0" w:lastColumn="0" w:oddVBand="0" w:evenVBand="0" w:oddHBand="0" w:evenHBand="0" w:firstRowFirstColumn="0" w:firstRowLastColumn="0" w:lastRowFirstColumn="0" w:lastRowLastColumn="0"/>
-            </w:pPr>
-            <w:r>
-              <w:t>8.78</w:t>
-            </w:r>
-          </w:p>
-        </w:tc>
-        <w:tc>
-          <w:tcPr>
-            <w:tcW w:w="1559" w:type="dxa"/>
-          </w:tcPr>
-          <w:p>
-            <w:pPr>
-              <w:cnfStyle w:val="000000000000" w:firstRow="0" w:lastRow="0" w:firstColumn="0" w:lastColumn="0" w:oddVBand="0" w:evenVBand="0" w:oddHBand="0" w:evenHBand="0" w:firstRowFirstColumn="0" w:firstRowLastColumn="0" w:lastRowFirstColumn="0" w:lastRowLastColumn="0"/>
-            </w:pPr>
-            <w:r>
-              <w:t>15.09</w:t>
-            </w:r>
-          </w:p>
-        </w:tc>
-      </w:tr>
-      <w:tr>
-        <w:tc>
-          <w:tcPr>
-            <w:cnfStyle w:val="001000000000" w:firstRow="0" w:lastRow="0" w:firstColumn="1" w:lastColumn="0" w:oddVBand="0" w:evenVBand="0" w:oddHBand="0" w:evenHBand="0" w:firstRowFirstColumn="0" w:firstRowLastColumn="0" w:lastRowFirstColumn="0" w:lastRowLastColumn="0"/>
-            <w:tcW w:w="1984" w:type="dxa"/>
-          </w:tcPr>
-          <w:p>
-            <w:r>
-              <w:t>Real Assets</w:t>
-            </w:r>
-          </w:p>
-        </w:tc>
-        <w:tc>
-          <w:tcPr>
-            <w:tcW w:w="1559" w:type="dxa"/>
-          </w:tcPr>
-          <w:p>
-            <w:pPr>
-              <w:cnfStyle w:val="000000000000" w:firstRow="0" w:lastRow="0" w:firstColumn="0" w:lastColumn="0" w:oddVBand="0" w:evenVBand="0" w:oddHBand="0" w:evenHBand="0" w:firstRowFirstColumn="0" w:firstRowLastColumn="0" w:lastRowFirstColumn="0" w:lastRowLastColumn="0"/>
-            </w:pPr>
-            <w:r>
-              <w:t>10.27</w:t>
-            </w:r>
-          </w:p>
-        </w:tc>
-        <w:tc>
-          <w:tcPr>
-            <w:tcW w:w="1559" w:type="dxa"/>
-          </w:tcPr>
-          <w:p>
-            <w:pPr>
-              <w:cnfStyle w:val="000000000000" w:firstRow="0" w:lastRow="0" w:firstColumn="0" w:lastColumn="0" w:oddVBand="0" w:evenVBand="0" w:oddHBand="0" w:evenHBand="0" w:firstRowFirstColumn="0" w:firstRowLastColumn="0" w:lastRowFirstColumn="0" w:lastRowLastColumn="0"/>
-            </w:pPr>
-            <w:r>
-              <w:t>6.76</w:t>
-            </w:r>
-          </w:p>
-        </w:tc>
-      </w:tr>
-      <w:tr>
-        <w:tc>
-          <w:tcPr>
-            <w:cnfStyle w:val="001000000000" w:firstRow="0" w:lastRow="0" w:firstColumn="1" w:lastColumn="0" w:oddVBand="0" w:evenVBand="0" w:oddHBand="0" w:evenHBand="0" w:firstRowFirstColumn="0" w:firstRowLastColumn="0" w:lastRowFirstColumn="0" w:lastRowLastColumn="0"/>
-            <w:tcW w:w="1984" w:type="dxa"/>
-          </w:tcPr>
-          <w:p>
-            <w:r>
-              <w:t>Alternatives</w:t>
-            </w:r>
-          </w:p>
-        </w:tc>
-        <w:tc>
-          <w:tcPr>
-            <w:tcW w:w="1559" w:type="dxa"/>
-          </w:tcPr>
-          <w:p>
-            <w:pPr>
-              <w:cnfStyle w:val="000000000000" w:firstRow="0" w:lastRow="0" w:firstColumn="0" w:lastColumn="0" w:oddVBand="0" w:evenVBand="0" w:oddHBand="0" w:evenHBand="0" w:firstRowFirstColumn="0" w:firstRowLastColumn="0" w:lastRowFirstColumn="0" w:lastRowLastColumn="0"/>
-            </w:pPr>
-            <w:r>
-              <w:t>9.8</w:t>
-            </w:r>
-          </w:p>
-        </w:tc>
-        <w:tc>
-          <w:tcPr>
-            <w:tcW w:w="1559" w:type="dxa"/>
-          </w:tcPr>
-          <w:p>
-            <w:pPr>
-              <w:cnfStyle w:val="000000000000" w:firstRow="0" w:lastRow="0" w:firstColumn="0" w:lastColumn="0" w:oddVBand="0" w:evenVBand="0" w:oddHBand="0" w:evenHBand="0" w:firstRowFirstColumn="0" w:firstRowLastColumn="0" w:lastRowFirstColumn="0" w:lastRowLastColumn="0"/>
-            </w:pPr>
-            <w:r>
-              <w:t>8.16</w:t>
-            </w:r>
-          </w:p>
-        </w:tc>
-      </w:tr>
-      <w:tr>
-        <w:tc>
-          <w:tcPr>
-            <w:cnfStyle w:val="001000000000" w:firstRow="0" w:lastRow="0" w:firstColumn="1" w:lastColumn="0" w:oddVBand="0" w:evenVBand="0" w:oddHBand="0" w:evenHBand="0" w:firstRowFirstColumn="0" w:firstRowLastColumn="0" w:lastRowFirstColumn="0" w:lastRowLastColumn="0"/>
-            <w:tcW w:w="1984" w:type="dxa"/>
-          </w:tcPr>
-          <w:p>
-            <w:r>
-              <w:t>Long Duration</w:t>
-            </w:r>
-          </w:p>
-        </w:tc>
-        <w:tc>
-          <w:tcPr>
-            <w:tcW w:w="1559" w:type="dxa"/>
-          </w:tcPr>
-          <w:p>
-            <w:pPr>
-              <w:cnfStyle w:val="000000000000" w:firstRow="0" w:lastRow="0" w:firstColumn="0" w:lastColumn="0" w:oddVBand="0" w:evenVBand="0" w:oddHBand="0" w:evenHBand="0" w:firstRowFirstColumn="0" w:firstRowLastColumn="0" w:lastRowFirstColumn="0" w:lastRowLastColumn="0"/>
-            </w:pPr>
-            <w:r>
-              <w:t>6.15</w:t>
-            </w:r>
-          </w:p>
-        </w:tc>
-        <w:tc>
-          <w:tcPr>
-            <w:tcW w:w="1559" w:type="dxa"/>
-          </w:tcPr>
-          <w:p>
-            <w:pPr>
-              <w:cnfStyle w:val="000000000000" w:firstRow="0" w:lastRow="0" w:firstColumn="0" w:lastColumn="0" w:oddVBand="0" w:evenVBand="0" w:oddHBand="0" w:evenHBand="0" w:firstRowFirstColumn="0" w:firstRowLastColumn="0" w:lastRowFirstColumn="0" w:lastRowLastColumn="0"/>
-            </w:pPr>
-            <w:r>
-              <w:t>2.79</w:t>
-            </w:r>
-          </w:p>
-        </w:tc>
-      </w:tr>
-      <w:tr>
-        <w:tc>
-          <w:tcPr>
-            <w:cnfStyle w:val="001000000000" w:firstRow="0" w:lastRow="0" w:firstColumn="1" w:lastColumn="0" w:oddVBand="0" w:evenVBand="0" w:oddHBand="0" w:evenHBand="0" w:firstRowFirstColumn="0" w:firstRowLastColumn="0" w:lastRowFirstColumn="0" w:lastRowLastColumn="0"/>
-            <w:tcW w:w="1984" w:type="dxa"/>
-          </w:tcPr>
-          <w:p>
-            <w:r>
-              <w:t>Floating Rate</w:t>
-            </w:r>
-          </w:p>
-        </w:tc>
-        <w:tc>
-          <w:tcPr>
-            <w:tcW w:w="1559" w:type="dxa"/>
-          </w:tcPr>
-          <w:p>
-            <w:pPr>
-              <w:cnfStyle w:val="000000000000" w:firstRow="0" w:lastRow="0" w:firstColumn="0" w:lastColumn="0" w:oddVBand="0" w:evenVBand="0" w:oddHBand="0" w:evenHBand="0" w:firstRowFirstColumn="0" w:firstRowLastColumn="0" w:lastRowFirstColumn="0" w:lastRowLastColumn="0"/>
-            </w:pPr>
-            <w:r>
-              <w:t>6.02</w:t>
-            </w:r>
-          </w:p>
-        </w:tc>
-        <w:tc>
-          <w:tcPr>
-            <w:tcW w:w="1559" w:type="dxa"/>
-          </w:tcPr>
-          <w:p>
-            <w:pPr>
-              <w:cnfStyle w:val="000000000000" w:firstRow="0" w:lastRow="0" w:firstColumn="0" w:lastColumn="0" w:oddVBand="0" w:evenVBand="0" w:oddHBand="0" w:evenHBand="0" w:firstRowFirstColumn="0" w:firstRowLastColumn="0" w:lastRowFirstColumn="0" w:lastRowLastColumn="0"/>
-            </w:pPr>
-            <w:r>
-              <w:t>5.75</w:t>
-            </w:r>
-          </w:p>
-        </w:tc>
-      </w:tr>
-      <w:tr>
-        <w:tc>
-          <w:tcPr>
-            <w:cnfStyle w:val="001000000000" w:firstRow="0" w:lastRow="0" w:firstColumn="1" w:lastColumn="0" w:oddVBand="0" w:evenVBand="0" w:oddHBand="0" w:evenHBand="0" w:firstRowFirstColumn="0" w:firstRowLastColumn="0" w:lastRowFirstColumn="0" w:lastRowLastColumn="0"/>
-            <w:tcW w:w="1984" w:type="dxa"/>
-          </w:tcPr>
-          <w:p>
-            <w:r>
-              <w:t>Cash</w:t>
-            </w:r>
-          </w:p>
-        </w:tc>
-        <w:tc>
-          <w:tcPr>
-            <w:tcW w:w="1559" w:type="dxa"/>
-          </w:tcPr>
-          <w:p>
-            <w:pPr>
-              <w:cnfStyle w:val="000000000000" w:firstRow="0" w:lastRow="0" w:firstColumn="0" w:lastColumn="0" w:oddVBand="0" w:evenVBand="0" w:oddHBand="0" w:evenHBand="0" w:firstRowFirstColumn="0" w:firstRowLastColumn="0" w:lastRowFirstColumn="0" w:lastRowLastColumn="0"/>
-            </w:pPr>
-            <w:r>
-              <w:t>4.58</w:t>
-            </w:r>
-          </w:p>
-        </w:tc>
-        <w:tc>
-          <w:tcPr>
-            <w:tcW w:w="1559" w:type="dxa"/>
-          </w:tcPr>
-          <w:p>
-            <w:pPr>
-              <w:cnfStyle w:val="000000000000" w:firstRow="0" w:lastRow="0" w:firstColumn="0" w:lastColumn="0" w:oddVBand="0" w:evenVBand="0" w:oddHBand="0" w:evenHBand="0" w:firstRowFirstColumn="0" w:firstRowLastColumn="0" w:lastRowFirstColumn="0" w:lastRowLastColumn="0"/>
-            </w:pPr>
-            <w:r>
-              <w:t>4.48</w:t>
-            </w:r>
-          </w:p>
-        </w:tc>
-      </w:tr>
-    </w:tbl>
-    <w:p>
-      <w:pPr>
-        <w:pStyle w:val="Note"/>
-      </w:pPr>
-      <w:r>
-        <w:t>Inception Date: 31 December 2022</w:t>
-      </w:r>
-    </w:p>
-    <w:p>
-      <w:pPr>
-        <w:pStyle w:val="Heading30"/>
-      </w:pPr>
-      <w:r>
-        <w:t>Portfolio Construction</w:t>
+        <w:t>Cumulative Performance Since Inception</w:t>
       </w:r>
     </w:p>
     <w:p>
       <w:r>
-        <w:rPr>
-          <w:noProof/>
-        </w:rPr>
         <w:drawing>
-          <wp:inline distT="0" distB="0" distL="0" distR="0" wp14:anchorId="16BD1BD8" wp14:editId="6FE1F77F">
-            <wp:extent cx="3240000" cy="3240000"/>
-            <wp:effectExtent l="0" t="0" r="0" b="0"/>
-            <wp:docPr id="1133580018" name="Picture 1133580018"/>
+          <wp:inline xmlns:a="http://schemas.openxmlformats.org/drawingml/2006/main" xmlns:pic="http://schemas.openxmlformats.org/drawingml/2006/picture">
+            <wp:extent cx="3240000" cy="2160000"/>
+            <wp:docPr id="2" name="Picture 2"/>
             <wp:cNvGraphicFramePr>
-              <a:graphicFrameLocks xmlns:a="http://schemas.openxmlformats.org/drawingml/2006/main" noChangeAspect="1"/>
+              <a:graphicFrameLocks noChangeAspect="1"/>
             </wp:cNvGraphicFramePr>
-            <a:graphic xmlns:a="http://schemas.openxmlformats.org/drawingml/2006/main">
+            <a:graphic>
               <a:graphicData uri="http://schemas.openxmlformats.org/drawingml/2006/picture">
-                <pic:pic xmlns:pic="http://schemas.openxmlformats.org/drawingml/2006/picture">
+                <pic:pic>
                   <pic:nvPicPr>
-                    <pic:cNvPr id="0" name="3_Alloc_Mgr_Level_5.png"/>
+                    <pic:cNvPr id="0" name="1_Performance-Cum_v2.png"/>
                     <pic:cNvPicPr/>
                   </pic:nvPicPr>
                   <pic:blipFill>
@@ -1714,11 +1071,9 @@
                   <pic:spPr>
                     <a:xfrm>
                       <a:off x="0" y="0"/>
-                      <a:ext cx="3240000" cy="3240000"/>
+                      <a:ext cx="3240000" cy="2160000"/>
                     </a:xfrm>
-                    <a:prstGeom prst="rect">
-                      <a:avLst/>
-                    </a:prstGeom>
+                    <a:prstGeom prst="rect"/>
                   </pic:spPr>
                 </pic:pic>
               </a:graphicData>
@@ -1732,27 +1087,23 @@
         <w:pStyle w:val="Heading30"/>
       </w:pPr>
       <w:r>
-        <w:t>Correlations</w:t>
+        <w:t>Portfolio Allocations</w:t>
       </w:r>
     </w:p>
     <w:p>
       <w:r>
-        <w:rPr>
-          <w:noProof/>
-        </w:rPr>
         <w:drawing>
-          <wp:inline distT="0" distB="0" distL="0" distR="0" wp14:anchorId="4AE0AEA9" wp14:editId="2899560C">
-            <wp:extent cx="3240000" cy="2700000"/>
-            <wp:effectExtent l="0" t="0" r="0" b="0"/>
-            <wp:docPr id="5" name="Picture 5"/>
+          <wp:inline xmlns:a="http://schemas.openxmlformats.org/drawingml/2006/main" xmlns:pic="http://schemas.openxmlformats.org/drawingml/2006/picture">
+            <wp:extent cx="3240000" cy="1800000"/>
+            <wp:docPr id="3" name="Picture 3"/>
             <wp:cNvGraphicFramePr>
-              <a:graphicFrameLocks xmlns:a="http://schemas.openxmlformats.org/drawingml/2006/main" noChangeAspect="1"/>
+              <a:graphicFrameLocks noChangeAspect="1"/>
             </wp:cNvGraphicFramePr>
-            <a:graphic xmlns:a="http://schemas.openxmlformats.org/drawingml/2006/main">
+            <a:graphic>
               <a:graphicData uri="http://schemas.openxmlformats.org/drawingml/2006/picture">
-                <pic:pic xmlns:pic="http://schemas.openxmlformats.org/drawingml/2006/picture">
+                <pic:pic>
                   <pic:nvPicPr>
-                    <pic:cNvPr id="0" name="6_Sleeve_MonthlyCorrel.png"/>
+                    <pic:cNvPr id="0" name="3_Alloc_Ranges.png"/>
                     <pic:cNvPicPr/>
                   </pic:nvPicPr>
                   <pic:blipFill>
@@ -1764,11 +1115,9 @@
                   <pic:spPr>
                     <a:xfrm>
                       <a:off x="0" y="0"/>
-                      <a:ext cx="3240000" cy="2700000"/>
+                      <a:ext cx="3240000" cy="1800000"/>
                     </a:xfrm>
-                    <a:prstGeom prst="rect">
-                      <a:avLst/>
-                    </a:prstGeom>
+                    <a:prstGeom prst="rect"/>
                   </pic:spPr>
                 </pic:pic>
               </a:graphicData>
@@ -1777,35 +1126,322 @@
         </w:drawing>
       </w:r>
     </w:p>
+    <w:br w:type="column"/>
     <w:p>
       <w:pPr>
         <w:pStyle w:val="Heading30"/>
       </w:pPr>
       <w:r>
-        <w:br w:type="column"/>
+        <w:t>Asset Class Performance</w:t>
       </w:r>
+    </w:p>
+    <w:tbl>
+      <w:tblPr>
+        <w:tblStyle w:val="AtchisonTable1"/>
+        <w:tblW w:type="auto" w:w="0"/>
+        <w:tblLook w:firstColumn="1" w:firstRow="1" w:lastColumn="0" w:lastRow="0" w:noHBand="0" w:noVBand="1" w:val="04A0"/>
+      </w:tblPr>
+      <w:tblGrid>
+        <w:gridCol w:w="3685"/>
+        <w:gridCol w:w="3685"/>
+        <w:gridCol w:w="3685"/>
+      </w:tblGrid>
+      <w:tr>
+        <w:tc>
+          <w:tcPr>
+            <w:tcW w:type="dxa" w:w="1984"/>
+          </w:tcPr>
+          <w:p>
+            <w:r>
+              <w:rPr>
+                <w:b/>
+              </w:rPr>
+              <w:t>Period</w:t>
+            </w:r>
+          </w:p>
+        </w:tc>
+        <w:tc>
+          <w:tcPr>
+            <w:tcW w:type="dxa" w:w="1559"/>
+          </w:tcPr>
+          <w:p>
+            <w:r>
+              <w:rPr>
+                <w:b/>
+              </w:rPr>
+              <w:t>1 Year</w:t>
+            </w:r>
+          </w:p>
+        </w:tc>
+        <w:tc>
+          <w:tcPr>
+            <w:tcW w:type="dxa" w:w="1559"/>
+          </w:tcPr>
+          <w:p>
+            <w:r>
+              <w:rPr>
+                <w:b/>
+              </w:rPr>
+              <w:t>2 Years (p.a.)</w:t>
+            </w:r>
+          </w:p>
+        </w:tc>
+      </w:tr>
+      <w:tr>
+        <w:tc>
+          <w:tcPr>
+            <w:tcW w:type="dxa" w:w="1984"/>
+          </w:tcPr>
+          <w:p>
+            <w:r>
+              <w:t>Australian Shares</w:t>
+            </w:r>
+          </w:p>
+        </w:tc>
+        <w:tc>
+          <w:tcPr>
+            <w:tcW w:type="dxa" w:w="1559"/>
+          </w:tcPr>
+          <w:p>
+            <w:r>
+              <w:t>6.5</w:t>
+            </w:r>
+          </w:p>
+        </w:tc>
+        <w:tc>
+          <w:tcPr>
+            <w:tcW w:type="dxa" w:w="1559"/>
+          </w:tcPr>
+          <w:p>
+            <w:r>
+              <w:t>7.53</w:t>
+            </w:r>
+          </w:p>
+        </w:tc>
+      </w:tr>
+      <w:tr>
+        <w:tc>
+          <w:tcPr>
+            <w:tcW w:type="dxa" w:w="1984"/>
+          </w:tcPr>
+          <w:p>
+            <w:r>
+              <w:t>International Shares</w:t>
+            </w:r>
+          </w:p>
+        </w:tc>
+        <w:tc>
+          <w:tcPr>
+            <w:tcW w:type="dxa" w:w="1559"/>
+          </w:tcPr>
+          <w:p>
+            <w:r>
+              <w:t>8.78</w:t>
+            </w:r>
+          </w:p>
+        </w:tc>
+        <w:tc>
+          <w:tcPr>
+            <w:tcW w:type="dxa" w:w="1559"/>
+          </w:tcPr>
+          <w:p>
+            <w:r>
+              <w:t>15.09</w:t>
+            </w:r>
+          </w:p>
+        </w:tc>
+      </w:tr>
+      <w:tr>
+        <w:tc>
+          <w:tcPr>
+            <w:tcW w:type="dxa" w:w="1984"/>
+          </w:tcPr>
+          <w:p>
+            <w:r>
+              <w:t>Real Assets</w:t>
+            </w:r>
+          </w:p>
+        </w:tc>
+        <w:tc>
+          <w:tcPr>
+            <w:tcW w:type="dxa" w:w="1559"/>
+          </w:tcPr>
+          <w:p>
+            <w:r>
+              <w:t>10.27</w:t>
+            </w:r>
+          </w:p>
+        </w:tc>
+        <w:tc>
+          <w:tcPr>
+            <w:tcW w:type="dxa" w:w="1559"/>
+          </w:tcPr>
+          <w:p>
+            <w:r>
+              <w:t>6.76</w:t>
+            </w:r>
+          </w:p>
+        </w:tc>
+      </w:tr>
+      <w:tr>
+        <w:tc>
+          <w:tcPr>
+            <w:tcW w:type="dxa" w:w="1984"/>
+          </w:tcPr>
+          <w:p>
+            <w:r>
+              <w:t>Alternatives</w:t>
+            </w:r>
+          </w:p>
+        </w:tc>
+        <w:tc>
+          <w:tcPr>
+            <w:tcW w:type="dxa" w:w="1559"/>
+          </w:tcPr>
+          <w:p>
+            <w:r>
+              <w:t>9.8</w:t>
+            </w:r>
+          </w:p>
+        </w:tc>
+        <w:tc>
+          <w:tcPr>
+            <w:tcW w:type="dxa" w:w="1559"/>
+          </w:tcPr>
+          <w:p>
+            <w:r>
+              <w:t>8.16</w:t>
+            </w:r>
+          </w:p>
+        </w:tc>
+      </w:tr>
+      <w:tr>
+        <w:tc>
+          <w:tcPr>
+            <w:tcW w:type="dxa" w:w="1984"/>
+          </w:tcPr>
+          <w:p>
+            <w:r>
+              <w:t>Long Duration</w:t>
+            </w:r>
+          </w:p>
+        </w:tc>
+        <w:tc>
+          <w:tcPr>
+            <w:tcW w:type="dxa" w:w="1559"/>
+          </w:tcPr>
+          <w:p>
+            <w:r>
+              <w:t>6.15</w:t>
+            </w:r>
+          </w:p>
+        </w:tc>
+        <w:tc>
+          <w:tcPr>
+            <w:tcW w:type="dxa" w:w="1559"/>
+          </w:tcPr>
+          <w:p>
+            <w:r>
+              <w:t>2.79</w:t>
+            </w:r>
+          </w:p>
+        </w:tc>
+      </w:tr>
+      <w:tr>
+        <w:tc>
+          <w:tcPr>
+            <w:tcW w:type="dxa" w:w="1984"/>
+          </w:tcPr>
+          <w:p>
+            <w:r>
+              <w:t>Floating Rate</w:t>
+            </w:r>
+          </w:p>
+        </w:tc>
+        <w:tc>
+          <w:tcPr>
+            <w:tcW w:type="dxa" w:w="1559"/>
+          </w:tcPr>
+          <w:p>
+            <w:r>
+              <w:t>6.02</w:t>
+            </w:r>
+          </w:p>
+        </w:tc>
+        <w:tc>
+          <w:tcPr>
+            <w:tcW w:type="dxa" w:w="1559"/>
+          </w:tcPr>
+          <w:p>
+            <w:r>
+              <w:t>5.75</w:t>
+            </w:r>
+          </w:p>
+        </w:tc>
+      </w:tr>
+      <w:tr>
+        <w:tc>
+          <w:tcPr>
+            <w:tcW w:type="dxa" w:w="1984"/>
+          </w:tcPr>
+          <w:p>
+            <w:r>
+              <w:t>Cash</w:t>
+            </w:r>
+          </w:p>
+        </w:tc>
+        <w:tc>
+          <w:tcPr>
+            <w:tcW w:type="dxa" w:w="1559"/>
+          </w:tcPr>
+          <w:p>
+            <w:r>
+              <w:t>4.58</w:t>
+            </w:r>
+          </w:p>
+        </w:tc>
+        <w:tc>
+          <w:tcPr>
+            <w:tcW w:type="dxa" w:w="1559"/>
+          </w:tcPr>
+          <w:p>
+            <w:r>
+              <w:t>4.48</w:t>
+            </w:r>
+          </w:p>
+        </w:tc>
+      </w:tr>
+    </w:tbl>
+    <w:p>
+      <w:pPr>
+        <w:pStyle w:val="Note"/>
+      </w:pPr>
       <w:r>
-        <w:t>Historical Allocation Changes</w:t>
+        <w:t>Inception Date: 31 December 2022</w:t>
+      </w:r>
+    </w:p>
+    <w:p>
+      <w:pPr>
+        <w:pStyle w:val="Heading30"/>
+      </w:pPr>
+      <w:r>
+        <w:t>Portfolio Construction</w:t>
       </w:r>
     </w:p>
     <w:p>
       <w:r>
-        <w:rPr>
-          <w:noProof/>
-        </w:rPr>
         <w:drawing>
-          <wp:inline distT="0" distB="0" distL="0" distR="0" wp14:anchorId="1D86DD3C" wp14:editId="59E1F63A">
-            <wp:extent cx="3240000" cy="2880000"/>
-            <wp:effectExtent l="0" t="0" r="0" b="0"/>
-            <wp:docPr id="6" name="Picture 6"/>
+          <wp:inline xmlns:a="http://schemas.openxmlformats.org/drawingml/2006/main" xmlns:pic="http://schemas.openxmlformats.org/drawingml/2006/picture">
+            <wp:extent cx="3240000" cy="3240000"/>
+            <wp:docPr id="4" name="Picture 4"/>
             <wp:cNvGraphicFramePr>
-              <a:graphicFrameLocks xmlns:a="http://schemas.openxmlformats.org/drawingml/2006/main" noChangeAspect="1"/>
+              <a:graphicFrameLocks noChangeAspect="1"/>
             </wp:cNvGraphicFramePr>
-            <a:graphic xmlns:a="http://schemas.openxmlformats.org/drawingml/2006/main">
+            <a:graphic>
               <a:graphicData uri="http://schemas.openxmlformats.org/drawingml/2006/picture">
-                <pic:pic xmlns:pic="http://schemas.openxmlformats.org/drawingml/2006/picture">
+                <pic:pic>
                   <pic:nvPicPr>
-                    <pic:cNvPr id="0" name="3_Allocation_FloatHistory.png"/>
+                    <pic:cNvPr id="0" name="3_Alloc_Mgr_Level_5.png"/>
                     <pic:cNvPicPr/>
                   </pic:nvPicPr>
                   <pic:blipFill>
@@ -1817,11 +1453,9 @@
                   <pic:spPr>
                     <a:xfrm>
                       <a:off x="0" y="0"/>
-                      <a:ext cx="3240000" cy="2880000"/>
+                      <a:ext cx="3240000" cy="3240000"/>
                     </a:xfrm>
-                    <a:prstGeom prst="rect">
-                      <a:avLst/>
-                    </a:prstGeom>
+                    <a:prstGeom prst="rect"/>
                   </pic:spPr>
                 </pic:pic>
               </a:graphicData>
@@ -1835,57 +1469,145 @@
         <w:pStyle w:val="Heading30"/>
       </w:pPr>
       <w:r>
+        <w:t>Correlations</w:t>
+      </w:r>
+    </w:p>
+    <w:p>
+      <w:r>
+        <w:drawing>
+          <wp:inline xmlns:a="http://schemas.openxmlformats.org/drawingml/2006/main" xmlns:pic="http://schemas.openxmlformats.org/drawingml/2006/picture">
+            <wp:extent cx="3240000" cy="2700000"/>
+            <wp:docPr id="5" name="Picture 5"/>
+            <wp:cNvGraphicFramePr>
+              <a:graphicFrameLocks noChangeAspect="1"/>
+            </wp:cNvGraphicFramePr>
+            <a:graphic>
+              <a:graphicData uri="http://schemas.openxmlformats.org/drawingml/2006/picture">
+                <pic:pic>
+                  <pic:nvPicPr>
+                    <pic:cNvPr id="0" name="6_Sleeve_MonthlyCorrel.png"/>
+                    <pic:cNvPicPr/>
+                  </pic:nvPicPr>
+                  <pic:blipFill>
+                    <a:blip r:embed="rId23"/>
+                    <a:stretch>
+                      <a:fillRect/>
+                    </a:stretch>
+                  </pic:blipFill>
+                  <pic:spPr>
+                    <a:xfrm>
+                      <a:off x="0" y="0"/>
+                      <a:ext cx="3240000" cy="2700000"/>
+                    </a:xfrm>
+                    <a:prstGeom prst="rect"/>
+                  </pic:spPr>
+                </pic:pic>
+              </a:graphicData>
+            </a:graphic>
+          </wp:inline>
+        </w:drawing>
+      </w:r>
+    </w:p>
+    <w:br w:type="column"/>
+    <w:p>
+      <w:pPr>
+        <w:pStyle w:val="Heading30"/>
+      </w:pPr>
+      <w:r>
+        <w:t>Historical Allocation Changes</w:t>
+      </w:r>
+    </w:p>
+    <w:p>
+      <w:r>
+        <w:drawing>
+          <wp:inline xmlns:a="http://schemas.openxmlformats.org/drawingml/2006/main" xmlns:pic="http://schemas.openxmlformats.org/drawingml/2006/picture">
+            <wp:extent cx="3240000" cy="2880000"/>
+            <wp:docPr id="6" name="Picture 6"/>
+            <wp:cNvGraphicFramePr>
+              <a:graphicFrameLocks noChangeAspect="1"/>
+            </wp:cNvGraphicFramePr>
+            <a:graphic>
+              <a:graphicData uri="http://schemas.openxmlformats.org/drawingml/2006/picture">
+                <pic:pic>
+                  <pic:nvPicPr>
+                    <pic:cNvPr id="0" name="3_Allocation_FloatHistory.png"/>
+                    <pic:cNvPicPr/>
+                  </pic:nvPicPr>
+                  <pic:blipFill>
+                    <a:blip r:embed="rId24"/>
+                    <a:stretch>
+                      <a:fillRect/>
+                    </a:stretch>
+                  </pic:blipFill>
+                  <pic:spPr>
+                    <a:xfrm>
+                      <a:off x="0" y="0"/>
+                      <a:ext cx="3240000" cy="2880000"/>
+                    </a:xfrm>
+                    <a:prstGeom prst="rect"/>
+                  </pic:spPr>
+                </pic:pic>
+              </a:graphicData>
+            </a:graphic>
+          </wp:inline>
+        </w:drawing>
+      </w:r>
+    </w:p>
+    <w:p>
+      <w:pPr>
+        <w:pStyle w:val="Heading30"/>
+      </w:pPr>
+      <w:r>
         <w:t>Underlying Current Manager Performance</w:t>
       </w:r>
     </w:p>
     <w:tbl>
       <w:tblPr>
         <w:tblStyle w:val="AtchisonTable1"/>
-        <w:tblW w:w="0" w:type="auto"/>
-        <w:tblLook w:val="04A0" w:firstRow="1" w:lastRow="0" w:firstColumn="1" w:lastColumn="0" w:noHBand="0" w:noVBand="1"/>
+        <w:tblW w:type="auto" w:w="0"/>
+        <w:tblLook w:firstColumn="1" w:firstRow="1" w:lastColumn="0" w:lastRow="0" w:noHBand="0" w:noVBand="1" w:val="04A0"/>
       </w:tblPr>
       <w:tblGrid>
-        <w:gridCol w:w="2268"/>
-        <w:gridCol w:w="1417"/>
-        <w:gridCol w:w="1417"/>
+        <w:gridCol w:w="3685"/>
+        <w:gridCol w:w="3685"/>
+        <w:gridCol w:w="3685"/>
       </w:tblGrid>
       <w:tr>
-        <w:trPr>
-          <w:cnfStyle w:val="100000000000" w:firstRow="1" w:lastRow="0" w:firstColumn="0" w:lastColumn="0" w:oddVBand="0" w:evenVBand="0" w:oddHBand="0" w:evenHBand="0" w:firstRowFirstColumn="0" w:firstRowLastColumn="0" w:lastRowFirstColumn="0" w:lastRowLastColumn="0"/>
-        </w:trPr>
-        <w:tc>
-          <w:tcPr>
-            <w:cnfStyle w:val="001000000000" w:firstRow="0" w:lastRow="0" w:firstColumn="1" w:lastColumn="0" w:oddVBand="0" w:evenVBand="0" w:oddHBand="0" w:evenHBand="0" w:firstRowFirstColumn="0" w:firstRowLastColumn="0" w:lastRowFirstColumn="0" w:lastRowLastColumn="0"/>
-            <w:tcW w:w="2268" w:type="dxa"/>
-          </w:tcPr>
-          <w:p>
-            <w:r>
+        <w:tc>
+          <w:tcPr>
+            <w:tcW w:type="dxa" w:w="2268"/>
+          </w:tcPr>
+          <w:p>
+            <w:r>
+              <w:rPr>
+                <w:b/>
+              </w:rPr>
               <w:t>Strategy</w:t>
             </w:r>
           </w:p>
         </w:tc>
         <w:tc>
           <w:tcPr>
-            <w:tcW w:w="1417" w:type="dxa"/>
-          </w:tcPr>
-          <w:p>
-            <w:pPr>
-              <w:cnfStyle w:val="100000000000" w:firstRow="1" w:lastRow="0" w:firstColumn="0" w:lastColumn="0" w:oddVBand="0" w:evenVBand="0" w:oddHBand="0" w:evenHBand="0" w:firstRowFirstColumn="0" w:firstRowLastColumn="0" w:lastRowFirstColumn="0" w:lastRowLastColumn="0"/>
-            </w:pPr>
-            <w:r>
+            <w:tcW w:type="dxa" w:w="1417"/>
+          </w:tcPr>
+          <w:p>
+            <w:r>
+              <w:rPr>
+                <w:b/>
+              </w:rPr>
               <w:t>1 Year</w:t>
             </w:r>
           </w:p>
         </w:tc>
         <w:tc>
           <w:tcPr>
-            <w:tcW w:w="1417" w:type="dxa"/>
-          </w:tcPr>
-          <w:p>
-            <w:pPr>
-              <w:cnfStyle w:val="100000000000" w:firstRow="1" w:lastRow="0" w:firstColumn="0" w:lastColumn="0" w:oddVBand="0" w:evenVBand="0" w:oddHBand="0" w:evenHBand="0" w:firstRowFirstColumn="0" w:firstRowLastColumn="0" w:lastRowFirstColumn="0" w:lastRowLastColumn="0"/>
-            </w:pPr>
-            <w:r>
+            <w:tcW w:type="dxa" w:w="1417"/>
+          </w:tcPr>
+          <w:p>
+            <w:r>
+              <w:rPr>
+                <w:b/>
+              </w:rPr>
               <w:t>2 Years (p.a.)</w:t>
             </w:r>
           </w:p>
@@ -1894,8 +1616,7 @@
       <w:tr>
         <w:tc>
           <w:tcPr>
-            <w:cnfStyle w:val="001000000000" w:firstRow="0" w:lastRow="0" w:firstColumn="1" w:lastColumn="0" w:oddVBand="0" w:evenVBand="0" w:oddHBand="0" w:evenHBand="0" w:firstRowFirstColumn="0" w:firstRowLastColumn="0" w:lastRowFirstColumn="0" w:lastRowLastColumn="0"/>
-            <w:tcW w:w="2268" w:type="dxa"/>
+            <w:tcW w:type="dxa" w:w="2268"/>
           </w:tcPr>
           <w:p>
             <w:r>
@@ -1905,12 +1626,9 @@
         </w:tc>
         <w:tc>
           <w:tcPr>
-            <w:tcW w:w="1417" w:type="dxa"/>
-          </w:tcPr>
-          <w:p>
-            <w:pPr>
-              <w:cnfStyle w:val="000000000000" w:firstRow="0" w:lastRow="0" w:firstColumn="0" w:lastColumn="0" w:oddVBand="0" w:evenVBand="0" w:oddHBand="0" w:evenHBand="0" w:firstRowFirstColumn="0" w:firstRowLastColumn="0" w:lastRowFirstColumn="0" w:lastRowLastColumn="0"/>
-            </w:pPr>
+            <w:tcW w:type="dxa" w:w="1417"/>
+          </w:tcPr>
+          <w:p>
             <w:r>
               <w:t>9.67</w:t>
             </w:r>
@@ -1918,12 +1636,9 @@
         </w:tc>
         <w:tc>
           <w:tcPr>
-            <w:tcW w:w="1417" w:type="dxa"/>
-          </w:tcPr>
-          <w:p>
-            <w:pPr>
-              <w:cnfStyle w:val="000000000000" w:firstRow="0" w:lastRow="0" w:firstColumn="0" w:lastColumn="0" w:oddVBand="0" w:evenVBand="0" w:oddHBand="0" w:evenHBand="0" w:firstRowFirstColumn="0" w:firstRowLastColumn="0" w:lastRowFirstColumn="0" w:lastRowLastColumn="0"/>
-            </w:pPr>
+            <w:tcW w:type="dxa" w:w="1417"/>
+          </w:tcPr>
+          <w:p>
             <w:r>
               <w:t>9.3</w:t>
             </w:r>
@@ -1933,8 +1648,7 @@
       <w:tr>
         <w:tc>
           <w:tcPr>
-            <w:cnfStyle w:val="001000000000" w:firstRow="0" w:lastRow="0" w:firstColumn="1" w:lastColumn="0" w:oddVBand="0" w:evenVBand="0" w:oddHBand="0" w:evenHBand="0" w:firstRowFirstColumn="0" w:firstRowLastColumn="0" w:lastRowFirstColumn="0" w:lastRowLastColumn="0"/>
-            <w:tcW w:w="2268" w:type="dxa"/>
+            <w:tcW w:type="dxa" w:w="2268"/>
           </w:tcPr>
           <w:p>
             <w:r>
@@ -1944,12 +1658,9 @@
         </w:tc>
         <w:tc>
           <w:tcPr>
-            <w:tcW w:w="1417" w:type="dxa"/>
-          </w:tcPr>
-          <w:p>
-            <w:pPr>
-              <w:cnfStyle w:val="000000000000" w:firstRow="0" w:lastRow="0" w:firstColumn="0" w:lastColumn="0" w:oddVBand="0" w:evenVBand="0" w:oddHBand="0" w:evenHBand="0" w:firstRowFirstColumn="0" w:firstRowLastColumn="0" w:lastRowFirstColumn="0" w:lastRowLastColumn="0"/>
-            </w:pPr>
+            <w:tcW w:type="dxa" w:w="1417"/>
+          </w:tcPr>
+          <w:p>
             <w:r>
               <w:t>6.28</w:t>
             </w:r>
@@ -1957,12 +1668,9 @@
         </w:tc>
         <w:tc>
           <w:tcPr>
-            <w:tcW w:w="1417" w:type="dxa"/>
-          </w:tcPr>
-          <w:p>
-            <w:pPr>
-              <w:cnfStyle w:val="000000000000" w:firstRow="0" w:lastRow="0" w:firstColumn="0" w:lastColumn="0" w:oddVBand="0" w:evenVBand="0" w:oddHBand="0" w:evenHBand="0" w:firstRowFirstColumn="0" w:firstRowLastColumn="0" w:lastRowFirstColumn="0" w:lastRowLastColumn="0"/>
-            </w:pPr>
+            <w:tcW w:type="dxa" w:w="1417"/>
+          </w:tcPr>
+          <w:p>
             <w:r>
               <w:t>9.59</w:t>
             </w:r>
@@ -1972,8 +1680,7 @@
       <w:tr>
         <w:tc>
           <w:tcPr>
-            <w:cnfStyle w:val="001000000000" w:firstRow="0" w:lastRow="0" w:firstColumn="1" w:lastColumn="0" w:oddVBand="0" w:evenVBand="0" w:oddHBand="0" w:evenHBand="0" w:firstRowFirstColumn="0" w:firstRowLastColumn="0" w:lastRowFirstColumn="0" w:lastRowLastColumn="0"/>
-            <w:tcW w:w="2268" w:type="dxa"/>
+            <w:tcW w:type="dxa" w:w="2268"/>
           </w:tcPr>
           <w:p>
             <w:r>
@@ -1983,12 +1690,9 @@
         </w:tc>
         <w:tc>
           <w:tcPr>
-            <w:tcW w:w="1417" w:type="dxa"/>
-          </w:tcPr>
-          <w:p>
-            <w:pPr>
-              <w:cnfStyle w:val="000000000000" w:firstRow="0" w:lastRow="0" w:firstColumn="0" w:lastColumn="0" w:oddVBand="0" w:evenVBand="0" w:oddHBand="0" w:evenHBand="0" w:firstRowFirstColumn="0" w:firstRowLastColumn="0" w:lastRowFirstColumn="0" w:lastRowLastColumn="0"/>
-            </w:pPr>
+            <w:tcW w:type="dxa" w:w="1417"/>
+          </w:tcPr>
+          <w:p>
             <w:r>
               <w:t>18.32</w:t>
             </w:r>
@@ -1996,12 +1700,9 @@
         </w:tc>
         <w:tc>
           <w:tcPr>
-            <w:tcW w:w="1417" w:type="dxa"/>
-          </w:tcPr>
-          <w:p>
-            <w:pPr>
-              <w:cnfStyle w:val="000000000000" w:firstRow="0" w:lastRow="0" w:firstColumn="0" w:lastColumn="0" w:oddVBand="0" w:evenVBand="0" w:oddHBand="0" w:evenHBand="0" w:firstRowFirstColumn="0" w:firstRowLastColumn="0" w:lastRowFirstColumn="0" w:lastRowLastColumn="0"/>
-            </w:pPr>
+            <w:tcW w:type="dxa" w:w="1417"/>
+          </w:tcPr>
+          <w:p>
             <w:r>
               <w:t>18.87</w:t>
             </w:r>
@@ -2011,8 +1712,7 @@
       <w:tr>
         <w:tc>
           <w:tcPr>
-            <w:cnfStyle w:val="001000000000" w:firstRow="0" w:lastRow="0" w:firstColumn="1" w:lastColumn="0" w:oddVBand="0" w:evenVBand="0" w:oddHBand="0" w:evenHBand="0" w:firstRowFirstColumn="0" w:firstRowLastColumn="0" w:lastRowFirstColumn="0" w:lastRowLastColumn="0"/>
-            <w:tcW w:w="2268" w:type="dxa"/>
+            <w:tcW w:type="dxa" w:w="2268"/>
           </w:tcPr>
           <w:p>
             <w:r>
@@ -2022,12 +1722,9 @@
         </w:tc>
         <w:tc>
           <w:tcPr>
-            <w:tcW w:w="1417" w:type="dxa"/>
-          </w:tcPr>
-          <w:p>
-            <w:pPr>
-              <w:cnfStyle w:val="000000000000" w:firstRow="0" w:lastRow="0" w:firstColumn="0" w:lastColumn="0" w:oddVBand="0" w:evenVBand="0" w:oddHBand="0" w:evenHBand="0" w:firstRowFirstColumn="0" w:firstRowLastColumn="0" w:lastRowFirstColumn="0" w:lastRowLastColumn="0"/>
-            </w:pPr>
+            <w:tcW w:type="dxa" w:w="1417"/>
+          </w:tcPr>
+          <w:p>
             <w:r>
               <w:t>5.62</w:t>
             </w:r>
@@ -2035,12 +1732,9 @@
         </w:tc>
         <w:tc>
           <w:tcPr>
-            <w:tcW w:w="1417" w:type="dxa"/>
-          </w:tcPr>
-          <w:p>
-            <w:pPr>
-              <w:cnfStyle w:val="000000000000" w:firstRow="0" w:lastRow="0" w:firstColumn="0" w:lastColumn="0" w:oddVBand="0" w:evenVBand="0" w:oddHBand="0" w:evenHBand="0" w:firstRowFirstColumn="0" w:firstRowLastColumn="0" w:lastRowFirstColumn="0" w:lastRowLastColumn="0"/>
-            </w:pPr>
+            <w:tcW w:type="dxa" w:w="1417"/>
+          </w:tcPr>
+          <w:p>
             <w:r>
               <w:t>8.81</w:t>
             </w:r>
@@ -2050,8 +1744,7 @@
       <w:tr>
         <w:tc>
           <w:tcPr>
-            <w:cnfStyle w:val="001000000000" w:firstRow="0" w:lastRow="0" w:firstColumn="1" w:lastColumn="0" w:oddVBand="0" w:evenVBand="0" w:oddHBand="0" w:evenHBand="0" w:firstRowFirstColumn="0" w:firstRowLastColumn="0" w:lastRowFirstColumn="0" w:lastRowLastColumn="0"/>
-            <w:tcW w:w="2268" w:type="dxa"/>
+            <w:tcW w:type="dxa" w:w="2268"/>
           </w:tcPr>
           <w:p>
             <w:r>
@@ -2061,12 +1754,9 @@
         </w:tc>
         <w:tc>
           <w:tcPr>
-            <w:tcW w:w="1417" w:type="dxa"/>
-          </w:tcPr>
-          <w:p>
-            <w:pPr>
-              <w:cnfStyle w:val="000000000000" w:firstRow="0" w:lastRow="0" w:firstColumn="0" w:lastColumn="0" w:oddVBand="0" w:evenVBand="0" w:oddHBand="0" w:evenHBand="0" w:firstRowFirstColumn="0" w:firstRowLastColumn="0" w:lastRowFirstColumn="0" w:lastRowLastColumn="0"/>
-            </w:pPr>
+            <w:tcW w:type="dxa" w:w="1417"/>
+          </w:tcPr>
+          <w:p>
             <w:r>
               <w:t>6.88</w:t>
             </w:r>
@@ -2074,12 +1764,9 @@
         </w:tc>
         <w:tc>
           <w:tcPr>
-            <w:tcW w:w="1417" w:type="dxa"/>
-          </w:tcPr>
-          <w:p>
-            <w:pPr>
-              <w:cnfStyle w:val="000000000000" w:firstRow="0" w:lastRow="0" w:firstColumn="0" w:lastColumn="0" w:oddVBand="0" w:evenVBand="0" w:oddHBand="0" w:evenHBand="0" w:firstRowFirstColumn="0" w:firstRowLastColumn="0" w:lastRowFirstColumn="0" w:lastRowLastColumn="0"/>
-            </w:pPr>
+            <w:tcW w:type="dxa" w:w="1417"/>
+          </w:tcPr>
+          <w:p>
             <w:r>
               <w:t>9.15</w:t>
             </w:r>
@@ -2089,8 +1776,7 @@
       <w:tr>
         <w:tc>
           <w:tcPr>
-            <w:cnfStyle w:val="001000000000" w:firstRow="0" w:lastRow="0" w:firstColumn="1" w:lastColumn="0" w:oddVBand="0" w:evenVBand="0" w:oddHBand="0" w:evenHBand="0" w:firstRowFirstColumn="0" w:firstRowLastColumn="0" w:lastRowFirstColumn="0" w:lastRowLastColumn="0"/>
-            <w:tcW w:w="2268" w:type="dxa"/>
+            <w:tcW w:type="dxa" w:w="2268"/>
           </w:tcPr>
           <w:p>
             <w:r>
@@ -2100,12 +1786,9 @@
         </w:tc>
         <w:tc>
           <w:tcPr>
-            <w:tcW w:w="1417" w:type="dxa"/>
-          </w:tcPr>
-          <w:p>
-            <w:pPr>
-              <w:cnfStyle w:val="000000000000" w:firstRow="0" w:lastRow="0" w:firstColumn="0" w:lastColumn="0" w:oddVBand="0" w:evenVBand="0" w:oddHBand="0" w:evenHBand="0" w:firstRowFirstColumn="0" w:firstRowLastColumn="0" w:lastRowFirstColumn="0" w:lastRowLastColumn="0"/>
-            </w:pPr>
+            <w:tcW w:type="dxa" w:w="1417"/>
+          </w:tcPr>
+          <w:p>
             <w:r>
               <w:t>7.34</w:t>
             </w:r>
@@ -2113,12 +1796,9 @@
         </w:tc>
         <w:tc>
           <w:tcPr>
-            <w:tcW w:w="1417" w:type="dxa"/>
-          </w:tcPr>
-          <w:p>
-            <w:pPr>
-              <w:cnfStyle w:val="000000000000" w:firstRow="0" w:lastRow="0" w:firstColumn="0" w:lastColumn="0" w:oddVBand="0" w:evenVBand="0" w:oddHBand="0" w:evenHBand="0" w:firstRowFirstColumn="0" w:firstRowLastColumn="0" w:lastRowFirstColumn="0" w:lastRowLastColumn="0"/>
-            </w:pPr>
+            <w:tcW w:type="dxa" w:w="1417"/>
+          </w:tcPr>
+          <w:p>
             <w:r>
               <w:t>11.55</w:t>
             </w:r>
@@ -2128,8 +1808,7 @@
       <w:tr>
         <w:tc>
           <w:tcPr>
-            <w:cnfStyle w:val="001000000000" w:firstRow="0" w:lastRow="0" w:firstColumn="1" w:lastColumn="0" w:oddVBand="0" w:evenVBand="0" w:oddHBand="0" w:evenHBand="0" w:firstRowFirstColumn="0" w:firstRowLastColumn="0" w:lastRowFirstColumn="0" w:lastRowLastColumn="0"/>
-            <w:tcW w:w="2268" w:type="dxa"/>
+            <w:tcW w:type="dxa" w:w="2268"/>
           </w:tcPr>
           <w:p>
             <w:r>
@@ -2139,12 +1818,9 @@
         </w:tc>
         <w:tc>
           <w:tcPr>
-            <w:tcW w:w="1417" w:type="dxa"/>
-          </w:tcPr>
-          <w:p>
-            <w:pPr>
-              <w:cnfStyle w:val="000000000000" w:firstRow="0" w:lastRow="0" w:firstColumn="0" w:lastColumn="0" w:oddVBand="0" w:evenVBand="0" w:oddHBand="0" w:evenHBand="0" w:firstRowFirstColumn="0" w:firstRowLastColumn="0" w:lastRowFirstColumn="0" w:lastRowLastColumn="0"/>
-            </w:pPr>
+            <w:tcW w:type="dxa" w:w="1417"/>
+          </w:tcPr>
+          <w:p>
             <w:r>
               <w:t>9.66</w:t>
             </w:r>
@@ -2152,12 +1828,9 @@
         </w:tc>
         <w:tc>
           <w:tcPr>
-            <w:tcW w:w="1417" w:type="dxa"/>
-          </w:tcPr>
-          <w:p>
-            <w:pPr>
-              <w:cnfStyle w:val="000000000000" w:firstRow="0" w:lastRow="0" w:firstColumn="0" w:lastColumn="0" w:oddVBand="0" w:evenVBand="0" w:oddHBand="0" w:evenHBand="0" w:firstRowFirstColumn="0" w:firstRowLastColumn="0" w:lastRowFirstColumn="0" w:lastRowLastColumn="0"/>
-            </w:pPr>
+            <w:tcW w:type="dxa" w:w="1417"/>
+          </w:tcPr>
+          <w:p>
             <w:r>
               <w:t>10.59</w:t>
             </w:r>
@@ -2167,8 +1840,7 @@
       <w:tr>
         <w:tc>
           <w:tcPr>
-            <w:cnfStyle w:val="001000000000" w:firstRow="0" w:lastRow="0" w:firstColumn="1" w:lastColumn="0" w:oddVBand="0" w:evenVBand="0" w:oddHBand="0" w:evenHBand="0" w:firstRowFirstColumn="0" w:firstRowLastColumn="0" w:lastRowFirstColumn="0" w:lastRowLastColumn="0"/>
-            <w:tcW w:w="2268" w:type="dxa"/>
+            <w:tcW w:type="dxa" w:w="2268"/>
           </w:tcPr>
           <w:p>
             <w:r>
@@ -2181,12 +1853,9 @@
         </w:tc>
         <w:tc>
           <w:tcPr>
-            <w:tcW w:w="1417" w:type="dxa"/>
-          </w:tcPr>
-          <w:p>
-            <w:pPr>
-              <w:cnfStyle w:val="000000000000" w:firstRow="0" w:lastRow="0" w:firstColumn="0" w:lastColumn="0" w:oddVBand="0" w:evenVBand="0" w:oddHBand="0" w:evenHBand="0" w:firstRowFirstColumn="0" w:firstRowLastColumn="0" w:lastRowFirstColumn="0" w:lastRowLastColumn="0"/>
-            </w:pPr>
+            <w:tcW w:type="dxa" w:w="1417"/>
+          </w:tcPr>
+          <w:p>
             <w:r>
               <w:rPr>
                 <w:b/>
@@ -2197,12 +1866,9 @@
         </w:tc>
         <w:tc>
           <w:tcPr>
-            <w:tcW w:w="1417" w:type="dxa"/>
-          </w:tcPr>
-          <w:p>
-            <w:pPr>
-              <w:cnfStyle w:val="000000000000" w:firstRow="0" w:lastRow="0" w:firstColumn="0" w:lastColumn="0" w:oddVBand="0" w:evenVBand="0" w:oddHBand="0" w:evenHBand="0" w:firstRowFirstColumn="0" w:firstRowLastColumn="0" w:lastRowFirstColumn="0" w:lastRowLastColumn="0"/>
-            </w:pPr>
+            <w:tcW w:type="dxa" w:w="1417"/>
+          </w:tcPr>
+          <w:p>
             <w:r>
               <w:rPr>
                 <w:b/>
@@ -2215,8 +1881,7 @@
       <w:tr>
         <w:tc>
           <w:tcPr>
-            <w:cnfStyle w:val="001000000000" w:firstRow="0" w:lastRow="0" w:firstColumn="1" w:lastColumn="0" w:oddVBand="0" w:evenVBand="0" w:oddHBand="0" w:evenHBand="0" w:firstRowFirstColumn="0" w:firstRowLastColumn="0" w:lastRowFirstColumn="0" w:lastRowLastColumn="0"/>
-            <w:tcW w:w="2268" w:type="dxa"/>
+            <w:tcW w:type="dxa" w:w="2268"/>
           </w:tcPr>
           <w:p>
             <w:r>
@@ -2226,12 +1891,9 @@
         </w:tc>
         <w:tc>
           <w:tcPr>
-            <w:tcW w:w="1417" w:type="dxa"/>
-          </w:tcPr>
-          <w:p>
-            <w:pPr>
-              <w:cnfStyle w:val="000000000000" w:firstRow="0" w:lastRow="0" w:firstColumn="0" w:lastColumn="0" w:oddVBand="0" w:evenVBand="0" w:oddHBand="0" w:evenHBand="0" w:firstRowFirstColumn="0" w:firstRowLastColumn="0" w:lastRowFirstColumn="0" w:lastRowLastColumn="0"/>
-            </w:pPr>
+            <w:tcW w:type="dxa" w:w="1417"/>
+          </w:tcPr>
+          <w:p>
             <w:r>
               <w:t>13.53</w:t>
             </w:r>
@@ -2239,12 +1901,9 @@
         </w:tc>
         <w:tc>
           <w:tcPr>
-            <w:tcW w:w="1417" w:type="dxa"/>
-          </w:tcPr>
-          <w:p>
-            <w:pPr>
-              <w:cnfStyle w:val="000000000000" w:firstRow="0" w:lastRow="0" w:firstColumn="0" w:lastColumn="0" w:oddVBand="0" w:evenVBand="0" w:oddHBand="0" w:evenHBand="0" w:firstRowFirstColumn="0" w:firstRowLastColumn="0" w:lastRowFirstColumn="0" w:lastRowLastColumn="0"/>
-            </w:pPr>
+            <w:tcW w:type="dxa" w:w="1417"/>
+          </w:tcPr>
+          <w:p>
             <w:r>
               <w:t>18.85</w:t>
             </w:r>
@@ -2254,8 +1913,7 @@
       <w:tr>
         <w:tc>
           <w:tcPr>
-            <w:cnfStyle w:val="001000000000" w:firstRow="0" w:lastRow="0" w:firstColumn="1" w:lastColumn="0" w:oddVBand="0" w:evenVBand="0" w:oddHBand="0" w:evenHBand="0" w:firstRowFirstColumn="0" w:firstRowLastColumn="0" w:lastRowFirstColumn="0" w:lastRowLastColumn="0"/>
-            <w:tcW w:w="2268" w:type="dxa"/>
+            <w:tcW w:type="dxa" w:w="2268"/>
           </w:tcPr>
           <w:p>
             <w:r>
@@ -2265,12 +1923,9 @@
         </w:tc>
         <w:tc>
           <w:tcPr>
-            <w:tcW w:w="1417" w:type="dxa"/>
-          </w:tcPr>
-          <w:p>
-            <w:pPr>
-              <w:cnfStyle w:val="000000000000" w:firstRow="0" w:lastRow="0" w:firstColumn="0" w:lastColumn="0" w:oddVBand="0" w:evenVBand="0" w:oddHBand="0" w:evenHBand="0" w:firstRowFirstColumn="0" w:firstRowLastColumn="0" w:lastRowFirstColumn="0" w:lastRowLastColumn="0"/>
-            </w:pPr>
+            <w:tcW w:type="dxa" w:w="1417"/>
+          </w:tcPr>
+          <w:p>
             <w:r>
               <w:t>10.73</w:t>
             </w:r>
@@ -2278,12 +1933,9 @@
         </w:tc>
         <w:tc>
           <w:tcPr>
-            <w:tcW w:w="1417" w:type="dxa"/>
-          </w:tcPr>
-          <w:p>
-            <w:pPr>
-              <w:cnfStyle w:val="000000000000" w:firstRow="0" w:lastRow="0" w:firstColumn="0" w:lastColumn="0" w:oddVBand="0" w:evenVBand="0" w:oddHBand="0" w:evenHBand="0" w:firstRowFirstColumn="0" w:firstRowLastColumn="0" w:lastRowFirstColumn="0" w:lastRowLastColumn="0"/>
-            </w:pPr>
+            <w:tcW w:type="dxa" w:w="1417"/>
+          </w:tcPr>
+          <w:p>
             <w:r>
               <w:t>15.14</w:t>
             </w:r>
@@ -2293,8 +1945,7 @@
       <w:tr>
         <w:tc>
           <w:tcPr>
-            <w:cnfStyle w:val="001000000000" w:firstRow="0" w:lastRow="0" w:firstColumn="1" w:lastColumn="0" w:oddVBand="0" w:evenVBand="0" w:oddHBand="0" w:evenHBand="0" w:firstRowFirstColumn="0" w:firstRowLastColumn="0" w:lastRowFirstColumn="0" w:lastRowLastColumn="0"/>
-            <w:tcW w:w="2268" w:type="dxa"/>
+            <w:tcW w:type="dxa" w:w="2268"/>
           </w:tcPr>
           <w:p>
             <w:r>
@@ -2304,12 +1955,9 @@
         </w:tc>
         <w:tc>
           <w:tcPr>
-            <w:tcW w:w="1417" w:type="dxa"/>
-          </w:tcPr>
-          <w:p>
-            <w:pPr>
-              <w:cnfStyle w:val="000000000000" w:firstRow="0" w:lastRow="0" w:firstColumn="0" w:lastColumn="0" w:oddVBand="0" w:evenVBand="0" w:oddHBand="0" w:evenHBand="0" w:firstRowFirstColumn="0" w:firstRowLastColumn="0" w:lastRowFirstColumn="0" w:lastRowLastColumn="0"/>
-            </w:pPr>
+            <w:tcW w:type="dxa" w:w="1417"/>
+          </w:tcPr>
+          <w:p>
             <w:r>
               <w:t>15.68</w:t>
             </w:r>
@@ -2317,12 +1965,9 @@
         </w:tc>
         <w:tc>
           <w:tcPr>
-            <w:tcW w:w="1417" w:type="dxa"/>
-          </w:tcPr>
-          <w:p>
-            <w:pPr>
-              <w:cnfStyle w:val="000000000000" w:firstRow="0" w:lastRow="0" w:firstColumn="0" w:lastColumn="0" w:oddVBand="0" w:evenVBand="0" w:oddHBand="0" w:evenHBand="0" w:firstRowFirstColumn="0" w:firstRowLastColumn="0" w:lastRowFirstColumn="0" w:lastRowLastColumn="0"/>
-            </w:pPr>
+            <w:tcW w:type="dxa" w:w="1417"/>
+          </w:tcPr>
+          <w:p>
             <w:r>
               <w:t>11.95</w:t>
             </w:r>
@@ -2332,8 +1977,7 @@
       <w:tr>
         <w:tc>
           <w:tcPr>
-            <w:cnfStyle w:val="001000000000" w:firstRow="0" w:lastRow="0" w:firstColumn="1" w:lastColumn="0" w:oddVBand="0" w:evenVBand="0" w:oddHBand="0" w:evenHBand="0" w:firstRowFirstColumn="0" w:firstRowLastColumn="0" w:lastRowFirstColumn="0" w:lastRowLastColumn="0"/>
-            <w:tcW w:w="2268" w:type="dxa"/>
+            <w:tcW w:type="dxa" w:w="2268"/>
           </w:tcPr>
           <w:p>
             <w:r>
@@ -2343,12 +1987,9 @@
         </w:tc>
         <w:tc>
           <w:tcPr>
-            <w:tcW w:w="1417" w:type="dxa"/>
-          </w:tcPr>
-          <w:p>
-            <w:pPr>
-              <w:cnfStyle w:val="000000000000" w:firstRow="0" w:lastRow="0" w:firstColumn="0" w:lastColumn="0" w:oddVBand="0" w:evenVBand="0" w:oddHBand="0" w:evenHBand="0" w:firstRowFirstColumn="0" w:firstRowLastColumn="0" w:lastRowFirstColumn="0" w:lastRowLastColumn="0"/>
-            </w:pPr>
+            <w:tcW w:type="dxa" w:w="1417"/>
+          </w:tcPr>
+          <w:p>
             <w:r>
               <w:t>2.82</w:t>
             </w:r>
@@ -2356,12 +1997,9 @@
         </w:tc>
         <w:tc>
           <w:tcPr>
-            <w:tcW w:w="1417" w:type="dxa"/>
-          </w:tcPr>
-          <w:p>
-            <w:pPr>
-              <w:cnfStyle w:val="000000000000" w:firstRow="0" w:lastRow="0" w:firstColumn="0" w:lastColumn="0" w:oddVBand="0" w:evenVBand="0" w:oddHBand="0" w:evenHBand="0" w:firstRowFirstColumn="0" w:firstRowLastColumn="0" w:lastRowFirstColumn="0" w:lastRowLastColumn="0"/>
-            </w:pPr>
+            <w:tcW w:type="dxa" w:w="1417"/>
+          </w:tcPr>
+          <w:p>
             <w:r>
               <w:t>19.04</w:t>
             </w:r>
@@ -2371,8 +2009,7 @@
       <w:tr>
         <w:tc>
           <w:tcPr>
-            <w:cnfStyle w:val="001000000000" w:firstRow="0" w:lastRow="0" w:firstColumn="1" w:lastColumn="0" w:oddVBand="0" w:evenVBand="0" w:oddHBand="0" w:evenHBand="0" w:firstRowFirstColumn="0" w:firstRowLastColumn="0" w:lastRowFirstColumn="0" w:lastRowLastColumn="0"/>
-            <w:tcW w:w="2268" w:type="dxa"/>
+            <w:tcW w:type="dxa" w:w="2268"/>
           </w:tcPr>
           <w:p>
             <w:r>
@@ -2382,12 +2019,9 @@
         </w:tc>
         <w:tc>
           <w:tcPr>
-            <w:tcW w:w="1417" w:type="dxa"/>
-          </w:tcPr>
-          <w:p>
-            <w:pPr>
-              <w:cnfStyle w:val="000000000000" w:firstRow="0" w:lastRow="0" w:firstColumn="0" w:lastColumn="0" w:oddVBand="0" w:evenVBand="0" w:oddHBand="0" w:evenHBand="0" w:firstRowFirstColumn="0" w:firstRowLastColumn="0" w:lastRowFirstColumn="0" w:lastRowLastColumn="0"/>
-            </w:pPr>
+            <w:tcW w:type="dxa" w:w="1417"/>
+          </w:tcPr>
+          <w:p>
             <w:r>
               <w:t>15.17</w:t>
             </w:r>
@@ -2395,12 +2029,9 @@
         </w:tc>
         <w:tc>
           <w:tcPr>
-            <w:tcW w:w="1417" w:type="dxa"/>
-          </w:tcPr>
-          <w:p>
-            <w:pPr>
-              <w:cnfStyle w:val="000000000000" w:firstRow="0" w:lastRow="0" w:firstColumn="0" w:lastColumn="0" w:oddVBand="0" w:evenVBand="0" w:oddHBand="0" w:evenHBand="0" w:firstRowFirstColumn="0" w:firstRowLastColumn="0" w:lastRowFirstColumn="0" w:lastRowLastColumn="0"/>
-            </w:pPr>
+            <w:tcW w:type="dxa" w:w="1417"/>
+          </w:tcPr>
+          <w:p>
             <w:r>
               <w:t>10.63</w:t>
             </w:r>
@@ -2410,8 +2041,7 @@
       <w:tr>
         <w:tc>
           <w:tcPr>
-            <w:cnfStyle w:val="001000000000" w:firstRow="0" w:lastRow="0" w:firstColumn="1" w:lastColumn="0" w:oddVBand="0" w:evenVBand="0" w:oddHBand="0" w:evenHBand="0" w:firstRowFirstColumn="0" w:firstRowLastColumn="0" w:lastRowFirstColumn="0" w:lastRowLastColumn="0"/>
-            <w:tcW w:w="2268" w:type="dxa"/>
+            <w:tcW w:type="dxa" w:w="2268"/>
           </w:tcPr>
           <w:p>
             <w:r>
@@ -2421,12 +2051,9 @@
         </w:tc>
         <w:tc>
           <w:tcPr>
-            <w:tcW w:w="1417" w:type="dxa"/>
-          </w:tcPr>
-          <w:p>
-            <w:pPr>
-              <w:cnfStyle w:val="000000000000" w:firstRow="0" w:lastRow="0" w:firstColumn="0" w:lastColumn="0" w:oddVBand="0" w:evenVBand="0" w:oddHBand="0" w:evenHBand="0" w:firstRowFirstColumn="0" w:firstRowLastColumn="0" w:lastRowFirstColumn="0" w:lastRowLastColumn="0"/>
-            </w:pPr>
+            <w:tcW w:type="dxa" w:w="1417"/>
+          </w:tcPr>
+          <w:p>
             <w:r>
               <w:t>10.49</w:t>
             </w:r>
@@ -2434,12 +2061,9 @@
         </w:tc>
         <w:tc>
           <w:tcPr>
-            <w:tcW w:w="1417" w:type="dxa"/>
-          </w:tcPr>
-          <w:p>
-            <w:pPr>
-              <w:cnfStyle w:val="000000000000" w:firstRow="0" w:lastRow="0" w:firstColumn="0" w:lastColumn="0" w:oddVBand="0" w:evenVBand="0" w:oddHBand="0" w:evenHBand="0" w:firstRowFirstColumn="0" w:firstRowLastColumn="0" w:lastRowFirstColumn="0" w:lastRowLastColumn="0"/>
-            </w:pPr>
+            <w:tcW w:type="dxa" w:w="1417"/>
+          </w:tcPr>
+          <w:p>
             <w:r>
               <w:t>15.16</w:t>
             </w:r>
@@ -2449,8 +2073,7 @@
       <w:tr>
         <w:tc>
           <w:tcPr>
-            <w:cnfStyle w:val="001000000000" w:firstRow="0" w:lastRow="0" w:firstColumn="1" w:lastColumn="0" w:oddVBand="0" w:evenVBand="0" w:oddHBand="0" w:evenHBand="0" w:firstRowFirstColumn="0" w:firstRowLastColumn="0" w:lastRowFirstColumn="0" w:lastRowLastColumn="0"/>
-            <w:tcW w:w="2268" w:type="dxa"/>
+            <w:tcW w:type="dxa" w:w="2268"/>
           </w:tcPr>
           <w:p>
             <w:r>
@@ -2463,12 +2086,9 @@
         </w:tc>
         <w:tc>
           <w:tcPr>
-            <w:tcW w:w="1417" w:type="dxa"/>
-          </w:tcPr>
-          <w:p>
-            <w:pPr>
-              <w:cnfStyle w:val="000000000000" w:firstRow="0" w:lastRow="0" w:firstColumn="0" w:lastColumn="0" w:oddVBand="0" w:evenVBand="0" w:oddHBand="0" w:evenHBand="0" w:firstRowFirstColumn="0" w:firstRowLastColumn="0" w:lastRowFirstColumn="0" w:lastRowLastColumn="0"/>
-            </w:pPr>
+            <w:tcW w:type="dxa" w:w="1417"/>
+          </w:tcPr>
+          <w:p>
             <w:r>
               <w:rPr>
                 <w:b/>
@@ -2479,12 +2099,9 @@
         </w:tc>
         <w:tc>
           <w:tcPr>
-            <w:tcW w:w="1417" w:type="dxa"/>
-          </w:tcPr>
-          <w:p>
-            <w:pPr>
-              <w:cnfStyle w:val="000000000000" w:firstRow="0" w:lastRow="0" w:firstColumn="0" w:lastColumn="0" w:oddVBand="0" w:evenVBand="0" w:oddHBand="0" w:evenHBand="0" w:firstRowFirstColumn="0" w:firstRowLastColumn="0" w:lastRowFirstColumn="0" w:lastRowLastColumn="0"/>
-            </w:pPr>
+            <w:tcW w:type="dxa" w:w="1417"/>
+          </w:tcPr>
+          <w:p>
             <w:r>
               <w:rPr>
                 <w:b/>
@@ -2497,8 +2114,7 @@
       <w:tr>
         <w:tc>
           <w:tcPr>
-            <w:cnfStyle w:val="001000000000" w:firstRow="0" w:lastRow="0" w:firstColumn="1" w:lastColumn="0" w:oddVBand="0" w:evenVBand="0" w:oddHBand="0" w:evenHBand="0" w:firstRowFirstColumn="0" w:firstRowLastColumn="0" w:lastRowFirstColumn="0" w:lastRowLastColumn="0"/>
-            <w:tcW w:w="2268" w:type="dxa"/>
+            <w:tcW w:type="dxa" w:w="2268"/>
           </w:tcPr>
           <w:p>
             <w:r>
@@ -2508,12 +2124,9 @@
         </w:tc>
         <w:tc>
           <w:tcPr>
-            <w:tcW w:w="1417" w:type="dxa"/>
-          </w:tcPr>
-          <w:p>
-            <w:pPr>
-              <w:cnfStyle w:val="000000000000" w:firstRow="0" w:lastRow="0" w:firstColumn="0" w:lastColumn="0" w:oddVBand="0" w:evenVBand="0" w:oddHBand="0" w:evenHBand="0" w:firstRowFirstColumn="0" w:firstRowLastColumn="0" w:lastRowFirstColumn="0" w:lastRowLastColumn="0"/>
-            </w:pPr>
+            <w:tcW w:type="dxa" w:w="1417"/>
+          </w:tcPr>
+          <w:p>
             <w:r>
               <w:t>7.27</w:t>
             </w:r>
@@ -2521,12 +2134,9 @@
         </w:tc>
         <w:tc>
           <w:tcPr>
-            <w:tcW w:w="1417" w:type="dxa"/>
-          </w:tcPr>
-          <w:p>
-            <w:pPr>
-              <w:cnfStyle w:val="000000000000" w:firstRow="0" w:lastRow="0" w:firstColumn="0" w:lastColumn="0" w:oddVBand="0" w:evenVBand="0" w:oddHBand="0" w:evenHBand="0" w:firstRowFirstColumn="0" w:firstRowLastColumn="0" w:lastRowFirstColumn="0" w:lastRowLastColumn="0"/>
-            </w:pPr>
+            <w:tcW w:type="dxa" w:w="1417"/>
+          </w:tcPr>
+          <w:p>
             <w:r>
               <w:t>12.86</w:t>
             </w:r>
@@ -2536,8 +2146,7 @@
       <w:tr>
         <w:tc>
           <w:tcPr>
-            <w:cnfStyle w:val="001000000000" w:firstRow="0" w:lastRow="0" w:firstColumn="1" w:lastColumn="0" w:oddVBand="0" w:evenVBand="0" w:oddHBand="0" w:evenHBand="0" w:firstRowFirstColumn="0" w:firstRowLastColumn="0" w:lastRowFirstColumn="0" w:lastRowLastColumn="0"/>
-            <w:tcW w:w="2268" w:type="dxa"/>
+            <w:tcW w:type="dxa" w:w="2268"/>
           </w:tcPr>
           <w:p>
             <w:r>
@@ -2547,12 +2156,9 @@
         </w:tc>
         <w:tc>
           <w:tcPr>
-            <w:tcW w:w="1417" w:type="dxa"/>
-          </w:tcPr>
-          <w:p>
-            <w:pPr>
-              <w:cnfStyle w:val="000000000000" w:firstRow="0" w:lastRow="0" w:firstColumn="0" w:lastColumn="0" w:oddVBand="0" w:evenVBand="0" w:oddHBand="0" w:evenHBand="0" w:firstRowFirstColumn="0" w:firstRowLastColumn="0" w:lastRowFirstColumn="0" w:lastRowLastColumn="0"/>
-            </w:pPr>
+            <w:tcW w:type="dxa" w:w="1417"/>
+          </w:tcPr>
+          <w:p>
             <w:r>
               <w:t>8.03</w:t>
             </w:r>
@@ -2560,12 +2166,9 @@
         </w:tc>
         <w:tc>
           <w:tcPr>
-            <w:tcW w:w="1417" w:type="dxa"/>
-          </w:tcPr>
-          <w:p>
-            <w:pPr>
-              <w:cnfStyle w:val="000000000000" w:firstRow="0" w:lastRow="0" w:firstColumn="0" w:lastColumn="0" w:oddVBand="0" w:evenVBand="0" w:oddHBand="0" w:evenHBand="0" w:firstRowFirstColumn="0" w:firstRowLastColumn="0" w:lastRowFirstColumn="0" w:lastRowLastColumn="0"/>
-            </w:pPr>
+            <w:tcW w:type="dxa" w:w="1417"/>
+          </w:tcPr>
+          <w:p>
             <w:r>
               <w:t>4.05</w:t>
             </w:r>
@@ -2575,8 +2178,7 @@
       <w:tr>
         <w:tc>
           <w:tcPr>
-            <w:cnfStyle w:val="001000000000" w:firstRow="0" w:lastRow="0" w:firstColumn="1" w:lastColumn="0" w:oddVBand="0" w:evenVBand="0" w:oddHBand="0" w:evenHBand="0" w:firstRowFirstColumn="0" w:firstRowLastColumn="0" w:lastRowFirstColumn="0" w:lastRowLastColumn="0"/>
-            <w:tcW w:w="2268" w:type="dxa"/>
+            <w:tcW w:type="dxa" w:w="2268"/>
           </w:tcPr>
           <w:p>
             <w:r>
@@ -2586,12 +2188,9 @@
         </w:tc>
         <w:tc>
           <w:tcPr>
-            <w:tcW w:w="1417" w:type="dxa"/>
-          </w:tcPr>
-          <w:p>
-            <w:pPr>
-              <w:cnfStyle w:val="000000000000" w:firstRow="0" w:lastRow="0" w:firstColumn="0" w:lastColumn="0" w:oddVBand="0" w:evenVBand="0" w:oddHBand="0" w:evenHBand="0" w:firstRowFirstColumn="0" w:firstRowLastColumn="0" w:lastRowFirstColumn="0" w:lastRowLastColumn="0"/>
-            </w:pPr>
+            <w:tcW w:type="dxa" w:w="1417"/>
+          </w:tcPr>
+          <w:p>
             <w:r>
               <w:t>7.61</w:t>
             </w:r>
@@ -2599,12 +2198,9 @@
         </w:tc>
         <w:tc>
           <w:tcPr>
-            <w:tcW w:w="1417" w:type="dxa"/>
-          </w:tcPr>
-          <w:p>
-            <w:pPr>
-              <w:cnfStyle w:val="000000000000" w:firstRow="0" w:lastRow="0" w:firstColumn="0" w:lastColumn="0" w:oddVBand="0" w:evenVBand="0" w:oddHBand="0" w:evenHBand="0" w:firstRowFirstColumn="0" w:firstRowLastColumn="0" w:lastRowFirstColumn="0" w:lastRowLastColumn="0"/>
-            </w:pPr>
+            <w:tcW w:type="dxa" w:w="1417"/>
+          </w:tcPr>
+          <w:p>
             <w:r>
               <w:t>5.19</w:t>
             </w:r>
@@ -2614,8 +2210,7 @@
       <w:tr>
         <w:tc>
           <w:tcPr>
-            <w:cnfStyle w:val="001000000000" w:firstRow="0" w:lastRow="0" w:firstColumn="1" w:lastColumn="0" w:oddVBand="0" w:evenVBand="0" w:oddHBand="0" w:evenHBand="0" w:firstRowFirstColumn="0" w:firstRowLastColumn="0" w:lastRowFirstColumn="0" w:lastRowLastColumn="0"/>
-            <w:tcW w:w="2268" w:type="dxa"/>
+            <w:tcW w:type="dxa" w:w="2268"/>
           </w:tcPr>
           <w:p>
             <w:r>
@@ -2625,12 +2220,9 @@
         </w:tc>
         <w:tc>
           <w:tcPr>
-            <w:tcW w:w="1417" w:type="dxa"/>
-          </w:tcPr>
-          <w:p>
-            <w:pPr>
-              <w:cnfStyle w:val="000000000000" w:firstRow="0" w:lastRow="0" w:firstColumn="0" w:lastColumn="0" w:oddVBand="0" w:evenVBand="0" w:oddHBand="0" w:evenHBand="0" w:firstRowFirstColumn="0" w:firstRowLastColumn="0" w:lastRowFirstColumn="0" w:lastRowLastColumn="0"/>
-            </w:pPr>
+            <w:tcW w:type="dxa" w:w="1417"/>
+          </w:tcPr>
+          <w:p>
             <w:r>
               <w:t>18.71</w:t>
             </w:r>
@@ -2638,12 +2230,9 @@
         </w:tc>
         <w:tc>
           <w:tcPr>
-            <w:tcW w:w="1417" w:type="dxa"/>
-          </w:tcPr>
-          <w:p>
-            <w:pPr>
-              <w:cnfStyle w:val="000000000000" w:firstRow="0" w:lastRow="0" w:firstColumn="0" w:lastColumn="0" w:oddVBand="0" w:evenVBand="0" w:oddHBand="0" w:evenHBand="0" w:firstRowFirstColumn="0" w:firstRowLastColumn="0" w:lastRowFirstColumn="0" w:lastRowLastColumn="0"/>
-            </w:pPr>
+            <w:tcW w:type="dxa" w:w="1417"/>
+          </w:tcPr>
+          <w:p>
             <w:r>
               <w:t>5.98</w:t>
             </w:r>
@@ -2653,8 +2242,7 @@
       <w:tr>
         <w:tc>
           <w:tcPr>
-            <w:cnfStyle w:val="001000000000" w:firstRow="0" w:lastRow="0" w:firstColumn="1" w:lastColumn="0" w:oddVBand="0" w:evenVBand="0" w:oddHBand="0" w:evenHBand="0" w:firstRowFirstColumn="0" w:firstRowLastColumn="0" w:lastRowFirstColumn="0" w:lastRowLastColumn="0"/>
-            <w:tcW w:w="2268" w:type="dxa"/>
+            <w:tcW w:type="dxa" w:w="2268"/>
           </w:tcPr>
           <w:p>
             <w:r>
@@ -2667,12 +2255,9 @@
         </w:tc>
         <w:tc>
           <w:tcPr>
-            <w:tcW w:w="1417" w:type="dxa"/>
-          </w:tcPr>
-          <w:p>
-            <w:pPr>
-              <w:cnfStyle w:val="000000000000" w:firstRow="0" w:lastRow="0" w:firstColumn="0" w:lastColumn="0" w:oddVBand="0" w:evenVBand="0" w:oddHBand="0" w:evenHBand="0" w:firstRowFirstColumn="0" w:firstRowLastColumn="0" w:lastRowFirstColumn="0" w:lastRowLastColumn="0"/>
-            </w:pPr>
+            <w:tcW w:type="dxa" w:w="1417"/>
+          </w:tcPr>
+          <w:p>
             <w:r>
               <w:rPr>
                 <w:b/>
@@ -2683,12 +2268,9 @@
         </w:tc>
         <w:tc>
           <w:tcPr>
-            <w:tcW w:w="1417" w:type="dxa"/>
-          </w:tcPr>
-          <w:p>
-            <w:pPr>
-              <w:cnfStyle w:val="000000000000" w:firstRow="0" w:lastRow="0" w:firstColumn="0" w:lastColumn="0" w:oddVBand="0" w:evenVBand="0" w:oddHBand="0" w:evenHBand="0" w:firstRowFirstColumn="0" w:firstRowLastColumn="0" w:lastRowFirstColumn="0" w:lastRowLastColumn="0"/>
-            </w:pPr>
+            <w:tcW w:type="dxa" w:w="1417"/>
+          </w:tcPr>
+          <w:p>
             <w:r>
               <w:rPr>
                 <w:b/>
@@ -2701,8 +2283,7 @@
       <w:tr>
         <w:tc>
           <w:tcPr>
-            <w:cnfStyle w:val="001000000000" w:firstRow="0" w:lastRow="0" w:firstColumn="1" w:lastColumn="0" w:oddVBand="0" w:evenVBand="0" w:oddHBand="0" w:evenHBand="0" w:firstRowFirstColumn="0" w:firstRowLastColumn="0" w:lastRowFirstColumn="0" w:lastRowLastColumn="0"/>
-            <w:tcW w:w="2268" w:type="dxa"/>
+            <w:tcW w:type="dxa" w:w="2268"/>
           </w:tcPr>
           <w:p>
             <w:r>
@@ -2712,12 +2293,9 @@
         </w:tc>
         <w:tc>
           <w:tcPr>
-            <w:tcW w:w="1417" w:type="dxa"/>
-          </w:tcPr>
-          <w:p>
-            <w:pPr>
-              <w:cnfStyle w:val="000000000000" w:firstRow="0" w:lastRow="0" w:firstColumn="0" w:lastColumn="0" w:oddVBand="0" w:evenVBand="0" w:oddHBand="0" w:evenHBand="0" w:firstRowFirstColumn="0" w:firstRowLastColumn="0" w:lastRowFirstColumn="0" w:lastRowLastColumn="0"/>
-            </w:pPr>
+            <w:tcW w:type="dxa" w:w="1417"/>
+          </w:tcPr>
+          <w:p>
             <w:r>
               <w:t>12.0</w:t>
             </w:r>
@@ -2725,12 +2303,9 @@
         </w:tc>
         <w:tc>
           <w:tcPr>
-            <w:tcW w:w="1417" w:type="dxa"/>
-          </w:tcPr>
-          <w:p>
-            <w:pPr>
-              <w:cnfStyle w:val="000000000000" w:firstRow="0" w:lastRow="0" w:firstColumn="0" w:lastColumn="0" w:oddVBand="0" w:evenVBand="0" w:oddHBand="0" w:evenHBand="0" w:firstRowFirstColumn="0" w:firstRowLastColumn="0" w:lastRowFirstColumn="0" w:lastRowLastColumn="0"/>
-            </w:pPr>
+            <w:tcW w:type="dxa" w:w="1417"/>
+          </w:tcPr>
+          <w:p>
             <w:r>
               <w:t>24.86</w:t>
             </w:r>
@@ -2740,8 +2315,7 @@
       <w:tr>
         <w:tc>
           <w:tcPr>
-            <w:cnfStyle w:val="001000000000" w:firstRow="0" w:lastRow="0" w:firstColumn="1" w:lastColumn="0" w:oddVBand="0" w:evenVBand="0" w:oddHBand="0" w:evenHBand="0" w:firstRowFirstColumn="0" w:firstRowLastColumn="0" w:lastRowFirstColumn="0" w:lastRowLastColumn="0"/>
-            <w:tcW w:w="2268" w:type="dxa"/>
+            <w:tcW w:type="dxa" w:w="2268"/>
           </w:tcPr>
           <w:p>
             <w:r>
@@ -2751,12 +2325,9 @@
         </w:tc>
         <w:tc>
           <w:tcPr>
-            <w:tcW w:w="1417" w:type="dxa"/>
-          </w:tcPr>
-          <w:p>
-            <w:pPr>
-              <w:cnfStyle w:val="000000000000" w:firstRow="0" w:lastRow="0" w:firstColumn="0" w:lastColumn="0" w:oddVBand="0" w:evenVBand="0" w:oddHBand="0" w:evenHBand="0" w:firstRowFirstColumn="0" w:firstRowLastColumn="0" w:lastRowFirstColumn="0" w:lastRowLastColumn="0"/>
-            </w:pPr>
+            <w:tcW w:type="dxa" w:w="1417"/>
+          </w:tcPr>
+          <w:p>
             <w:r>
               <w:t>8.11</w:t>
             </w:r>
@@ -2764,12 +2335,9 @@
         </w:tc>
         <w:tc>
           <w:tcPr>
-            <w:tcW w:w="1417" w:type="dxa"/>
-          </w:tcPr>
-          <w:p>
-            <w:pPr>
-              <w:cnfStyle w:val="000000000000" w:firstRow="0" w:lastRow="0" w:firstColumn="0" w:lastColumn="0" w:oddVBand="0" w:evenVBand="0" w:oddHBand="0" w:evenHBand="0" w:firstRowFirstColumn="0" w:firstRowLastColumn="0" w:lastRowFirstColumn="0" w:lastRowLastColumn="0"/>
-            </w:pPr>
+            <w:tcW w:type="dxa" w:w="1417"/>
+          </w:tcPr>
+          <w:p>
             <w:r>
               <w:t>6.06</w:t>
             </w:r>
@@ -2779,8 +2347,7 @@
       <w:tr>
         <w:tc>
           <w:tcPr>
-            <w:cnfStyle w:val="001000000000" w:firstRow="0" w:lastRow="0" w:firstColumn="1" w:lastColumn="0" w:oddVBand="0" w:evenVBand="0" w:oddHBand="0" w:evenHBand="0" w:firstRowFirstColumn="0" w:firstRowLastColumn="0" w:lastRowFirstColumn="0" w:lastRowLastColumn="0"/>
-            <w:tcW w:w="2268" w:type="dxa"/>
+            <w:tcW w:type="dxa" w:w="2268"/>
           </w:tcPr>
           <w:p>
             <w:r>
@@ -2790,12 +2357,9 @@
         </w:tc>
         <w:tc>
           <w:tcPr>
-            <w:tcW w:w="1417" w:type="dxa"/>
-          </w:tcPr>
-          <w:p>
-            <w:pPr>
-              <w:cnfStyle w:val="000000000000" w:firstRow="0" w:lastRow="0" w:firstColumn="0" w:lastColumn="0" w:oddVBand="0" w:evenVBand="0" w:oddHBand="0" w:evenHBand="0" w:firstRowFirstColumn="0" w:firstRowLastColumn="0" w:lastRowFirstColumn="0" w:lastRowLastColumn="0"/>
-            </w:pPr>
+            <w:tcW w:type="dxa" w:w="1417"/>
+          </w:tcPr>
+          <w:p>
             <w:r>
               <w:t>-6.08</w:t>
             </w:r>
@@ -2803,12 +2367,9 @@
         </w:tc>
         <w:tc>
           <w:tcPr>
-            <w:tcW w:w="1417" w:type="dxa"/>
-          </w:tcPr>
-          <w:p>
-            <w:pPr>
-              <w:cnfStyle w:val="000000000000" w:firstRow="0" w:lastRow="0" w:firstColumn="0" w:lastColumn="0" w:oddVBand="0" w:evenVBand="0" w:oddHBand="0" w:evenHBand="0" w:firstRowFirstColumn="0" w:firstRowLastColumn="0" w:lastRowFirstColumn="0" w:lastRowLastColumn="0"/>
-            </w:pPr>
+            <w:tcW w:type="dxa" w:w="1417"/>
+          </w:tcPr>
+          <w:p>
             <w:r>
               <w:t>6.15</w:t>
             </w:r>
@@ -2818,8 +2379,7 @@
       <w:tr>
         <w:tc>
           <w:tcPr>
-            <w:cnfStyle w:val="001000000000" w:firstRow="0" w:lastRow="0" w:firstColumn="1" w:lastColumn="0" w:oddVBand="0" w:evenVBand="0" w:oddHBand="0" w:evenHBand="0" w:firstRowFirstColumn="0" w:firstRowLastColumn="0" w:lastRowFirstColumn="0" w:lastRowLastColumn="0"/>
-            <w:tcW w:w="2268" w:type="dxa"/>
+            <w:tcW w:type="dxa" w:w="2268"/>
           </w:tcPr>
           <w:p>
             <w:r>
@@ -2829,12 +2389,9 @@
         </w:tc>
         <w:tc>
           <w:tcPr>
-            <w:tcW w:w="1417" w:type="dxa"/>
-          </w:tcPr>
-          <w:p>
-            <w:pPr>
-              <w:cnfStyle w:val="000000000000" w:firstRow="0" w:lastRow="0" w:firstColumn="0" w:lastColumn="0" w:oddVBand="0" w:evenVBand="0" w:oddHBand="0" w:evenHBand="0" w:firstRowFirstColumn="0" w:firstRowLastColumn="0" w:lastRowFirstColumn="0" w:lastRowLastColumn="0"/>
-            </w:pPr>
+            <w:tcW w:type="dxa" w:w="1417"/>
+          </w:tcPr>
+          <w:p>
             <w:r>
               <w:t>3.5</w:t>
             </w:r>
@@ -2842,12 +2399,9 @@
         </w:tc>
         <w:tc>
           <w:tcPr>
-            <w:tcW w:w="1417" w:type="dxa"/>
-          </w:tcPr>
-          <w:p>
-            <w:pPr>
-              <w:cnfStyle w:val="000000000000" w:firstRow="0" w:lastRow="0" w:firstColumn="0" w:lastColumn="0" w:oddVBand="0" w:evenVBand="0" w:oddHBand="0" w:evenHBand="0" w:firstRowFirstColumn="0" w:firstRowLastColumn="0" w:lastRowFirstColumn="0" w:lastRowLastColumn="0"/>
-            </w:pPr>
+            <w:tcW w:type="dxa" w:w="1417"/>
+          </w:tcPr>
+          <w:p>
             <w:r>
               <w:t>6.26</w:t>
             </w:r>
@@ -2857,8 +2411,7 @@
       <w:tr>
         <w:tc>
           <w:tcPr>
-            <w:cnfStyle w:val="001000000000" w:firstRow="0" w:lastRow="0" w:firstColumn="1" w:lastColumn="0" w:oddVBand="0" w:evenVBand="0" w:oddHBand="0" w:evenHBand="0" w:firstRowFirstColumn="0" w:firstRowLastColumn="0" w:lastRowFirstColumn="0" w:lastRowLastColumn="0"/>
-            <w:tcW w:w="2268" w:type="dxa"/>
+            <w:tcW w:type="dxa" w:w="2268"/>
           </w:tcPr>
           <w:p>
             <w:r>
@@ -2868,12 +2421,9 @@
         </w:tc>
         <w:tc>
           <w:tcPr>
-            <w:tcW w:w="1417" w:type="dxa"/>
-          </w:tcPr>
-          <w:p>
-            <w:pPr>
-              <w:cnfStyle w:val="000000000000" w:firstRow="0" w:lastRow="0" w:firstColumn="0" w:lastColumn="0" w:oddVBand="0" w:evenVBand="0" w:oddHBand="0" w:evenHBand="0" w:firstRowFirstColumn="0" w:firstRowLastColumn="0" w:lastRowFirstColumn="0" w:lastRowLastColumn="0"/>
-            </w:pPr>
+            <w:tcW w:type="dxa" w:w="1417"/>
+          </w:tcPr>
+          <w:p>
             <w:r>
               <w:t>9.33</w:t>
             </w:r>
@@ -2881,12 +2431,9 @@
         </w:tc>
         <w:tc>
           <w:tcPr>
-            <w:tcW w:w="1417" w:type="dxa"/>
-          </w:tcPr>
-          <w:p>
-            <w:pPr>
-              <w:cnfStyle w:val="000000000000" w:firstRow="0" w:lastRow="0" w:firstColumn="0" w:lastColumn="0" w:oddVBand="0" w:evenVBand="0" w:oddHBand="0" w:evenHBand="0" w:firstRowFirstColumn="0" w:firstRowLastColumn="0" w:lastRowFirstColumn="0" w:lastRowLastColumn="0"/>
-            </w:pPr>
+            <w:tcW w:type="dxa" w:w="1417"/>
+          </w:tcPr>
+          <w:p>
             <w:r>
               <w:t>6.45</w:t>
             </w:r>
@@ -2896,8 +2443,7 @@
       <w:tr>
         <w:tc>
           <w:tcPr>
-            <w:cnfStyle w:val="001000000000" w:firstRow="0" w:lastRow="0" w:firstColumn="1" w:lastColumn="0" w:oddVBand="0" w:evenVBand="0" w:oddHBand="0" w:evenHBand="0" w:firstRowFirstColumn="0" w:firstRowLastColumn="0" w:lastRowFirstColumn="0" w:lastRowLastColumn="0"/>
-            <w:tcW w:w="2268" w:type="dxa"/>
+            <w:tcW w:type="dxa" w:w="2268"/>
           </w:tcPr>
           <w:p>
             <w:r>
@@ -2907,12 +2453,9 @@
         </w:tc>
         <w:tc>
           <w:tcPr>
-            <w:tcW w:w="1417" w:type="dxa"/>
-          </w:tcPr>
-          <w:p>
-            <w:pPr>
-              <w:cnfStyle w:val="000000000000" w:firstRow="0" w:lastRow="0" w:firstColumn="0" w:lastColumn="0" w:oddVBand="0" w:evenVBand="0" w:oddHBand="0" w:evenHBand="0" w:firstRowFirstColumn="0" w:firstRowLastColumn="0" w:lastRowFirstColumn="0" w:lastRowLastColumn="0"/>
-            </w:pPr>
+            <w:tcW w:type="dxa" w:w="1417"/>
+          </w:tcPr>
+          <w:p>
             <w:r>
               <w:t>7.01</w:t>
             </w:r>
@@ -2920,12 +2463,9 @@
         </w:tc>
         <w:tc>
           <w:tcPr>
-            <w:tcW w:w="1417" w:type="dxa"/>
-          </w:tcPr>
-          <w:p>
-            <w:pPr>
-              <w:cnfStyle w:val="000000000000" w:firstRow="0" w:lastRow="0" w:firstColumn="0" w:lastColumn="0" w:oddVBand="0" w:evenVBand="0" w:oddHBand="0" w:evenHBand="0" w:firstRowFirstColumn="0" w:firstRowLastColumn="0" w:lastRowFirstColumn="0" w:lastRowLastColumn="0"/>
-            </w:pPr>
+            <w:tcW w:type="dxa" w:w="1417"/>
+          </w:tcPr>
+          <w:p>
             <w:r>
               <w:t>5.33</w:t>
             </w:r>
@@ -2935,8 +2475,7 @@
       <w:tr>
         <w:tc>
           <w:tcPr>
-            <w:cnfStyle w:val="001000000000" w:firstRow="0" w:lastRow="0" w:firstColumn="1" w:lastColumn="0" w:oddVBand="0" w:evenVBand="0" w:oddHBand="0" w:evenHBand="0" w:firstRowFirstColumn="0" w:firstRowLastColumn="0" w:lastRowFirstColumn="0" w:lastRowLastColumn="0"/>
-            <w:tcW w:w="2268" w:type="dxa"/>
+            <w:tcW w:type="dxa" w:w="2268"/>
           </w:tcPr>
           <w:p>
             <w:r>
@@ -2946,12 +2485,9 @@
         </w:tc>
         <w:tc>
           <w:tcPr>
-            <w:tcW w:w="1417" w:type="dxa"/>
-          </w:tcPr>
-          <w:p>
-            <w:pPr>
-              <w:cnfStyle w:val="000000000000" w:firstRow="0" w:lastRow="0" w:firstColumn="0" w:lastColumn="0" w:oddVBand="0" w:evenVBand="0" w:oddHBand="0" w:evenHBand="0" w:firstRowFirstColumn="0" w:firstRowLastColumn="0" w:lastRowFirstColumn="0" w:lastRowLastColumn="0"/>
-            </w:pPr>
+            <w:tcW w:type="dxa" w:w="1417"/>
+          </w:tcPr>
+          <w:p>
             <w:r>
               <w:t>44.63</w:t>
             </w:r>
@@ -2959,12 +2495,9 @@
         </w:tc>
         <w:tc>
           <w:tcPr>
-            <w:tcW w:w="1417" w:type="dxa"/>
-          </w:tcPr>
-          <w:p>
-            <w:pPr>
-              <w:cnfStyle w:val="000000000000" w:firstRow="0" w:lastRow="0" w:firstColumn="0" w:lastColumn="0" w:oddVBand="0" w:evenVBand="0" w:oddHBand="0" w:evenHBand="0" w:firstRowFirstColumn="0" w:firstRowLastColumn="0" w:lastRowFirstColumn="0" w:lastRowLastColumn="0"/>
-            </w:pPr>
+            <w:tcW w:type="dxa" w:w="1417"/>
+          </w:tcPr>
+          <w:p>
             <w:r>
               <w:t>28.13</w:t>
             </w:r>
@@ -2974,8 +2507,7 @@
       <w:tr>
         <w:tc>
           <w:tcPr>
-            <w:cnfStyle w:val="001000000000" w:firstRow="0" w:lastRow="0" w:firstColumn="1" w:lastColumn="0" w:oddVBand="0" w:evenVBand="0" w:oddHBand="0" w:evenHBand="0" w:firstRowFirstColumn="0" w:firstRowLastColumn="0" w:lastRowFirstColumn="0" w:lastRowLastColumn="0"/>
-            <w:tcW w:w="2268" w:type="dxa"/>
+            <w:tcW w:type="dxa" w:w="2268"/>
           </w:tcPr>
           <w:p>
             <w:r>
@@ -2988,12 +2520,9 @@
         </w:tc>
         <w:tc>
           <w:tcPr>
-            <w:tcW w:w="1417" w:type="dxa"/>
-          </w:tcPr>
-          <w:p>
-            <w:pPr>
-              <w:cnfStyle w:val="000000000000" w:firstRow="0" w:lastRow="0" w:firstColumn="0" w:lastColumn="0" w:oddVBand="0" w:evenVBand="0" w:oddHBand="0" w:evenHBand="0" w:firstRowFirstColumn="0" w:firstRowLastColumn="0" w:lastRowFirstColumn="0" w:lastRowLastColumn="0"/>
-            </w:pPr>
+            <w:tcW w:type="dxa" w:w="1417"/>
+          </w:tcPr>
+          <w:p>
             <w:r>
               <w:rPr>
                 <w:b/>
@@ -3004,12 +2533,9 @@
         </w:tc>
         <w:tc>
           <w:tcPr>
-            <w:tcW w:w="1417" w:type="dxa"/>
-          </w:tcPr>
-          <w:p>
-            <w:pPr>
-              <w:cnfStyle w:val="000000000000" w:firstRow="0" w:lastRow="0" w:firstColumn="0" w:lastColumn="0" w:oddVBand="0" w:evenVBand="0" w:oddHBand="0" w:evenHBand="0" w:firstRowFirstColumn="0" w:firstRowLastColumn="0" w:lastRowFirstColumn="0" w:lastRowLastColumn="0"/>
-            </w:pPr>
+            <w:tcW w:type="dxa" w:w="1417"/>
+          </w:tcPr>
+          <w:p>
             <w:r>
               <w:rPr>
                 <w:b/>
@@ -3022,8 +2548,7 @@
       <w:tr>
         <w:tc>
           <w:tcPr>
-            <w:cnfStyle w:val="001000000000" w:firstRow="0" w:lastRow="0" w:firstColumn="1" w:lastColumn="0" w:oddVBand="0" w:evenVBand="0" w:oddHBand="0" w:evenHBand="0" w:firstRowFirstColumn="0" w:firstRowLastColumn="0" w:lastRowFirstColumn="0" w:lastRowLastColumn="0"/>
-            <w:tcW w:w="2268" w:type="dxa"/>
+            <w:tcW w:type="dxa" w:w="2268"/>
           </w:tcPr>
           <w:p>
             <w:r>
@@ -3033,12 +2558,9 @@
         </w:tc>
         <w:tc>
           <w:tcPr>
-            <w:tcW w:w="1417" w:type="dxa"/>
-          </w:tcPr>
-          <w:p>
-            <w:pPr>
-              <w:cnfStyle w:val="000000000000" w:firstRow="0" w:lastRow="0" w:firstColumn="0" w:lastColumn="0" w:oddVBand="0" w:evenVBand="0" w:oddHBand="0" w:evenHBand="0" w:firstRowFirstColumn="0" w:firstRowLastColumn="0" w:lastRowFirstColumn="0" w:lastRowLastColumn="0"/>
-            </w:pPr>
+            <w:tcW w:type="dxa" w:w="1417"/>
+          </w:tcPr>
+          <w:p>
             <w:r>
               <w:t>7.0</w:t>
             </w:r>
@@ -3046,12 +2568,9 @@
         </w:tc>
         <w:tc>
           <w:tcPr>
-            <w:tcW w:w="1417" w:type="dxa"/>
-          </w:tcPr>
-          <w:p>
-            <w:pPr>
-              <w:cnfStyle w:val="000000000000" w:firstRow="0" w:lastRow="0" w:firstColumn="0" w:lastColumn="0" w:oddVBand="0" w:evenVBand="0" w:oddHBand="0" w:evenHBand="0" w:firstRowFirstColumn="0" w:firstRowLastColumn="0" w:lastRowFirstColumn="0" w:lastRowLastColumn="0"/>
-            </w:pPr>
+            <w:tcW w:type="dxa" w:w="1417"/>
+          </w:tcPr>
+          <w:p>
             <w:r>
               <w:t>3.02</w:t>
             </w:r>
@@ -3061,8 +2580,7 @@
       <w:tr>
         <w:tc>
           <w:tcPr>
-            <w:cnfStyle w:val="001000000000" w:firstRow="0" w:lastRow="0" w:firstColumn="1" w:lastColumn="0" w:oddVBand="0" w:evenVBand="0" w:oddHBand="0" w:evenHBand="0" w:firstRowFirstColumn="0" w:firstRowLastColumn="0" w:lastRowFirstColumn="0" w:lastRowLastColumn="0"/>
-            <w:tcW w:w="2268" w:type="dxa"/>
+            <w:tcW w:type="dxa" w:w="2268"/>
           </w:tcPr>
           <w:p>
             <w:r>
@@ -3072,12 +2590,9 @@
         </w:tc>
         <w:tc>
           <w:tcPr>
-            <w:tcW w:w="1417" w:type="dxa"/>
-          </w:tcPr>
-          <w:p>
-            <w:pPr>
-              <w:cnfStyle w:val="000000000000" w:firstRow="0" w:lastRow="0" w:firstColumn="0" w:lastColumn="0" w:oddVBand="0" w:evenVBand="0" w:oddHBand="0" w:evenHBand="0" w:firstRowFirstColumn="0" w:firstRowLastColumn="0" w:lastRowFirstColumn="0" w:lastRowLastColumn="0"/>
-            </w:pPr>
+            <w:tcW w:type="dxa" w:w="1417"/>
+          </w:tcPr>
+          <w:p>
             <w:r>
               <w:t>2.28</w:t>
             </w:r>
@@ -3085,12 +2600,9 @@
         </w:tc>
         <w:tc>
           <w:tcPr>
-            <w:tcW w:w="1417" w:type="dxa"/>
-          </w:tcPr>
-          <w:p>
-            <w:pPr>
-              <w:cnfStyle w:val="000000000000" w:firstRow="0" w:lastRow="0" w:firstColumn="0" w:lastColumn="0" w:oddVBand="0" w:evenVBand="0" w:oddHBand="0" w:evenHBand="0" w:firstRowFirstColumn="0" w:firstRowLastColumn="0" w:lastRowFirstColumn="0" w:lastRowLastColumn="0"/>
-            </w:pPr>
+            <w:tcW w:type="dxa" w:w="1417"/>
+          </w:tcPr>
+          <w:p>
             <w:r>
               <w:t>1.19</w:t>
             </w:r>
@@ -3100,8 +2612,7 @@
       <w:tr>
         <w:tc>
           <w:tcPr>
-            <w:cnfStyle w:val="001000000000" w:firstRow="0" w:lastRow="0" w:firstColumn="1" w:lastColumn="0" w:oddVBand="0" w:evenVBand="0" w:oddHBand="0" w:evenHBand="0" w:firstRowFirstColumn="0" w:firstRowLastColumn="0" w:lastRowFirstColumn="0" w:lastRowLastColumn="0"/>
-            <w:tcW w:w="2268" w:type="dxa"/>
+            <w:tcW w:type="dxa" w:w="2268"/>
           </w:tcPr>
           <w:p>
             <w:r>
@@ -3111,12 +2622,9 @@
         </w:tc>
         <w:tc>
           <w:tcPr>
-            <w:tcW w:w="1417" w:type="dxa"/>
-          </w:tcPr>
-          <w:p>
-            <w:pPr>
-              <w:cnfStyle w:val="000000000000" w:firstRow="0" w:lastRow="0" w:firstColumn="0" w:lastColumn="0" w:oddVBand="0" w:evenVBand="0" w:oddHBand="0" w:evenHBand="0" w:firstRowFirstColumn="0" w:firstRowLastColumn="0" w:lastRowFirstColumn="0" w:lastRowLastColumn="0"/>
-            </w:pPr>
+            <w:tcW w:type="dxa" w:w="1417"/>
+          </w:tcPr>
+          <w:p>
             <w:r>
               <w:t>6.32</w:t>
             </w:r>
@@ -3124,12 +2632,9 @@
         </w:tc>
         <w:tc>
           <w:tcPr>
-            <w:tcW w:w="1417" w:type="dxa"/>
-          </w:tcPr>
-          <w:p>
-            <w:pPr>
-              <w:cnfStyle w:val="000000000000" w:firstRow="0" w:lastRow="0" w:firstColumn="0" w:lastColumn="0" w:oddVBand="0" w:evenVBand="0" w:oddHBand="0" w:evenHBand="0" w:firstRowFirstColumn="0" w:firstRowLastColumn="0" w:lastRowFirstColumn="0" w:lastRowLastColumn="0"/>
-            </w:pPr>
+            <w:tcW w:type="dxa" w:w="1417"/>
+          </w:tcPr>
+          <w:p>
             <w:r>
               <w:t>3.12</w:t>
             </w:r>
@@ -3139,8 +2644,7 @@
       <w:tr>
         <w:tc>
           <w:tcPr>
-            <w:cnfStyle w:val="001000000000" w:firstRow="0" w:lastRow="0" w:firstColumn="1" w:lastColumn="0" w:oddVBand="0" w:evenVBand="0" w:oddHBand="0" w:evenHBand="0" w:firstRowFirstColumn="0" w:firstRowLastColumn="0" w:lastRowFirstColumn="0" w:lastRowLastColumn="0"/>
-            <w:tcW w:w="2268" w:type="dxa"/>
+            <w:tcW w:type="dxa" w:w="2268"/>
           </w:tcPr>
           <w:p>
             <w:r>
@@ -3150,12 +2654,9 @@
         </w:tc>
         <w:tc>
           <w:tcPr>
-            <w:tcW w:w="1417" w:type="dxa"/>
-          </w:tcPr>
-          <w:p>
-            <w:pPr>
-              <w:cnfStyle w:val="000000000000" w:firstRow="0" w:lastRow="0" w:firstColumn="0" w:lastColumn="0" w:oddVBand="0" w:evenVBand="0" w:oddHBand="0" w:evenHBand="0" w:firstRowFirstColumn="0" w:firstRowLastColumn="0" w:lastRowFirstColumn="0" w:lastRowLastColumn="0"/>
-            </w:pPr>
+            <w:tcW w:type="dxa" w:w="1417"/>
+          </w:tcPr>
+          <w:p>
             <w:r>
               <w:t>7.62</w:t>
             </w:r>
@@ -3163,12 +2664,9 @@
         </w:tc>
         <w:tc>
           <w:tcPr>
-            <w:tcW w:w="1417" w:type="dxa"/>
-          </w:tcPr>
-          <w:p>
-            <w:pPr>
-              <w:cnfStyle w:val="000000000000" w:firstRow="0" w:lastRow="0" w:firstColumn="0" w:lastColumn="0" w:oddVBand="0" w:evenVBand="0" w:oddHBand="0" w:evenHBand="0" w:firstRowFirstColumn="0" w:firstRowLastColumn="0" w:lastRowFirstColumn="0" w:lastRowLastColumn="0"/>
-            </w:pPr>
+            <w:tcW w:type="dxa" w:w="1417"/>
+          </w:tcPr>
+          <w:p>
             <w:r>
               <w:t>3.65</w:t>
             </w:r>
@@ -3178,24 +2676,19 @@
       <w:tr>
         <w:tc>
           <w:tcPr>
-            <w:cnfStyle w:val="001000000000" w:firstRow="0" w:lastRow="0" w:firstColumn="1" w:lastColumn="0" w:oddVBand="0" w:evenVBand="0" w:oddHBand="0" w:evenHBand="0" w:firstRowFirstColumn="0" w:firstRowLastColumn="0" w:lastRowFirstColumn="0" w:lastRowLastColumn="0"/>
-            <w:tcW w:w="2268" w:type="dxa"/>
-          </w:tcPr>
-          <w:p>
-            <w:r>
-              <w:lastRenderedPageBreak/>
+            <w:tcW w:type="dxa" w:w="2268"/>
+          </w:tcPr>
+          <w:p>
+            <w:r>
               <w:t>Colchester Gov Bond</w:t>
             </w:r>
           </w:p>
         </w:tc>
         <w:tc>
           <w:tcPr>
-            <w:tcW w:w="1417" w:type="dxa"/>
-          </w:tcPr>
-          <w:p>
-            <w:pPr>
-              <w:cnfStyle w:val="000000000000" w:firstRow="0" w:lastRow="0" w:firstColumn="0" w:lastColumn="0" w:oddVBand="0" w:evenVBand="0" w:oddHBand="0" w:evenHBand="0" w:firstRowFirstColumn="0" w:firstRowLastColumn="0" w:lastRowFirstColumn="0" w:lastRowLastColumn="0"/>
-            </w:pPr>
+            <w:tcW w:type="dxa" w:w="1417"/>
+          </w:tcPr>
+          <w:p>
             <w:r>
               <w:t>5.9</w:t>
             </w:r>
@@ -3203,12 +2696,9 @@
         </w:tc>
         <w:tc>
           <w:tcPr>
-            <w:tcW w:w="1417" w:type="dxa"/>
-          </w:tcPr>
-          <w:p>
-            <w:pPr>
-              <w:cnfStyle w:val="000000000000" w:firstRow="0" w:lastRow="0" w:firstColumn="0" w:lastColumn="0" w:oddVBand="0" w:evenVBand="0" w:oddHBand="0" w:evenHBand="0" w:firstRowFirstColumn="0" w:firstRowLastColumn="0" w:lastRowFirstColumn="0" w:lastRowLastColumn="0"/>
-            </w:pPr>
+            <w:tcW w:type="dxa" w:w="1417"/>
+          </w:tcPr>
+          <w:p>
             <w:r>
               <w:t>2.36</w:t>
             </w:r>
@@ -3218,8 +2708,7 @@
       <w:tr>
         <w:tc>
           <w:tcPr>
-            <w:cnfStyle w:val="001000000000" w:firstRow="0" w:lastRow="0" w:firstColumn="1" w:lastColumn="0" w:oddVBand="0" w:evenVBand="0" w:oddHBand="0" w:evenHBand="0" w:firstRowFirstColumn="0" w:firstRowLastColumn="0" w:lastRowFirstColumn="0" w:lastRowLastColumn="0"/>
-            <w:tcW w:w="2268" w:type="dxa"/>
+            <w:tcW w:type="dxa" w:w="2268"/>
           </w:tcPr>
           <w:p>
             <w:r>
@@ -3232,12 +2721,9 @@
         </w:tc>
         <w:tc>
           <w:tcPr>
-            <w:tcW w:w="1417" w:type="dxa"/>
-          </w:tcPr>
-          <w:p>
-            <w:pPr>
-              <w:cnfStyle w:val="000000000000" w:firstRow="0" w:lastRow="0" w:firstColumn="0" w:lastColumn="0" w:oddVBand="0" w:evenVBand="0" w:oddHBand="0" w:evenHBand="0" w:firstRowFirstColumn="0" w:firstRowLastColumn="0" w:lastRowFirstColumn="0" w:lastRowLastColumn="0"/>
-            </w:pPr>
+            <w:tcW w:type="dxa" w:w="1417"/>
+          </w:tcPr>
+          <w:p>
             <w:r>
               <w:rPr>
                 <w:b/>
@@ -3248,12 +2734,9 @@
         </w:tc>
         <w:tc>
           <w:tcPr>
-            <w:tcW w:w="1417" w:type="dxa"/>
-          </w:tcPr>
-          <w:p>
-            <w:pPr>
-              <w:cnfStyle w:val="000000000000" w:firstRow="0" w:lastRow="0" w:firstColumn="0" w:lastColumn="0" w:oddVBand="0" w:evenVBand="0" w:oddHBand="0" w:evenHBand="0" w:firstRowFirstColumn="0" w:firstRowLastColumn="0" w:lastRowFirstColumn="0" w:lastRowLastColumn="0"/>
-            </w:pPr>
+            <w:tcW w:type="dxa" w:w="1417"/>
+          </w:tcPr>
+          <w:p>
             <w:r>
               <w:rPr>
                 <w:b/>
@@ -3266,8 +2749,7 @@
       <w:tr>
         <w:tc>
           <w:tcPr>
-            <w:cnfStyle w:val="001000000000" w:firstRow="0" w:lastRow="0" w:firstColumn="1" w:lastColumn="0" w:oddVBand="0" w:evenVBand="0" w:oddHBand="0" w:evenHBand="0" w:firstRowFirstColumn="0" w:firstRowLastColumn="0" w:lastRowFirstColumn="0" w:lastRowLastColumn="0"/>
-            <w:tcW w:w="2268" w:type="dxa"/>
+            <w:tcW w:type="dxa" w:w="2268"/>
           </w:tcPr>
           <w:p>
             <w:r>
@@ -3277,12 +2759,9 @@
         </w:tc>
         <w:tc>
           <w:tcPr>
-            <w:tcW w:w="1417" w:type="dxa"/>
-          </w:tcPr>
-          <w:p>
-            <w:pPr>
-              <w:cnfStyle w:val="000000000000" w:firstRow="0" w:lastRow="0" w:firstColumn="0" w:lastColumn="0" w:oddVBand="0" w:evenVBand="0" w:oddHBand="0" w:evenHBand="0" w:firstRowFirstColumn="0" w:firstRowLastColumn="0" w:lastRowFirstColumn="0" w:lastRowLastColumn="0"/>
-            </w:pPr>
+            <w:tcW w:type="dxa" w:w="1417"/>
+          </w:tcPr>
+          <w:p>
             <w:r>
               <w:t>4.97</w:t>
             </w:r>
@@ -3290,12 +2769,9 @@
         </w:tc>
         <w:tc>
           <w:tcPr>
-            <w:tcW w:w="1417" w:type="dxa"/>
-          </w:tcPr>
-          <w:p>
-            <w:pPr>
-              <w:cnfStyle w:val="000000000000" w:firstRow="0" w:lastRow="0" w:firstColumn="0" w:lastColumn="0" w:oddVBand="0" w:evenVBand="0" w:oddHBand="0" w:evenHBand="0" w:firstRowFirstColumn="0" w:firstRowLastColumn="0" w:lastRowFirstColumn="0" w:lastRowLastColumn="0"/>
-            </w:pPr>
+            <w:tcW w:type="dxa" w:w="1417"/>
+          </w:tcPr>
+          <w:p>
             <w:r>
               <w:t>5.09</w:t>
             </w:r>
@@ -3305,8 +2781,7 @@
       <w:tr>
         <w:tc>
           <w:tcPr>
-            <w:cnfStyle w:val="001000000000" w:firstRow="0" w:lastRow="0" w:firstColumn="1" w:lastColumn="0" w:oddVBand="0" w:evenVBand="0" w:oddHBand="0" w:evenHBand="0" w:firstRowFirstColumn="0" w:firstRowLastColumn="0" w:lastRowFirstColumn="0" w:lastRowLastColumn="0"/>
-            <w:tcW w:w="2268" w:type="dxa"/>
+            <w:tcW w:type="dxa" w:w="2268"/>
           </w:tcPr>
           <w:p>
             <w:r>
@@ -3316,12 +2791,9 @@
         </w:tc>
         <w:tc>
           <w:tcPr>
-            <w:tcW w:w="1417" w:type="dxa"/>
-          </w:tcPr>
-          <w:p>
-            <w:pPr>
-              <w:cnfStyle w:val="000000000000" w:firstRow="0" w:lastRow="0" w:firstColumn="0" w:lastColumn="0" w:oddVBand="0" w:evenVBand="0" w:oddHBand="0" w:evenHBand="0" w:firstRowFirstColumn="0" w:firstRowLastColumn="0" w:lastRowFirstColumn="0" w:lastRowLastColumn="0"/>
-            </w:pPr>
+            <w:tcW w:type="dxa" w:w="1417"/>
+          </w:tcPr>
+          <w:p>
             <w:r>
               <w:t>4.67</w:t>
             </w:r>
@@ -3329,12 +2801,9 @@
         </w:tc>
         <w:tc>
           <w:tcPr>
-            <w:tcW w:w="1417" w:type="dxa"/>
-          </w:tcPr>
-          <w:p>
-            <w:pPr>
-              <w:cnfStyle w:val="000000000000" w:firstRow="0" w:lastRow="0" w:firstColumn="0" w:lastColumn="0" w:oddVBand="0" w:evenVBand="0" w:oddHBand="0" w:evenHBand="0" w:firstRowFirstColumn="0" w:firstRowLastColumn="0" w:lastRowFirstColumn="0" w:lastRowLastColumn="0"/>
-            </w:pPr>
+            <w:tcW w:type="dxa" w:w="1417"/>
+          </w:tcPr>
+          <w:p>
             <w:r>
               <w:t>4.57</w:t>
             </w:r>
@@ -3344,8 +2813,7 @@
       <w:tr>
         <w:tc>
           <w:tcPr>
-            <w:cnfStyle w:val="001000000000" w:firstRow="0" w:lastRow="0" w:firstColumn="1" w:lastColumn="0" w:oddVBand="0" w:evenVBand="0" w:oddHBand="0" w:evenHBand="0" w:firstRowFirstColumn="0" w:firstRowLastColumn="0" w:lastRowFirstColumn="0" w:lastRowLastColumn="0"/>
-            <w:tcW w:w="2268" w:type="dxa"/>
+            <w:tcW w:type="dxa" w:w="2268"/>
           </w:tcPr>
           <w:p>
             <w:r>
@@ -3355,12 +2823,9 @@
         </w:tc>
         <w:tc>
           <w:tcPr>
-            <w:tcW w:w="1417" w:type="dxa"/>
-          </w:tcPr>
-          <w:p>
-            <w:pPr>
-              <w:cnfStyle w:val="000000000000" w:firstRow="0" w:lastRow="0" w:firstColumn="0" w:lastColumn="0" w:oddVBand="0" w:evenVBand="0" w:oddHBand="0" w:evenHBand="0" w:firstRowFirstColumn="0" w:firstRowLastColumn="0" w:lastRowFirstColumn="0" w:lastRowLastColumn="0"/>
-            </w:pPr>
+            <w:tcW w:type="dxa" w:w="1417"/>
+          </w:tcPr>
+          <w:p>
             <w:r>
               <w:t>7.25</w:t>
             </w:r>
@@ -3368,12 +2833,9 @@
         </w:tc>
         <w:tc>
           <w:tcPr>
-            <w:tcW w:w="1417" w:type="dxa"/>
-          </w:tcPr>
-          <w:p>
-            <w:pPr>
-              <w:cnfStyle w:val="000000000000" w:firstRow="0" w:lastRow="0" w:firstColumn="0" w:lastColumn="0" w:oddVBand="0" w:evenVBand="0" w:oddHBand="0" w:evenHBand="0" w:firstRowFirstColumn="0" w:firstRowLastColumn="0" w:lastRowFirstColumn="0" w:lastRowLastColumn="0"/>
-            </w:pPr>
+            <w:tcW w:type="dxa" w:w="1417"/>
+          </w:tcPr>
+          <w:p>
             <w:r>
               <w:t>7.08</w:t>
             </w:r>
@@ -3383,8 +2845,7 @@
       <w:tr>
         <w:tc>
           <w:tcPr>
-            <w:cnfStyle w:val="001000000000" w:firstRow="0" w:lastRow="0" w:firstColumn="1" w:lastColumn="0" w:oddVBand="0" w:evenVBand="0" w:oddHBand="0" w:evenHBand="0" w:firstRowFirstColumn="0" w:firstRowLastColumn="0" w:lastRowFirstColumn="0" w:lastRowLastColumn="0"/>
-            <w:tcW w:w="2268" w:type="dxa"/>
+            <w:tcW w:type="dxa" w:w="2268"/>
           </w:tcPr>
           <w:p>
             <w:r>
@@ -3394,12 +2855,9 @@
         </w:tc>
         <w:tc>
           <w:tcPr>
-            <w:tcW w:w="1417" w:type="dxa"/>
-          </w:tcPr>
-          <w:p>
-            <w:pPr>
-              <w:cnfStyle w:val="000000000000" w:firstRow="0" w:lastRow="0" w:firstColumn="0" w:lastColumn="0" w:oddVBand="0" w:evenVBand="0" w:oddHBand="0" w:evenHBand="0" w:firstRowFirstColumn="0" w:firstRowLastColumn="0" w:lastRowFirstColumn="0" w:lastRowLastColumn="0"/>
-            </w:pPr>
+            <w:tcW w:type="dxa" w:w="1417"/>
+          </w:tcPr>
+          <w:p>
             <w:r>
               <w:t>6.06</w:t>
             </w:r>
@@ -3407,12 +2865,9 @@
         </w:tc>
         <w:tc>
           <w:tcPr>
-            <w:tcW w:w="1417" w:type="dxa"/>
-          </w:tcPr>
-          <w:p>
-            <w:pPr>
-              <w:cnfStyle w:val="000000000000" w:firstRow="0" w:lastRow="0" w:firstColumn="0" w:lastColumn="0" w:oddVBand="0" w:evenVBand="0" w:oddHBand="0" w:evenHBand="0" w:firstRowFirstColumn="0" w:firstRowLastColumn="0" w:lastRowFirstColumn="0" w:lastRowLastColumn="0"/>
-            </w:pPr>
+            <w:tcW w:type="dxa" w:w="1417"/>
+          </w:tcPr>
+          <w:p>
             <w:r>
               <w:t>7.22</w:t>
             </w:r>
@@ -3422,8 +2877,7 @@
       <w:tr>
         <w:tc>
           <w:tcPr>
-            <w:cnfStyle w:val="001000000000" w:firstRow="0" w:lastRow="0" w:firstColumn="1" w:lastColumn="0" w:oddVBand="0" w:evenVBand="0" w:oddHBand="0" w:evenHBand="0" w:firstRowFirstColumn="0" w:firstRowLastColumn="0" w:lastRowFirstColumn="0" w:lastRowLastColumn="0"/>
-            <w:tcW w:w="2268" w:type="dxa"/>
+            <w:tcW w:type="dxa" w:w="2268"/>
           </w:tcPr>
           <w:p>
             <w:r>
@@ -3433,12 +2887,9 @@
         </w:tc>
         <w:tc>
           <w:tcPr>
-            <w:tcW w:w="1417" w:type="dxa"/>
-          </w:tcPr>
-          <w:p>
-            <w:pPr>
-              <w:cnfStyle w:val="000000000000" w:firstRow="0" w:lastRow="0" w:firstColumn="0" w:lastColumn="0" w:oddVBand="0" w:evenVBand="0" w:oddHBand="0" w:evenHBand="0" w:firstRowFirstColumn="0" w:firstRowLastColumn="0" w:lastRowFirstColumn="0" w:lastRowLastColumn="0"/>
-            </w:pPr>
+            <w:tcW w:type="dxa" w:w="1417"/>
+          </w:tcPr>
+          <w:p>
             <w:r>
               <w:t>8.67</w:t>
             </w:r>
@@ -3446,12 +2897,9 @@
         </w:tc>
         <w:tc>
           <w:tcPr>
-            <w:tcW w:w="1417" w:type="dxa"/>
-          </w:tcPr>
-          <w:p>
-            <w:pPr>
-              <w:cnfStyle w:val="000000000000" w:firstRow="0" w:lastRow="0" w:firstColumn="0" w:lastColumn="0" w:oddVBand="0" w:evenVBand="0" w:oddHBand="0" w:evenHBand="0" w:firstRowFirstColumn="0" w:firstRowLastColumn="0" w:lastRowFirstColumn="0" w:lastRowLastColumn="0"/>
-            </w:pPr>
+            <w:tcW w:type="dxa" w:w="1417"/>
+          </w:tcPr>
+          <w:p>
             <w:r>
               <w:t>5.96</w:t>
             </w:r>
@@ -3461,8 +2909,7 @@
       <w:tr>
         <w:tc>
           <w:tcPr>
-            <w:cnfStyle w:val="001000000000" w:firstRow="0" w:lastRow="0" w:firstColumn="1" w:lastColumn="0" w:oddVBand="0" w:evenVBand="0" w:oddHBand="0" w:evenHBand="0" w:firstRowFirstColumn="0" w:firstRowLastColumn="0" w:lastRowFirstColumn="0" w:lastRowLastColumn="0"/>
-            <w:tcW w:w="2268" w:type="dxa"/>
+            <w:tcW w:type="dxa" w:w="2268"/>
           </w:tcPr>
           <w:p>
             <w:r>
@@ -3475,12 +2922,9 @@
         </w:tc>
         <w:tc>
           <w:tcPr>
-            <w:tcW w:w="1417" w:type="dxa"/>
-          </w:tcPr>
-          <w:p>
-            <w:pPr>
-              <w:cnfStyle w:val="000000000000" w:firstRow="0" w:lastRow="0" w:firstColumn="0" w:lastColumn="0" w:oddVBand="0" w:evenVBand="0" w:oddHBand="0" w:evenHBand="0" w:firstRowFirstColumn="0" w:firstRowLastColumn="0" w:lastRowFirstColumn="0" w:lastRowLastColumn="0"/>
-            </w:pPr>
+            <w:tcW w:type="dxa" w:w="1417"/>
+          </w:tcPr>
+          <w:p>
             <w:r>
               <w:rPr>
                 <w:b/>
@@ -3491,12 +2935,9 @@
         </w:tc>
         <w:tc>
           <w:tcPr>
-            <w:tcW w:w="1417" w:type="dxa"/>
-          </w:tcPr>
-          <w:p>
-            <w:pPr>
-              <w:cnfStyle w:val="000000000000" w:firstRow="0" w:lastRow="0" w:firstColumn="0" w:lastColumn="0" w:oddVBand="0" w:evenVBand="0" w:oddHBand="0" w:evenHBand="0" w:firstRowFirstColumn="0" w:firstRowLastColumn="0" w:lastRowFirstColumn="0" w:lastRowLastColumn="0"/>
-            </w:pPr>
+            <w:tcW w:type="dxa" w:w="1417"/>
+          </w:tcPr>
+          <w:p>
             <w:r>
               <w:rPr>
                 <w:b/>
@@ -3509,8 +2950,7 @@
       <w:tr>
         <w:tc>
           <w:tcPr>
-            <w:cnfStyle w:val="001000000000" w:firstRow="0" w:lastRow="0" w:firstColumn="1" w:lastColumn="0" w:oddVBand="0" w:evenVBand="0" w:oddHBand="0" w:evenHBand="0" w:firstRowFirstColumn="0" w:firstRowLastColumn="0" w:lastRowFirstColumn="0" w:lastRowLastColumn="0"/>
-            <w:tcW w:w="2268" w:type="dxa"/>
+            <w:tcW w:type="dxa" w:w="2268"/>
           </w:tcPr>
           <w:p>
             <w:r>
@@ -3520,12 +2960,9 @@
         </w:tc>
         <w:tc>
           <w:tcPr>
-            <w:tcW w:w="1417" w:type="dxa"/>
-          </w:tcPr>
-          <w:p>
-            <w:pPr>
-              <w:cnfStyle w:val="000000000000" w:firstRow="0" w:lastRow="0" w:firstColumn="0" w:lastColumn="0" w:oddVBand="0" w:evenVBand="0" w:oddHBand="0" w:evenHBand="0" w:firstRowFirstColumn="0" w:firstRowLastColumn="0" w:lastRowFirstColumn="0" w:lastRowLastColumn="0"/>
-            </w:pPr>
+            <w:tcW w:type="dxa" w:w="1417"/>
+          </w:tcPr>
+          <w:p>
             <w:r>
               <w:t>4.57</w:t>
             </w:r>
@@ -3533,12 +2970,9 @@
         </w:tc>
         <w:tc>
           <w:tcPr>
-            <w:tcW w:w="1417" w:type="dxa"/>
-          </w:tcPr>
-          <w:p>
-            <w:pPr>
-              <w:cnfStyle w:val="000000000000" w:firstRow="0" w:lastRow="0" w:firstColumn="0" w:lastColumn="0" w:oddVBand="0" w:evenVBand="0" w:oddHBand="0" w:evenHBand="0" w:firstRowFirstColumn="0" w:firstRowLastColumn="0" w:lastRowFirstColumn="0" w:lastRowLastColumn="0"/>
-            </w:pPr>
+            <w:tcW w:type="dxa" w:w="1417"/>
+          </w:tcPr>
+          <w:p>
             <w:r>
               <w:t>4.44</w:t>
             </w:r>
@@ -3548,8 +2982,7 @@
       <w:tr>
         <w:tc>
           <w:tcPr>
-            <w:cnfStyle w:val="001000000000" w:firstRow="0" w:lastRow="0" w:firstColumn="1" w:lastColumn="0" w:oddVBand="0" w:evenVBand="0" w:oddHBand="0" w:evenHBand="0" w:firstRowFirstColumn="0" w:firstRowLastColumn="0" w:lastRowFirstColumn="0" w:lastRowLastColumn="0"/>
-            <w:tcW w:w="2268" w:type="dxa"/>
+            <w:tcW w:type="dxa" w:w="2268"/>
           </w:tcPr>
           <w:p>
             <w:r>
@@ -3559,12 +2992,9 @@
         </w:tc>
         <w:tc>
           <w:tcPr>
-            <w:tcW w:w="1417" w:type="dxa"/>
-          </w:tcPr>
-          <w:p>
-            <w:pPr>
-              <w:cnfStyle w:val="000000000000" w:firstRow="0" w:lastRow="0" w:firstColumn="0" w:lastColumn="0" w:oddVBand="0" w:evenVBand="0" w:oddHBand="0" w:evenHBand="0" w:firstRowFirstColumn="0" w:firstRowLastColumn="0" w:lastRowFirstColumn="0" w:lastRowLastColumn="0"/>
-            </w:pPr>
+            <w:tcW w:type="dxa" w:w="1417"/>
+          </w:tcPr>
+          <w:p>
             <w:r>
               <w:t>4.57</w:t>
             </w:r>
@@ -3572,12 +3002,9 @@
         </w:tc>
         <w:tc>
           <w:tcPr>
-            <w:tcW w:w="1417" w:type="dxa"/>
-          </w:tcPr>
-          <w:p>
-            <w:pPr>
-              <w:cnfStyle w:val="000000000000" w:firstRow="0" w:lastRow="0" w:firstColumn="0" w:lastColumn="0" w:oddVBand="0" w:evenVBand="0" w:oddHBand="0" w:evenHBand="0" w:firstRowFirstColumn="0" w:firstRowLastColumn="0" w:lastRowFirstColumn="0" w:lastRowLastColumn="0"/>
-            </w:pPr>
+            <w:tcW w:type="dxa" w:w="1417"/>
+          </w:tcPr>
+          <w:p>
             <w:r>
               <w:t>4.46</w:t>
             </w:r>
@@ -3601,11 +3028,7 @@
         <w:t>Underlying investment manager returns are shown after fees and before tax</w:t>
       </w:r>
     </w:p>
-    <w:p>
-      <w:pPr>
-        <w:pStyle w:val="BodyStyle"/>
-      </w:pPr>
-    </w:p>
+    <w:br w:type="column"/>
     <w:p>
       <w:pPr>
         <w:pStyle w:val="Heading20"/>
@@ -3620,77 +3043,34 @@
       </w:pPr>
       <w:r>
         <w:t>Australian share market recorded its first monthly gain since January returning 3.6% for the month of April and 9.8% for the 12 months. The Australia market followed the lead from the US share market on news of trade deals.</w:t>
-      </w:r>
-      <w:r>
         <w:br/>
-      </w:r>
-      <w:r>
         <w:br/>
         <w:t>Australia copped a 10% US tariff on our exports, however only 5% of Australian exports go to the US. The bigger threat to Australian exports comes from reduced exports to China and Asia.</w:t>
-      </w:r>
-      <w:r>
         <w:br/>
-      </w:r>
-      <w:r>
         <w:br/>
         <w:t>10 out of 11 sectors in the S&amp;P/ASX 200 posted gains, led by Communication Services, Information Technology and Consumer Discretionary, each rising by 6%. Energy was the only sector to report a loss.</w:t>
-      </w:r>
-      <w:r>
         <w:br/>
-      </w:r>
-      <w:r>
         <w:br/>
         <w:t>China's manufacturing sector contracted in April, with the official PMI falling to 49.0, its lowest since December 2023, due to escalating U.S. tariffs and weakening export demand.</w:t>
-      </w:r>
-      <w:r>
         <w:br/>
-      </w:r>
-      <w:r>
         <w:br/>
         <w:t>Trump placed eye-watering 145% tariff on China but for most other nations a 90-day pause on reciprocal tariffs, leaving a 10% universal tariff in place.</w:t>
-      </w:r>
-      <w:r>
         <w:br/>
-      </w:r>
-      <w:r>
         <w:br/>
         <w:t>Global share markets plunged at the beginning of the month on worries about a full-blown trade war, The Trump Dump initially caused US shares to fall 17%, 16% globally and 10% in Australia. While gold surged to new highs.</w:t>
-      </w:r>
-      <w:r>
         <w:br/>
-      </w:r>
-      <w:r>
         <w:br/>
-        <w:t xml:space="preserve">The Federal Open Market Committee (FOMC) left the Federal </w:t>
-      </w:r>
-      <w:r>
-        <w:t>Funds Rate unchanged at the range of 4.25 – 4.50% at the March meeting and projected two rate cuts later this year.</w:t>
-      </w:r>
-      <w:r>
+        <w:t>The Federal Open Market Committee (FOMC) left the Federal Funds Rate unchanged at the range of 4.25 – 4.50% at the March meeting and projected two rate cuts later this year.</w:t>
         <w:br/>
-      </w:r>
-      <w:r>
         <w:br/>
         <w:t xml:space="preserve">The RBA left interest rates on hold at 4.10%, but is expected to engage in another rate cut of 0.25% in May. Australia’s headline inflation (total inflation) remained steady in Q1 2025 at 2.4% annually, within the target band of 2 – 3%. </w:t>
-      </w:r>
-      <w:r>
         <w:br/>
-      </w:r>
-      <w:r>
         <w:br/>
         <w:t>Most fixed income indices advanced as rates declined on weaker economic growth expectations. The Australian Government 0+ index was among the best performers, rising by 2% for the month, with the index's yield falling to 4%.</w:t>
-      </w:r>
-      <w:r>
         <w:br/>
-      </w:r>
-      <w:r>
         <w:br/>
         <w:t>Gold maintained its winning streak in 2025, reaching historic peak of US$3,500 per ounce before experiencing volatility. A significant driver behind’s gold’s stellar performance has been the substantial decline in the US dollar.</w:t>
-      </w:r>
-      <w:r>
         <w:br/>
-      </w:r>
-      <w:r>
         <w:br/>
       </w:r>
     </w:p>
@@ -3740,8 +3120,8 @@
       <w:type w:val="continuous"/>
       <w:pgSz w:w="11900" w:h="16840" w:code="9"/>
       <w:pgMar w:top="0" w:right="420" w:bottom="0" w:left="425" w:header="0" w:footer="726" w:gutter="0"/>
-      <w:cols w:num="2" w:space="720"/>
       <w:docGrid w:linePitch="360"/>
+      <w:cols w:num="2"/>
     </w:sectPr>
   </w:body>
 </w:document>
@@ -14167,6 +13547,19 @@
 </file>
 
 <file path=customXml/item2.xml><?xml version="1.0" encoding="utf-8"?>
+<b:Sources xmlns:b="http://schemas.openxmlformats.org/officeDocument/2006/bibliography" xmlns="http://schemas.openxmlformats.org/officeDocument/2006/bibliography" SelectedStyle="/APASixthEditionOfficeOnline.xsl" StyleName="APA" Version="6"/>
+</file>
+
+<file path=customXml/item3.xml><?xml version="1.0" encoding="utf-8"?>
+<?mso-contentType ?>
+<FormTemplates xmlns="http://schemas.microsoft.com/sharepoint/v3/contenttype/forms">
+  <Display>DocumentLibraryForm</Display>
+  <Edit>DocumentLibraryForm</Edit>
+  <New>DocumentLibraryForm</New>
+</FormTemplates>
+</file>
+
+<file path=customXml/item4.xml><?xml version="1.0" encoding="utf-8"?>
 <ct:contentTypeSchema xmlns:ct="http://schemas.microsoft.com/office/2006/metadata/contentType" xmlns:ma="http://schemas.microsoft.com/office/2006/metadata/properties/metaAttributes" ct:_="" ma:_="" ma:contentTypeName="Document" ma:contentTypeID="0x0101005C6577D0C3AE724BBB504F46D5A19401" ma:contentTypeVersion="18" ma:contentTypeDescription="Create a new document." ma:contentTypeScope="" ma:versionID="17afb16e0fbe716d3dcf2481b32b5550">
   <xsd:schema xmlns:xsd="http://www.w3.org/2001/XMLSchema" xmlns:xs="http://www.w3.org/2001/XMLSchema" xmlns:p="http://schemas.microsoft.com/office/2006/metadata/properties" xmlns:ns2="df76e320-99cb-4a11-b59f-8bf32867ab70" xmlns:ns3="c0789f30-979e-497b-8344-faefb3987540" targetNamespace="http://schemas.microsoft.com/office/2006/metadata/properties" ma:root="true" ma:fieldsID="f6d0bb8d4e6a5d6b988ea2ed2503dbb5" ns2:_="" ns3:_="">
     <xsd:import namespace="df76e320-99cb-4a11-b59f-8bf32867ab70"/>
@@ -14421,19 +13814,6 @@
 </ct:contentTypeSchema>
 </file>
 
-<file path=customXml/item3.xml><?xml version="1.0" encoding="utf-8"?>
-<?mso-contentType ?>
-<FormTemplates xmlns="http://schemas.microsoft.com/sharepoint/v3/contenttype/forms">
-  <Display>DocumentLibraryForm</Display>
-  <Edit>DocumentLibraryForm</Edit>
-  <New>DocumentLibraryForm</New>
-</FormTemplates>
-</file>
-
-<file path=customXml/item4.xml><?xml version="1.0" encoding="utf-8"?>
-<b:Sources xmlns:b="http://schemas.openxmlformats.org/officeDocument/2006/bibliography" xmlns="http://schemas.openxmlformats.org/officeDocument/2006/bibliography" SelectedStyle="/APASixthEditionOfficeOnline.xsl" StyleName="APA" Version="6"/>
-</file>
-
 <file path=customXml/itemProps1.xml><?xml version="1.0" encoding="utf-8"?>
 <ds:datastoreItem xmlns:ds="http://schemas.openxmlformats.org/officeDocument/2006/customXml" ds:itemID="{45E0443C-4F90-4629-97D7-B1DE713ED804}">
   <ds:schemaRefs>
@@ -14446,6 +13826,22 @@
 </file>
 
 <file path=customXml/itemProps2.xml><?xml version="1.0" encoding="utf-8"?>
+<ds:datastoreItem xmlns:ds="http://schemas.openxmlformats.org/officeDocument/2006/customXml" ds:itemID="{4025F58E-3AB4-3342-9197-1CA84913C711}">
+  <ds:schemaRefs>
+    <ds:schemaRef ds:uri="http://schemas.openxmlformats.org/officeDocument/2006/bibliography"/>
+  </ds:schemaRefs>
+</ds:datastoreItem>
+</file>
+
+<file path=customXml/itemProps3.xml><?xml version="1.0" encoding="utf-8"?>
+<ds:datastoreItem xmlns:ds="http://schemas.openxmlformats.org/officeDocument/2006/customXml" ds:itemID="{8755120E-120F-492C-8F62-4A444EBFBADE}">
+  <ds:schemaRefs>
+    <ds:schemaRef ds:uri="http://schemas.microsoft.com/sharepoint/v3/contenttype/forms"/>
+  </ds:schemaRefs>
+</ds:datastoreItem>
+</file>
+
+<file path=customXml/itemProps4.xml><?xml version="1.0" encoding="utf-8"?>
 <ds:datastoreItem xmlns:ds="http://schemas.openxmlformats.org/officeDocument/2006/customXml" ds:itemID="{7A0F0D45-B5B0-4593-81B9-A8D609F21713}">
   <ds:schemaRefs>
     <ds:schemaRef ds:uri="http://schemas.microsoft.com/office/2006/metadata/contentType"/>
@@ -14462,20 +13858,4 @@
     <ds:schemaRef ds:uri="http://schemas.microsoft.com/internal/obd"/>
   </ds:schemaRefs>
 </ds:datastoreItem>
-</file>
-
-<file path=customXml/itemProps3.xml><?xml version="1.0" encoding="utf-8"?>
-<ds:datastoreItem xmlns:ds="http://schemas.openxmlformats.org/officeDocument/2006/customXml" ds:itemID="{8755120E-120F-492C-8F62-4A444EBFBADE}">
-  <ds:schemaRefs>
-    <ds:schemaRef ds:uri="http://schemas.microsoft.com/sharepoint/v3/contenttype/forms"/>
-  </ds:schemaRefs>
-</ds:datastoreItem>
-</file>
-
-<file path=customXml/itemProps4.xml><?xml version="1.0" encoding="utf-8"?>
-<ds:datastoreItem xmlns:ds="http://schemas.openxmlformats.org/officeDocument/2006/customXml" ds:itemID="{4025F58E-3AB4-3342-9197-1CA84913C711}">
-  <ds:schemaRefs>
-    <ds:schemaRef ds:uri="http://schemas.openxmlformats.org/officeDocument/2006/bibliography"/>
-  </ds:schemaRefs>
-</ds:datastoreItem>
 </file>
</xml_diff>